<commit_message>
crud tarif,pemakaian, pelanggan, petugas
</commit_message>
<xml_diff>
--- a/Studi Kasus Pembayaran Listrik.docx
+++ b/Studi Kasus Pembayaran Listrik.docx
@@ -1,6 +1,6 @@
 
 <file path=word/document.xml><?xml version="1.0" encoding="utf-8"?>
-<w:document xmlns:wpc="http://schemas.microsoft.com/office/word/2010/wordprocessingCanvas" xmlns:cx="http://schemas.microsoft.com/office/drawing/2014/chartex" xmlns:cx1="http://schemas.microsoft.com/office/drawing/2015/9/8/chartex" xmlns:cx2="http://schemas.microsoft.com/office/drawing/2015/10/21/chartex" xmlns:cx3="http://schemas.microsoft.com/office/drawing/2016/5/9/chartex" xmlns:cx4="http://schemas.microsoft.com/office/drawing/2016/5/10/chartex" xmlns:cx5="http://schemas.microsoft.com/office/drawing/2016/5/11/chartex" xmlns:cx6="http://schemas.microsoft.com/office/drawing/2016/5/12/chartex" xmlns:cx7="http://schemas.microsoft.com/office/drawing/2016/5/13/chartex" xmlns:cx8="http://schemas.microsoft.com/office/drawing/2016/5/14/chartex" xmlns:mc="http://schemas.openxmlformats.org/markup-compatibility/2006" xmlns:aink="http://schemas.microsoft.com/office/drawing/2016/ink" xmlns:am3d="http://schemas.microsoft.com/office/drawing/2017/model3d" xmlns:o="urn:schemas-microsoft-com:office:office" xmlns:oel="http://schemas.microsoft.com/office/2019/extlst" xmlns:r="http://schemas.openxmlformats.org/officeDocument/2006/relationships" xmlns:m="http://schemas.openxmlformats.org/officeDocument/2006/math" xmlns:v="urn:schemas-microsoft-com:vml" xmlns:wp14="http://schemas.microsoft.com/office/word/2010/wordprocessingDrawing" xmlns:wp="http://schemas.openxmlformats.org/drawingml/2006/wordprocessingDrawing" xmlns:w10="urn:schemas-microsoft-com:office:word" xmlns:w="http://schemas.openxmlformats.org/wordprocessingml/2006/main" xmlns:w14="http://schemas.microsoft.com/office/word/2010/wordml" xmlns:w15="http://schemas.microsoft.com/office/word/2012/wordml" xmlns:w16cex="http://schemas.microsoft.com/office/word/2018/wordml/cex" xmlns:w16cid="http://schemas.microsoft.com/office/word/2016/wordml/cid" xmlns:w16="http://schemas.microsoft.com/office/word/2018/wordml" xmlns:w16du="http://schemas.microsoft.com/office/word/2023/wordml/word16du" xmlns:w16sdtdh="http://schemas.microsoft.com/office/word/2020/wordml/sdtdatahash" xmlns:w16sdtfl="http://schemas.microsoft.com/office/word/2024/wordml/sdtformatlock" xmlns:w16se="http://schemas.microsoft.com/office/word/2015/wordml/symex" xmlns:wpg="http://schemas.microsoft.com/office/word/2010/wordprocessingGroup" xmlns:wpi="http://schemas.microsoft.com/office/word/2010/wordprocessingInk" xmlns:wne="http://schemas.microsoft.com/office/word/2006/wordml" xmlns:wps="http://schemas.microsoft.com/office/word/2010/wordprocessingShape" mc:Ignorable="w14 w15 w16se w16cid w16 w16cex w16sdtdh w16sdtfl w16du wp14">
+<w:document xmlns:wpc="http://schemas.microsoft.com/office/word/2010/wordprocessingCanvas" xmlns:cx="http://schemas.microsoft.com/office/drawing/2014/chartex" xmlns:cx1="http://schemas.microsoft.com/office/drawing/2015/9/8/chartex" xmlns:cx2="http://schemas.microsoft.com/office/drawing/2015/10/21/chartex" xmlns:cx3="http://schemas.microsoft.com/office/drawing/2016/5/9/chartex" xmlns:cx4="http://schemas.microsoft.com/office/drawing/2016/5/10/chartex" xmlns:cx5="http://schemas.microsoft.com/office/drawing/2016/5/11/chartex" xmlns:cx6="http://schemas.microsoft.com/office/drawing/2016/5/12/chartex" xmlns:cx7="http://schemas.microsoft.com/office/drawing/2016/5/13/chartex" xmlns:cx8="http://schemas.microsoft.com/office/drawing/2016/5/14/chartex" xmlns:mc="http://schemas.openxmlformats.org/markup-compatibility/2006" xmlns:aink="http://schemas.microsoft.com/office/drawing/2016/ink" xmlns:am3d="http://schemas.microsoft.com/office/drawing/2017/model3d" xmlns:o="urn:schemas-microsoft-com:office:office" xmlns:oel="http://schemas.microsoft.com/office/2019/extlst" xmlns:r="http://schemas.openxmlformats.org/officeDocument/2006/relationships" xmlns:m="http://schemas.openxmlformats.org/officeDocument/2006/math" xmlns:v="urn:schemas-microsoft-com:vml" xmlns:wp14="http://schemas.microsoft.com/office/word/2010/wordprocessingDrawing" xmlns:wp="http://schemas.openxmlformats.org/drawingml/2006/wordprocessingDrawing" xmlns:w10="urn:schemas-microsoft-com:office:word" xmlns:w="http://schemas.openxmlformats.org/wordprocessingml/2006/main" xmlns:w14="http://schemas.microsoft.com/office/word/2010/wordml" xmlns:w15="http://schemas.microsoft.com/office/word/2012/wordml" xmlns:w16cex="http://schemas.microsoft.com/office/word/2018/wordml/cex" xmlns:w16cid="http://schemas.microsoft.com/office/word/2016/wordml/cid" xmlns:w16="http://schemas.microsoft.com/office/word/2018/wordml" xmlns:w16du="http://schemas.microsoft.com/office/word/2023/wordml/word16du" xmlns:w16sdtdh="http://schemas.microsoft.com/office/word/2020/wordml/sdtdatahash" xmlns:w16se="http://schemas.microsoft.com/office/word/2015/wordml/symex" xmlns:wpg="http://schemas.microsoft.com/office/word/2010/wordprocessingGroup" xmlns:wpi="http://schemas.microsoft.com/office/word/2010/wordprocessingInk" xmlns:wne="http://schemas.microsoft.com/office/word/2006/wordml" xmlns:wps="http://schemas.microsoft.com/office/word/2010/wordprocessingShape" mc:Ignorable="w14 w15 w16se w16cid w16 w16cex w16sdtdh w16du wp14">
   <w:body>
     <w:p>
       <w:pPr>
@@ -13,14 +13,25 @@
           <w:lang w:val="en-US"/>
         </w:rPr>
       </w:pPr>
-      <w:r>
-        <w:rPr>
-          <w:rFonts w:ascii="Tahoma" w:hAnsi="Tahoma" w:cs="Tahoma"/>
-          <w:b/>
-          <w:bCs/>
-          <w:lang w:val="en-US"/>
-        </w:rPr>
-        <w:t xml:space="preserve">Studi </w:t>
+      <w:proofErr w:type="spellStart"/>
+      <w:r>
+        <w:rPr>
+          <w:rFonts w:ascii="Tahoma" w:hAnsi="Tahoma" w:cs="Tahoma"/>
+          <w:b/>
+          <w:bCs/>
+          <w:lang w:val="en-US"/>
+        </w:rPr>
+        <w:t>Studi</w:t>
+      </w:r>
+      <w:proofErr w:type="spellEnd"/>
+      <w:r>
+        <w:rPr>
+          <w:rFonts w:ascii="Tahoma" w:hAnsi="Tahoma" w:cs="Tahoma"/>
+          <w:b/>
+          <w:bCs/>
+          <w:lang w:val="en-US"/>
+        </w:rPr>
+        <w:t xml:space="preserve"> </w:t>
       </w:r>
       <w:proofErr w:type="spellStart"/>
       <w:r>
@@ -407,7 +418,23 @@
           <w:rFonts w:ascii="Tahoma" w:hAnsi="Tahoma" w:cs="Tahoma"/>
           <w:lang w:val="en-US"/>
         </w:rPr>
-        <w:t xml:space="preserve">, Jenis </w:t>
+        <w:t xml:space="preserve">, </w:t>
+      </w:r>
+      <w:proofErr w:type="spellStart"/>
+      <w:r>
+        <w:rPr>
+          <w:rFonts w:ascii="Tahoma" w:hAnsi="Tahoma" w:cs="Tahoma"/>
+          <w:lang w:val="en-US"/>
+        </w:rPr>
+        <w:t>Jenis</w:t>
+      </w:r>
+      <w:proofErr w:type="spellEnd"/>
+      <w:r>
+        <w:rPr>
+          <w:rFonts w:ascii="Tahoma" w:hAnsi="Tahoma" w:cs="Tahoma"/>
+          <w:lang w:val="en-US"/>
+        </w:rPr>
+        <w:t xml:space="preserve"> </w:t>
       </w:r>
       <w:proofErr w:type="spellStart"/>
       <w:r>
@@ -2718,24 +2745,15 @@
           <w:lang w:val="en-US"/>
         </w:rPr>
       </w:pPr>
-      <w:r>
-        <w:rPr>
-          <w:rFonts w:ascii="Open Sans" w:hAnsi="Open Sans" w:cs="Open Sans"/>
-          <w:sz w:val="28"/>
-          <w:szCs w:val="28"/>
-          <w:lang w:val="en-US"/>
-        </w:rPr>
-        <w:t>Jenis-</w:t>
-      </w:r>
-      <w:proofErr w:type="spellStart"/>
-      <w:r>
-        <w:rPr>
-          <w:rFonts w:ascii="Open Sans" w:hAnsi="Open Sans" w:cs="Open Sans"/>
-          <w:sz w:val="28"/>
-          <w:szCs w:val="28"/>
-          <w:lang w:val="en-US"/>
-        </w:rPr>
-        <w:t>jenis</w:t>
+      <w:proofErr w:type="spellStart"/>
+      <w:r>
+        <w:rPr>
+          <w:rFonts w:ascii="Open Sans" w:hAnsi="Open Sans" w:cs="Open Sans"/>
+          <w:sz w:val="28"/>
+          <w:szCs w:val="28"/>
+          <w:lang w:val="en-US"/>
+        </w:rPr>
+        <w:t>Jenis-jenis</w:t>
       </w:r>
       <w:proofErr w:type="spellEnd"/>
       <w:r>
@@ -2856,13 +2874,23 @@
           <w:lang w:val="en-US"/>
         </w:rPr>
       </w:pPr>
-      <w:r>
-        <w:rPr>
-          <w:rFonts w:ascii="Open Sans" w:hAnsi="Open Sans" w:cs="Open Sans"/>
-          <w:sz w:val="28"/>
-          <w:szCs w:val="28"/>
-        </w:rPr>
-        <w:t xml:space="preserve">Rumah </w:t>
+      <w:proofErr w:type="spellStart"/>
+      <w:r>
+        <w:rPr>
+          <w:rFonts w:ascii="Open Sans" w:hAnsi="Open Sans" w:cs="Open Sans"/>
+          <w:sz w:val="28"/>
+          <w:szCs w:val="28"/>
+        </w:rPr>
+        <w:t>Rumah</w:t>
+      </w:r>
+      <w:proofErr w:type="spellEnd"/>
+      <w:r>
+        <w:rPr>
+          <w:rFonts w:ascii="Open Sans" w:hAnsi="Open Sans" w:cs="Open Sans"/>
+          <w:sz w:val="28"/>
+          <w:szCs w:val="28"/>
+        </w:rPr>
+        <w:t xml:space="preserve"> </w:t>
       </w:r>
       <w:proofErr w:type="spellStart"/>
       <w:r>
@@ -3261,7 +3289,25 @@
           <w:sz w:val="28"/>
           <w:szCs w:val="28"/>
         </w:rPr>
-        <w:t xml:space="preserve"> Besar, </w:t>
+        <w:t xml:space="preserve"> </w:t>
+      </w:r>
+      <w:proofErr w:type="spellStart"/>
+      <w:r>
+        <w:rPr>
+          <w:rFonts w:ascii="Open Sans" w:hAnsi="Open Sans" w:cs="Open Sans"/>
+          <w:sz w:val="28"/>
+          <w:szCs w:val="28"/>
+        </w:rPr>
+        <w:t>Besar</w:t>
+      </w:r>
+      <w:proofErr w:type="spellEnd"/>
+      <w:r>
+        <w:rPr>
+          <w:rFonts w:ascii="Open Sans" w:hAnsi="Open Sans" w:cs="Open Sans"/>
+          <w:sz w:val="28"/>
+          <w:szCs w:val="28"/>
+        </w:rPr>
+        <w:t xml:space="preserve">, </w:t>
       </w:r>
       <w:proofErr w:type="spellStart"/>
       <w:r>
@@ -3548,7 +3594,25 @@
           <w:sz w:val="28"/>
           <w:szCs w:val="28"/>
         </w:rPr>
-        <w:t xml:space="preserve">Industri Besar, </w:t>
+        <w:t xml:space="preserve">Industri </w:t>
+      </w:r>
+      <w:proofErr w:type="spellStart"/>
+      <w:r>
+        <w:rPr>
+          <w:rFonts w:ascii="Open Sans" w:hAnsi="Open Sans" w:cs="Open Sans"/>
+          <w:sz w:val="28"/>
+          <w:szCs w:val="28"/>
+        </w:rPr>
+        <w:t>Besar</w:t>
+      </w:r>
+      <w:proofErr w:type="spellEnd"/>
+      <w:r>
+        <w:rPr>
+          <w:rFonts w:ascii="Open Sans" w:hAnsi="Open Sans" w:cs="Open Sans"/>
+          <w:sz w:val="28"/>
+          <w:szCs w:val="28"/>
+        </w:rPr>
+        <w:t xml:space="preserve">, </w:t>
       </w:r>
       <w:proofErr w:type="spellStart"/>
       <w:r>
@@ -4612,13 +4676,23 @@
           <w:szCs w:val="28"/>
         </w:rPr>
       </w:pPr>
-      <w:r>
-        <w:rPr>
-          <w:rFonts w:ascii="Open Sans" w:hAnsi="Open Sans" w:cs="Open Sans"/>
-          <w:sz w:val="28"/>
-          <w:szCs w:val="28"/>
-        </w:rPr>
-        <w:t xml:space="preserve">Jenis </w:t>
+      <w:proofErr w:type="spellStart"/>
+      <w:r>
+        <w:rPr>
+          <w:rFonts w:ascii="Open Sans" w:hAnsi="Open Sans" w:cs="Open Sans"/>
+          <w:sz w:val="28"/>
+          <w:szCs w:val="28"/>
+        </w:rPr>
+        <w:t>Jenis</w:t>
+      </w:r>
+      <w:proofErr w:type="spellEnd"/>
+      <w:r>
+        <w:rPr>
+          <w:rFonts w:ascii="Open Sans" w:hAnsi="Open Sans" w:cs="Open Sans"/>
+          <w:sz w:val="28"/>
+          <w:szCs w:val="28"/>
+        </w:rPr>
+        <w:t xml:space="preserve"> </w:t>
       </w:r>
       <w:proofErr w:type="spellStart"/>
       <w:r>
@@ -5680,700 +5754,15 @@
                 <w:rFonts w:ascii="Open Sans" w:hAnsi="Open Sans" w:cs="Open Sans"/>
                 <w:lang w:val="en-US"/>
               </w:rPr>
-              <w:t>/Alasan</w:t>
-            </w:r>
-          </w:p>
-        </w:tc>
-      </w:tr>
-      <w:tr>
-        <w:trPr>
-          <w:cnfStyle w:val="000000100000" w:firstRow="0" w:lastRow="0" w:firstColumn="0" w:lastColumn="0" w:oddVBand="0" w:evenVBand="0" w:oddHBand="1" w:evenHBand="0" w:firstRowFirstColumn="0" w:firstRowLastColumn="0" w:lastRowFirstColumn="0" w:lastRowLastColumn="0"/>
-        </w:trPr>
-        <w:tc>
-          <w:tcPr>
-            <w:cnfStyle w:val="001000000000" w:firstRow="0" w:lastRow="0" w:firstColumn="1" w:lastColumn="0" w:oddVBand="0" w:evenVBand="0" w:oddHBand="0" w:evenHBand="0" w:firstRowFirstColumn="0" w:firstRowLastColumn="0" w:lastRowFirstColumn="0" w:lastRowLastColumn="0"/>
-            <w:tcW w:w="560" w:type="dxa"/>
-            <w:shd w:val="clear" w:color="auto" w:fill="auto"/>
-          </w:tcPr>
-          <w:p>
-            <w:pPr>
-              <w:pStyle w:val="ListParagraph"/>
-              <w:spacing w:line="276" w:lineRule="auto"/>
-              <w:ind w:left="0"/>
-              <w:jc w:val="center"/>
-              <w:rPr>
-                <w:rFonts w:ascii="Open Sans" w:hAnsi="Open Sans" w:cs="Open Sans"/>
-                <w:lang w:val="en-US"/>
-              </w:rPr>
-            </w:pPr>
-            <w:r>
-              <w:rPr>
-                <w:rFonts w:ascii="Open Sans" w:hAnsi="Open Sans" w:cs="Open Sans"/>
-                <w:lang w:val="en-US"/>
-              </w:rPr>
-              <w:t>1</w:t>
-            </w:r>
-          </w:p>
-        </w:tc>
-        <w:tc>
-          <w:tcPr>
-            <w:tcW w:w="2770" w:type="dxa"/>
-            <w:shd w:val="clear" w:color="auto" w:fill="auto"/>
-          </w:tcPr>
-          <w:p>
-            <w:pPr>
-              <w:pStyle w:val="ListParagraph"/>
-              <w:spacing w:line="276" w:lineRule="auto"/>
-              <w:ind w:left="0"/>
-              <w:jc w:val="center"/>
-              <w:cnfStyle w:val="000000100000" w:firstRow="0" w:lastRow="0" w:firstColumn="0" w:lastColumn="0" w:oddVBand="0" w:evenVBand="0" w:oddHBand="1" w:evenHBand="0" w:firstRowFirstColumn="0" w:firstRowLastColumn="0" w:lastRowFirstColumn="0" w:lastRowLastColumn="0"/>
-              <w:rPr>
-                <w:rFonts w:ascii="Open Sans" w:hAnsi="Open Sans" w:cs="Open Sans"/>
-                <w:u w:val="single"/>
-                <w:lang w:val="en-US"/>
-              </w:rPr>
-            </w:pPr>
+              <w:t>/</w:t>
+            </w:r>
             <w:proofErr w:type="spellStart"/>
             <w:r>
               <w:rPr>
                 <w:rFonts w:ascii="Open Sans" w:hAnsi="Open Sans" w:cs="Open Sans"/>
-                <w:u w:val="single"/>
-                <w:lang w:val="en-US"/>
-              </w:rPr>
-              <w:t>NoKontrol</w:t>
-            </w:r>
-            <w:proofErr w:type="spellEnd"/>
-          </w:p>
-        </w:tc>
-        <w:tc>
-          <w:tcPr>
-            <w:tcW w:w="2919" w:type="dxa"/>
-            <w:shd w:val="clear" w:color="auto" w:fill="auto"/>
-          </w:tcPr>
-          <w:p>
-            <w:pPr>
-              <w:pStyle w:val="ListParagraph"/>
-              <w:spacing w:line="276" w:lineRule="auto"/>
-              <w:ind w:left="0"/>
-              <w:jc w:val="center"/>
-              <w:cnfStyle w:val="000000100000" w:firstRow="0" w:lastRow="0" w:firstColumn="0" w:lastColumn="0" w:oddVBand="0" w:evenVBand="0" w:oddHBand="1" w:evenHBand="0" w:firstRowFirstColumn="0" w:firstRowLastColumn="0" w:lastRowFirstColumn="0" w:lastRowLastColumn="0"/>
-              <w:rPr>
-                <w:rFonts w:ascii="Open Sans" w:hAnsi="Open Sans" w:cs="Open Sans"/>
-                <w:lang w:val="en-US"/>
-              </w:rPr>
-            </w:pPr>
-            <w:proofErr w:type="gramStart"/>
-            <w:r>
-              <w:rPr>
-                <w:rFonts w:ascii="Open Sans" w:hAnsi="Open Sans" w:cs="Open Sans"/>
-                <w:lang w:val="en-US"/>
-              </w:rPr>
-              <w:t>CHAR(</w:t>
-            </w:r>
-            <w:proofErr w:type="gramEnd"/>
-            <w:r>
-              <w:rPr>
-                <w:rFonts w:ascii="Open Sans" w:hAnsi="Open Sans" w:cs="Open Sans"/>
-                <w:lang w:val="en-US"/>
-              </w:rPr>
-              <w:t>12)</w:t>
-            </w:r>
-          </w:p>
-        </w:tc>
-        <w:tc>
-          <w:tcPr>
-            <w:tcW w:w="4551" w:type="dxa"/>
-            <w:shd w:val="clear" w:color="auto" w:fill="auto"/>
-          </w:tcPr>
-          <w:p>
-            <w:pPr>
-              <w:pStyle w:val="ListParagraph"/>
-              <w:spacing w:line="276" w:lineRule="auto"/>
-              <w:ind w:left="0"/>
-              <w:cnfStyle w:val="000000100000" w:firstRow="0" w:lastRow="0" w:firstColumn="0" w:lastColumn="0" w:oddVBand="0" w:evenVBand="0" w:oddHBand="1" w:evenHBand="0" w:firstRowFirstColumn="0" w:firstRowLastColumn="0" w:lastRowFirstColumn="0" w:lastRowLastColumn="0"/>
-              <w:rPr>
-                <w:rFonts w:ascii="Open Sans" w:hAnsi="Open Sans" w:cs="Open Sans"/>
-                <w:lang w:val="en-US"/>
-              </w:rPr>
-            </w:pPr>
-            <w:proofErr w:type="spellStart"/>
-            <w:r>
-              <w:rPr>
-                <w:rFonts w:ascii="Open Sans" w:hAnsi="Open Sans" w:cs="Open Sans"/>
-                <w:lang w:val="en-US"/>
-              </w:rPr>
-              <w:t>Menggunakan</w:t>
-            </w:r>
-            <w:proofErr w:type="spellEnd"/>
-            <w:r>
-              <w:rPr>
-                <w:rFonts w:ascii="Open Sans" w:hAnsi="Open Sans" w:cs="Open Sans"/>
-                <w:lang w:val="en-US"/>
-              </w:rPr>
-              <w:t xml:space="preserve"> </w:t>
-            </w:r>
-            <w:proofErr w:type="spellStart"/>
-            <w:r>
-              <w:rPr>
-                <w:rFonts w:ascii="Open Sans" w:hAnsi="Open Sans" w:cs="Open Sans"/>
-                <w:lang w:val="en-US"/>
-              </w:rPr>
-              <w:t>tipe</w:t>
-            </w:r>
-            <w:proofErr w:type="spellEnd"/>
-            <w:r>
-              <w:rPr>
-                <w:rFonts w:ascii="Open Sans" w:hAnsi="Open Sans" w:cs="Open Sans"/>
-                <w:lang w:val="en-US"/>
-              </w:rPr>
-              <w:t xml:space="preserve"> data CHAR </w:t>
-            </w:r>
-            <w:proofErr w:type="spellStart"/>
-            <w:r>
-              <w:rPr>
-                <w:rFonts w:ascii="Open Sans" w:hAnsi="Open Sans" w:cs="Open Sans"/>
-                <w:lang w:val="en-US"/>
-              </w:rPr>
-              <w:t>karena</w:t>
-            </w:r>
-            <w:proofErr w:type="spellEnd"/>
-            <w:r>
-              <w:rPr>
-                <w:rFonts w:ascii="Open Sans" w:hAnsi="Open Sans" w:cs="Open Sans"/>
-                <w:lang w:val="en-US"/>
-              </w:rPr>
-              <w:t xml:space="preserve"> </w:t>
-            </w:r>
-            <w:proofErr w:type="spellStart"/>
-            <w:r>
-              <w:rPr>
-                <w:rFonts w:ascii="Open Sans" w:hAnsi="Open Sans" w:cs="Open Sans"/>
-                <w:lang w:val="en-US"/>
-              </w:rPr>
-              <w:t>panjang</w:t>
-            </w:r>
-            <w:proofErr w:type="spellEnd"/>
-            <w:r>
-              <w:rPr>
-                <w:rFonts w:ascii="Open Sans" w:hAnsi="Open Sans" w:cs="Open Sans"/>
-                <w:lang w:val="en-US"/>
-              </w:rPr>
-              <w:t xml:space="preserve"> </w:t>
-            </w:r>
-            <w:proofErr w:type="spellStart"/>
-            <w:r>
-              <w:rPr>
-                <w:rFonts w:ascii="Open Sans" w:hAnsi="Open Sans" w:cs="Open Sans"/>
-                <w:lang w:val="en-US"/>
-              </w:rPr>
-              <w:t>nilainya</w:t>
-            </w:r>
-            <w:proofErr w:type="spellEnd"/>
-            <w:r>
-              <w:rPr>
-                <w:rFonts w:ascii="Open Sans" w:hAnsi="Open Sans" w:cs="Open Sans"/>
-                <w:lang w:val="en-US"/>
-              </w:rPr>
-              <w:t xml:space="preserve"> </w:t>
-            </w:r>
-            <w:proofErr w:type="spellStart"/>
-            <w:r>
-              <w:rPr>
-                <w:rFonts w:ascii="Open Sans" w:hAnsi="Open Sans" w:cs="Open Sans"/>
-                <w:lang w:val="en-US"/>
-              </w:rPr>
-              <w:t>tetap</w:t>
-            </w:r>
-            <w:proofErr w:type="spellEnd"/>
-            <w:r>
-              <w:rPr>
-                <w:rFonts w:ascii="Open Sans" w:hAnsi="Open Sans" w:cs="Open Sans"/>
-                <w:lang w:val="en-US"/>
-              </w:rPr>
-              <w:t xml:space="preserve">, dan </w:t>
-            </w:r>
-            <w:proofErr w:type="spellStart"/>
-            <w:r>
-              <w:rPr>
-                <w:rFonts w:ascii="Open Sans" w:hAnsi="Open Sans" w:cs="Open Sans"/>
-                <w:lang w:val="en-US"/>
-              </w:rPr>
-              <w:t>mengambil</w:t>
-            </w:r>
-            <w:proofErr w:type="spellEnd"/>
-            <w:r>
-              <w:rPr>
-                <w:rFonts w:ascii="Open Sans" w:hAnsi="Open Sans" w:cs="Open Sans"/>
-                <w:lang w:val="en-US"/>
-              </w:rPr>
-              <w:t xml:space="preserve"> </w:t>
-            </w:r>
-            <w:proofErr w:type="spellStart"/>
-            <w:r>
-              <w:rPr>
-                <w:rFonts w:ascii="Open Sans" w:hAnsi="Open Sans" w:cs="Open Sans"/>
-                <w:lang w:val="en-US"/>
-              </w:rPr>
-              <w:t>ukuran</w:t>
-            </w:r>
-            <w:proofErr w:type="spellEnd"/>
-            <w:r>
-              <w:rPr>
-                <w:rFonts w:ascii="Open Sans" w:hAnsi="Open Sans" w:cs="Open Sans"/>
-                <w:lang w:val="en-US"/>
-              </w:rPr>
-              <w:t xml:space="preserve"> 12 </w:t>
-            </w:r>
-            <w:proofErr w:type="spellStart"/>
-            <w:r>
-              <w:rPr>
-                <w:rFonts w:ascii="Open Sans" w:hAnsi="Open Sans" w:cs="Open Sans"/>
-                <w:lang w:val="en-US"/>
-              </w:rPr>
-              <w:t>karena</w:t>
-            </w:r>
-            <w:proofErr w:type="spellEnd"/>
-            <w:r>
-              <w:rPr>
-                <w:rFonts w:ascii="Open Sans" w:hAnsi="Open Sans" w:cs="Open Sans"/>
-                <w:lang w:val="en-US"/>
-              </w:rPr>
-              <w:t xml:space="preserve"> </w:t>
-            </w:r>
-            <w:proofErr w:type="spellStart"/>
-            <w:r>
-              <w:rPr>
-                <w:rFonts w:ascii="Open Sans" w:hAnsi="Open Sans" w:cs="Open Sans"/>
-                <w:lang w:val="en-US"/>
-              </w:rPr>
-              <w:t>biasanya</w:t>
-            </w:r>
-            <w:proofErr w:type="spellEnd"/>
-            <w:r>
-              <w:rPr>
-                <w:rFonts w:ascii="Open Sans" w:hAnsi="Open Sans" w:cs="Open Sans"/>
-                <w:lang w:val="en-US"/>
-              </w:rPr>
-              <w:t xml:space="preserve"> </w:t>
-            </w:r>
-            <w:proofErr w:type="spellStart"/>
-            <w:r>
-              <w:rPr>
-                <w:rFonts w:ascii="Open Sans" w:hAnsi="Open Sans" w:cs="Open Sans"/>
-                <w:lang w:val="en-US"/>
-              </w:rPr>
-              <w:t>terdiri</w:t>
-            </w:r>
-            <w:proofErr w:type="spellEnd"/>
-            <w:r>
-              <w:rPr>
-                <w:rFonts w:ascii="Open Sans" w:hAnsi="Open Sans" w:cs="Open Sans"/>
-                <w:lang w:val="en-US"/>
-              </w:rPr>
-              <w:t xml:space="preserve"> </w:t>
-            </w:r>
-            <w:proofErr w:type="spellStart"/>
-            <w:r>
-              <w:rPr>
-                <w:rFonts w:ascii="Open Sans" w:hAnsi="Open Sans" w:cs="Open Sans"/>
-                <w:lang w:val="en-US"/>
-              </w:rPr>
-              <w:t>dari</w:t>
-            </w:r>
-            <w:proofErr w:type="spellEnd"/>
-            <w:r>
-              <w:rPr>
-                <w:rFonts w:ascii="Open Sans" w:hAnsi="Open Sans" w:cs="Open Sans"/>
-                <w:lang w:val="en-US"/>
-              </w:rPr>
-              <w:t xml:space="preserve"> </w:t>
-            </w:r>
-            <w:proofErr w:type="gramStart"/>
-            <w:r>
-              <w:rPr>
-                <w:rFonts w:ascii="Open Sans" w:hAnsi="Open Sans" w:cs="Open Sans"/>
-                <w:lang w:val="en-US"/>
-              </w:rPr>
-              <w:t>12 digit</w:t>
-            </w:r>
-            <w:proofErr w:type="gramEnd"/>
-            <w:r>
-              <w:rPr>
-                <w:rFonts w:ascii="Open Sans" w:hAnsi="Open Sans" w:cs="Open Sans"/>
-                <w:lang w:val="en-US"/>
-              </w:rPr>
-              <w:t xml:space="preserve"> </w:t>
-            </w:r>
-            <w:proofErr w:type="spellStart"/>
-            <w:r>
-              <w:rPr>
-                <w:rFonts w:ascii="Open Sans" w:hAnsi="Open Sans" w:cs="Open Sans"/>
-                <w:lang w:val="en-US"/>
-              </w:rPr>
-              <w:t>karakter</w:t>
-            </w:r>
-            <w:proofErr w:type="spellEnd"/>
-            <w:r>
-              <w:rPr>
-                <w:rFonts w:ascii="Open Sans" w:hAnsi="Open Sans" w:cs="Open Sans"/>
-                <w:lang w:val="en-US"/>
-              </w:rPr>
-              <w:t xml:space="preserve">, dan juga </w:t>
-            </w:r>
-            <w:proofErr w:type="spellStart"/>
-            <w:r>
-              <w:rPr>
-                <w:rFonts w:ascii="Open Sans" w:hAnsi="Open Sans" w:cs="Open Sans"/>
-                <w:lang w:val="en-US"/>
-              </w:rPr>
-              <w:t>mengambil</w:t>
-            </w:r>
-            <w:proofErr w:type="spellEnd"/>
-            <w:r>
-              <w:rPr>
-                <w:rFonts w:ascii="Open Sans" w:hAnsi="Open Sans" w:cs="Open Sans"/>
-                <w:lang w:val="en-US"/>
-              </w:rPr>
-              <w:t xml:space="preserve"> </w:t>
-            </w:r>
-            <w:proofErr w:type="spellStart"/>
-            <w:r>
-              <w:rPr>
-                <w:rFonts w:ascii="Open Sans" w:hAnsi="Open Sans" w:cs="Open Sans"/>
-                <w:lang w:val="en-US"/>
-              </w:rPr>
-              <w:t>referensi</w:t>
-            </w:r>
-            <w:proofErr w:type="spellEnd"/>
-            <w:r>
-              <w:rPr>
-                <w:rFonts w:ascii="Open Sans" w:hAnsi="Open Sans" w:cs="Open Sans"/>
-                <w:lang w:val="en-US"/>
-              </w:rPr>
-              <w:t xml:space="preserve"> </w:t>
-            </w:r>
-            <w:proofErr w:type="spellStart"/>
-            <w:r>
-              <w:rPr>
-                <w:rFonts w:ascii="Open Sans" w:hAnsi="Open Sans" w:cs="Open Sans"/>
-                <w:lang w:val="en-US"/>
-              </w:rPr>
-              <w:t>dari</w:t>
-            </w:r>
-            <w:proofErr w:type="spellEnd"/>
-            <w:r>
-              <w:rPr>
-                <w:rFonts w:ascii="Open Sans" w:hAnsi="Open Sans" w:cs="Open Sans"/>
-                <w:lang w:val="en-US"/>
-              </w:rPr>
-              <w:t xml:space="preserve"> </w:t>
-            </w:r>
-            <w:proofErr w:type="spellStart"/>
-            <w:r>
-              <w:rPr>
-                <w:rFonts w:ascii="Open Sans" w:hAnsi="Open Sans" w:cs="Open Sans"/>
-                <w:lang w:val="en-US"/>
-              </w:rPr>
-              <w:t>contoh</w:t>
-            </w:r>
-            <w:proofErr w:type="spellEnd"/>
-            <w:r>
-              <w:rPr>
-                <w:rFonts w:ascii="Open Sans" w:hAnsi="Open Sans" w:cs="Open Sans"/>
-                <w:lang w:val="en-US"/>
-              </w:rPr>
-              <w:t xml:space="preserve"> formular REKENING LISTRIK di </w:t>
-            </w:r>
-            <w:proofErr w:type="spellStart"/>
-            <w:r>
-              <w:rPr>
-                <w:rFonts w:ascii="Open Sans" w:hAnsi="Open Sans" w:cs="Open Sans"/>
-                <w:lang w:val="en-US"/>
-              </w:rPr>
-              <w:t>atas</w:t>
-            </w:r>
-            <w:proofErr w:type="spellEnd"/>
-          </w:p>
-        </w:tc>
-      </w:tr>
-      <w:tr>
-        <w:tc>
-          <w:tcPr>
-            <w:cnfStyle w:val="001000000000" w:firstRow="0" w:lastRow="0" w:firstColumn="1" w:lastColumn="0" w:oddVBand="0" w:evenVBand="0" w:oddHBand="0" w:evenHBand="0" w:firstRowFirstColumn="0" w:firstRowLastColumn="0" w:lastRowFirstColumn="0" w:lastRowLastColumn="0"/>
-            <w:tcW w:w="560" w:type="dxa"/>
-            <w:shd w:val="clear" w:color="auto" w:fill="auto"/>
-          </w:tcPr>
-          <w:p>
-            <w:pPr>
-              <w:pStyle w:val="ListParagraph"/>
-              <w:spacing w:line="276" w:lineRule="auto"/>
-              <w:ind w:left="0"/>
-              <w:jc w:val="center"/>
-              <w:rPr>
-                <w:rFonts w:ascii="Open Sans" w:hAnsi="Open Sans" w:cs="Open Sans"/>
-                <w:lang w:val="en-US"/>
-              </w:rPr>
-            </w:pPr>
-            <w:r>
-              <w:rPr>
-                <w:rFonts w:ascii="Open Sans" w:hAnsi="Open Sans" w:cs="Open Sans"/>
-                <w:lang w:val="en-US"/>
-              </w:rPr>
-              <w:t>2</w:t>
-            </w:r>
-          </w:p>
-        </w:tc>
-        <w:tc>
-          <w:tcPr>
-            <w:tcW w:w="2770" w:type="dxa"/>
-            <w:shd w:val="clear" w:color="auto" w:fill="auto"/>
-          </w:tcPr>
-          <w:p>
-            <w:pPr>
-              <w:pStyle w:val="ListParagraph"/>
-              <w:spacing w:line="276" w:lineRule="auto"/>
-              <w:ind w:left="0"/>
-              <w:jc w:val="center"/>
-              <w:cnfStyle w:val="000000000000" w:firstRow="0" w:lastRow="0" w:firstColumn="0" w:lastColumn="0" w:oddVBand="0" w:evenVBand="0" w:oddHBand="0" w:evenHBand="0" w:firstRowFirstColumn="0" w:firstRowLastColumn="0" w:lastRowFirstColumn="0" w:lastRowLastColumn="0"/>
-              <w:rPr>
-                <w:rFonts w:ascii="Open Sans" w:hAnsi="Open Sans" w:cs="Open Sans"/>
-                <w:lang w:val="en-US"/>
-              </w:rPr>
-            </w:pPr>
-            <w:r>
-              <w:rPr>
-                <w:rFonts w:ascii="Open Sans" w:hAnsi="Open Sans" w:cs="Open Sans"/>
-                <w:lang w:val="en-US"/>
-              </w:rPr>
-              <w:t>Nama</w:t>
-            </w:r>
-          </w:p>
-        </w:tc>
-        <w:tc>
-          <w:tcPr>
-            <w:tcW w:w="2919" w:type="dxa"/>
-            <w:shd w:val="clear" w:color="auto" w:fill="auto"/>
-          </w:tcPr>
-          <w:p>
-            <w:pPr>
-              <w:pStyle w:val="ListParagraph"/>
-              <w:spacing w:line="276" w:lineRule="auto"/>
-              <w:ind w:left="0"/>
-              <w:jc w:val="center"/>
-              <w:cnfStyle w:val="000000000000" w:firstRow="0" w:lastRow="0" w:firstColumn="0" w:lastColumn="0" w:oddVBand="0" w:evenVBand="0" w:oddHBand="0" w:evenHBand="0" w:firstRowFirstColumn="0" w:firstRowLastColumn="0" w:lastRowFirstColumn="0" w:lastRowLastColumn="0"/>
-              <w:rPr>
-                <w:rFonts w:ascii="Open Sans" w:hAnsi="Open Sans" w:cs="Open Sans"/>
-                <w:lang w:val="en-US"/>
-              </w:rPr>
-            </w:pPr>
-            <w:r>
-              <w:rPr>
-                <w:rFonts w:ascii="Open Sans" w:hAnsi="Open Sans" w:cs="Open Sans"/>
-                <w:lang w:val="en-US"/>
-              </w:rPr>
-              <w:t>VARCHAR (50)</w:t>
-            </w:r>
-          </w:p>
-        </w:tc>
-        <w:tc>
-          <w:tcPr>
-            <w:tcW w:w="4551" w:type="dxa"/>
-            <w:shd w:val="clear" w:color="auto" w:fill="auto"/>
-          </w:tcPr>
-          <w:p>
-            <w:pPr>
-              <w:pStyle w:val="ListParagraph"/>
-              <w:spacing w:line="276" w:lineRule="auto"/>
-              <w:ind w:left="0"/>
-              <w:cnfStyle w:val="000000000000" w:firstRow="0" w:lastRow="0" w:firstColumn="0" w:lastColumn="0" w:oddVBand="0" w:evenVBand="0" w:oddHBand="0" w:evenHBand="0" w:firstRowFirstColumn="0" w:firstRowLastColumn="0" w:lastRowFirstColumn="0" w:lastRowLastColumn="0"/>
-              <w:rPr>
-                <w:rFonts w:ascii="Open Sans" w:hAnsi="Open Sans" w:cs="Open Sans"/>
-                <w:lang w:val="en-US"/>
-              </w:rPr>
-            </w:pPr>
-            <w:proofErr w:type="spellStart"/>
-            <w:r>
-              <w:rPr>
-                <w:rFonts w:ascii="Open Sans" w:hAnsi="Open Sans" w:cs="Open Sans"/>
-                <w:lang w:val="en-US"/>
-              </w:rPr>
-              <w:t>Menggunakan</w:t>
-            </w:r>
-            <w:proofErr w:type="spellEnd"/>
-            <w:r>
-              <w:rPr>
-                <w:rFonts w:ascii="Open Sans" w:hAnsi="Open Sans" w:cs="Open Sans"/>
-                <w:lang w:val="en-US"/>
-              </w:rPr>
-              <w:t xml:space="preserve"> VARCHAR </w:t>
-            </w:r>
-            <w:proofErr w:type="spellStart"/>
-            <w:r>
-              <w:rPr>
-                <w:rFonts w:ascii="Open Sans" w:hAnsi="Open Sans" w:cs="Open Sans"/>
-                <w:lang w:val="en-US"/>
-              </w:rPr>
-              <w:t>karena</w:t>
-            </w:r>
-            <w:proofErr w:type="spellEnd"/>
-            <w:r>
-              <w:rPr>
-                <w:rFonts w:ascii="Open Sans" w:hAnsi="Open Sans" w:cs="Open Sans"/>
-                <w:lang w:val="en-US"/>
-              </w:rPr>
-              <w:t xml:space="preserve"> </w:t>
-            </w:r>
-            <w:proofErr w:type="spellStart"/>
-            <w:r>
-              <w:rPr>
-                <w:rFonts w:ascii="Open Sans" w:hAnsi="Open Sans" w:cs="Open Sans"/>
-                <w:lang w:val="en-US"/>
-              </w:rPr>
-              <w:t>fleksibel</w:t>
-            </w:r>
-            <w:proofErr w:type="spellEnd"/>
-            <w:r>
-              <w:rPr>
-                <w:rFonts w:ascii="Open Sans" w:hAnsi="Open Sans" w:cs="Open Sans"/>
-                <w:lang w:val="en-US"/>
-              </w:rPr>
-              <w:t xml:space="preserve"> dan </w:t>
-            </w:r>
-            <w:proofErr w:type="spellStart"/>
-            <w:r>
-              <w:rPr>
-                <w:rFonts w:ascii="Open Sans" w:hAnsi="Open Sans" w:cs="Open Sans"/>
-                <w:lang w:val="en-US"/>
-              </w:rPr>
-              <w:t>dapat</w:t>
-            </w:r>
-            <w:proofErr w:type="spellEnd"/>
-            <w:r>
-              <w:rPr>
-                <w:rFonts w:ascii="Open Sans" w:hAnsi="Open Sans" w:cs="Open Sans"/>
-                <w:lang w:val="en-US"/>
-              </w:rPr>
-              <w:t xml:space="preserve"> </w:t>
-            </w:r>
-            <w:proofErr w:type="spellStart"/>
-            <w:r>
-              <w:rPr>
-                <w:rFonts w:ascii="Open Sans" w:hAnsi="Open Sans" w:cs="Open Sans"/>
-                <w:lang w:val="en-US"/>
-              </w:rPr>
-              <w:t>menangani</w:t>
-            </w:r>
-            <w:proofErr w:type="spellEnd"/>
-            <w:r>
-              <w:rPr>
-                <w:rFonts w:ascii="Open Sans" w:hAnsi="Open Sans" w:cs="Open Sans"/>
-                <w:lang w:val="en-US"/>
-              </w:rPr>
-              <w:t xml:space="preserve"> data </w:t>
-            </w:r>
-            <w:proofErr w:type="spellStart"/>
-            <w:r>
-              <w:rPr>
-                <w:rFonts w:ascii="Open Sans" w:hAnsi="Open Sans" w:cs="Open Sans"/>
-                <w:lang w:val="en-US"/>
-              </w:rPr>
-              <w:t>dinamis</w:t>
-            </w:r>
-            <w:proofErr w:type="spellEnd"/>
-            <w:r>
-              <w:rPr>
-                <w:rFonts w:ascii="Open Sans" w:hAnsi="Open Sans" w:cs="Open Sans"/>
-                <w:lang w:val="en-US"/>
-              </w:rPr>
-              <w:t xml:space="preserve">, dan </w:t>
-            </w:r>
-            <w:proofErr w:type="spellStart"/>
-            <w:r>
-              <w:rPr>
-                <w:rFonts w:ascii="Open Sans" w:hAnsi="Open Sans" w:cs="Open Sans"/>
-                <w:lang w:val="en-US"/>
-              </w:rPr>
-              <w:t>ukuran</w:t>
-            </w:r>
-            <w:proofErr w:type="spellEnd"/>
-            <w:r>
-              <w:rPr>
-                <w:rFonts w:ascii="Open Sans" w:hAnsi="Open Sans" w:cs="Open Sans"/>
-                <w:lang w:val="en-US"/>
-              </w:rPr>
-              <w:t xml:space="preserve"> data 50 </w:t>
-            </w:r>
-            <w:proofErr w:type="spellStart"/>
-            <w:r>
-              <w:rPr>
-                <w:rFonts w:ascii="Open Sans" w:hAnsi="Open Sans" w:cs="Open Sans"/>
-                <w:lang w:val="en-US"/>
-              </w:rPr>
-              <w:t>karena</w:t>
-            </w:r>
-            <w:proofErr w:type="spellEnd"/>
-            <w:r>
-              <w:rPr>
-                <w:rFonts w:ascii="Open Sans" w:hAnsi="Open Sans" w:cs="Open Sans"/>
-                <w:lang w:val="en-US"/>
-              </w:rPr>
-              <w:t xml:space="preserve"> </w:t>
-            </w:r>
-            <w:proofErr w:type="spellStart"/>
-            <w:r>
-              <w:rPr>
-                <w:rFonts w:ascii="Open Sans" w:hAnsi="Open Sans" w:cs="Open Sans"/>
-                <w:lang w:val="en-US"/>
-              </w:rPr>
-              <w:t>jarang</w:t>
-            </w:r>
-            <w:proofErr w:type="spellEnd"/>
-            <w:r>
-              <w:rPr>
-                <w:rFonts w:ascii="Open Sans" w:hAnsi="Open Sans" w:cs="Open Sans"/>
-                <w:lang w:val="en-US"/>
-              </w:rPr>
-              <w:t xml:space="preserve"> </w:t>
-            </w:r>
-            <w:proofErr w:type="spellStart"/>
-            <w:r>
-              <w:rPr>
-                <w:rFonts w:ascii="Open Sans" w:hAnsi="Open Sans" w:cs="Open Sans"/>
-                <w:lang w:val="en-US"/>
-              </w:rPr>
-              <w:t>lebih</w:t>
-            </w:r>
-            <w:proofErr w:type="spellEnd"/>
-            <w:r>
-              <w:rPr>
-                <w:rFonts w:ascii="Open Sans" w:hAnsi="Open Sans" w:cs="Open Sans"/>
-                <w:lang w:val="en-US"/>
-              </w:rPr>
-              <w:t xml:space="preserve"> </w:t>
-            </w:r>
-            <w:proofErr w:type="spellStart"/>
-            <w:r>
-              <w:rPr>
-                <w:rFonts w:ascii="Open Sans" w:hAnsi="Open Sans" w:cs="Open Sans"/>
-                <w:lang w:val="en-US"/>
-              </w:rPr>
-              <w:t>dari</w:t>
-            </w:r>
-            <w:proofErr w:type="spellEnd"/>
-            <w:r>
-              <w:rPr>
-                <w:rFonts w:ascii="Open Sans" w:hAnsi="Open Sans" w:cs="Open Sans"/>
-                <w:lang w:val="en-US"/>
-              </w:rPr>
-              <w:t xml:space="preserve"> 50 </w:t>
-            </w:r>
-            <w:proofErr w:type="spellStart"/>
-            <w:r>
-              <w:rPr>
-                <w:rFonts w:ascii="Open Sans" w:hAnsi="Open Sans" w:cs="Open Sans"/>
-                <w:lang w:val="en-US"/>
-              </w:rPr>
-              <w:t>karakter</w:t>
+                <w:lang w:val="en-US"/>
+              </w:rPr>
+              <w:t>Alasan</w:t>
             </w:r>
             <w:proofErr w:type="spellEnd"/>
           </w:p>
@@ -6405,7 +5794,7 @@
                 <w:rFonts w:ascii="Open Sans" w:hAnsi="Open Sans" w:cs="Open Sans"/>
                 <w:lang w:val="en-US"/>
               </w:rPr>
-              <w:t>3</w:t>
+              <w:t>1</w:t>
             </w:r>
           </w:p>
         </w:tc>
@@ -6423,16 +5812,20 @@
               <w:cnfStyle w:val="000000100000" w:firstRow="0" w:lastRow="0" w:firstColumn="0" w:lastColumn="0" w:oddVBand="0" w:evenVBand="0" w:oddHBand="1" w:evenHBand="0" w:firstRowFirstColumn="0" w:firstRowLastColumn="0" w:lastRowFirstColumn="0" w:lastRowLastColumn="0"/>
               <w:rPr>
                 <w:rFonts w:ascii="Open Sans" w:hAnsi="Open Sans" w:cs="Open Sans"/>
+                <w:u w:val="single"/>
                 <w:lang w:val="en-US"/>
               </w:rPr>
             </w:pPr>
-            <w:r>
-              <w:rPr>
-                <w:rFonts w:ascii="Open Sans" w:hAnsi="Open Sans" w:cs="Open Sans"/>
-                <w:lang w:val="en-US"/>
-              </w:rPr>
-              <w:t>Alamat</w:t>
-            </w:r>
+            <w:proofErr w:type="spellStart"/>
+            <w:r>
+              <w:rPr>
+                <w:rFonts w:ascii="Open Sans" w:hAnsi="Open Sans" w:cs="Open Sans"/>
+                <w:u w:val="single"/>
+                <w:lang w:val="en-US"/>
+              </w:rPr>
+              <w:t>NoKontrol</w:t>
+            </w:r>
+            <w:proofErr w:type="spellEnd"/>
           </w:p>
         </w:tc>
         <w:tc>
@@ -6452,26 +5845,21 @@
                 <w:lang w:val="en-US"/>
               </w:rPr>
             </w:pPr>
-            <w:r>
-              <w:rPr>
-                <w:rFonts w:ascii="Open Sans" w:hAnsi="Open Sans" w:cs="Open Sans"/>
-                <w:lang w:val="en-US"/>
-              </w:rPr>
-              <w:t>VARCHAR (1</w:t>
-            </w:r>
-            <w:r>
-              <w:rPr>
-                <w:rFonts w:ascii="Open Sans" w:hAnsi="Open Sans" w:cs="Open Sans"/>
-                <w:lang w:val="en-US"/>
-              </w:rPr>
-              <w:t>5</w:t>
-            </w:r>
-            <w:r>
-              <w:rPr>
-                <w:rFonts w:ascii="Open Sans" w:hAnsi="Open Sans" w:cs="Open Sans"/>
-                <w:lang w:val="en-US"/>
-              </w:rPr>
-              <w:t>0)</w:t>
+            <w:proofErr w:type="gramStart"/>
+            <w:r>
+              <w:rPr>
+                <w:rFonts w:ascii="Open Sans" w:hAnsi="Open Sans" w:cs="Open Sans"/>
+                <w:lang w:val="en-US"/>
+              </w:rPr>
+              <w:t>CHAR(</w:t>
+            </w:r>
+            <w:proofErr w:type="gramEnd"/>
+            <w:r>
+              <w:rPr>
+                <w:rFonts w:ascii="Open Sans" w:hAnsi="Open Sans" w:cs="Open Sans"/>
+                <w:lang w:val="en-US"/>
+              </w:rPr>
+              <w:t>12)</w:t>
             </w:r>
           </w:p>
         </w:tc>
@@ -6491,6 +5879,701 @@
                 <w:lang w:val="en-US"/>
               </w:rPr>
             </w:pPr>
+            <w:proofErr w:type="spellStart"/>
+            <w:r>
+              <w:rPr>
+                <w:rFonts w:ascii="Open Sans" w:hAnsi="Open Sans" w:cs="Open Sans"/>
+                <w:lang w:val="en-US"/>
+              </w:rPr>
+              <w:t>Menggunakan</w:t>
+            </w:r>
+            <w:proofErr w:type="spellEnd"/>
+            <w:r>
+              <w:rPr>
+                <w:rFonts w:ascii="Open Sans" w:hAnsi="Open Sans" w:cs="Open Sans"/>
+                <w:lang w:val="en-US"/>
+              </w:rPr>
+              <w:t xml:space="preserve"> </w:t>
+            </w:r>
+            <w:proofErr w:type="spellStart"/>
+            <w:r>
+              <w:rPr>
+                <w:rFonts w:ascii="Open Sans" w:hAnsi="Open Sans" w:cs="Open Sans"/>
+                <w:lang w:val="en-US"/>
+              </w:rPr>
+              <w:t>tipe</w:t>
+            </w:r>
+            <w:proofErr w:type="spellEnd"/>
+            <w:r>
+              <w:rPr>
+                <w:rFonts w:ascii="Open Sans" w:hAnsi="Open Sans" w:cs="Open Sans"/>
+                <w:lang w:val="en-US"/>
+              </w:rPr>
+              <w:t xml:space="preserve"> data CHAR </w:t>
+            </w:r>
+            <w:proofErr w:type="spellStart"/>
+            <w:r>
+              <w:rPr>
+                <w:rFonts w:ascii="Open Sans" w:hAnsi="Open Sans" w:cs="Open Sans"/>
+                <w:lang w:val="en-US"/>
+              </w:rPr>
+              <w:t>karena</w:t>
+            </w:r>
+            <w:proofErr w:type="spellEnd"/>
+            <w:r>
+              <w:rPr>
+                <w:rFonts w:ascii="Open Sans" w:hAnsi="Open Sans" w:cs="Open Sans"/>
+                <w:lang w:val="en-US"/>
+              </w:rPr>
+              <w:t xml:space="preserve"> </w:t>
+            </w:r>
+            <w:proofErr w:type="spellStart"/>
+            <w:r>
+              <w:rPr>
+                <w:rFonts w:ascii="Open Sans" w:hAnsi="Open Sans" w:cs="Open Sans"/>
+                <w:lang w:val="en-US"/>
+              </w:rPr>
+              <w:t>panjang</w:t>
+            </w:r>
+            <w:proofErr w:type="spellEnd"/>
+            <w:r>
+              <w:rPr>
+                <w:rFonts w:ascii="Open Sans" w:hAnsi="Open Sans" w:cs="Open Sans"/>
+                <w:lang w:val="en-US"/>
+              </w:rPr>
+              <w:t xml:space="preserve"> </w:t>
+            </w:r>
+            <w:proofErr w:type="spellStart"/>
+            <w:r>
+              <w:rPr>
+                <w:rFonts w:ascii="Open Sans" w:hAnsi="Open Sans" w:cs="Open Sans"/>
+                <w:lang w:val="en-US"/>
+              </w:rPr>
+              <w:t>nilainya</w:t>
+            </w:r>
+            <w:proofErr w:type="spellEnd"/>
+            <w:r>
+              <w:rPr>
+                <w:rFonts w:ascii="Open Sans" w:hAnsi="Open Sans" w:cs="Open Sans"/>
+                <w:lang w:val="en-US"/>
+              </w:rPr>
+              <w:t xml:space="preserve"> </w:t>
+            </w:r>
+            <w:proofErr w:type="spellStart"/>
+            <w:r>
+              <w:rPr>
+                <w:rFonts w:ascii="Open Sans" w:hAnsi="Open Sans" w:cs="Open Sans"/>
+                <w:lang w:val="en-US"/>
+              </w:rPr>
+              <w:t>tetap</w:t>
+            </w:r>
+            <w:proofErr w:type="spellEnd"/>
+            <w:r>
+              <w:rPr>
+                <w:rFonts w:ascii="Open Sans" w:hAnsi="Open Sans" w:cs="Open Sans"/>
+                <w:lang w:val="en-US"/>
+              </w:rPr>
+              <w:t xml:space="preserve">, dan </w:t>
+            </w:r>
+            <w:proofErr w:type="spellStart"/>
+            <w:r>
+              <w:rPr>
+                <w:rFonts w:ascii="Open Sans" w:hAnsi="Open Sans" w:cs="Open Sans"/>
+                <w:lang w:val="en-US"/>
+              </w:rPr>
+              <w:t>mengambil</w:t>
+            </w:r>
+            <w:proofErr w:type="spellEnd"/>
+            <w:r>
+              <w:rPr>
+                <w:rFonts w:ascii="Open Sans" w:hAnsi="Open Sans" w:cs="Open Sans"/>
+                <w:lang w:val="en-US"/>
+              </w:rPr>
+              <w:t xml:space="preserve"> </w:t>
+            </w:r>
+            <w:proofErr w:type="spellStart"/>
+            <w:r>
+              <w:rPr>
+                <w:rFonts w:ascii="Open Sans" w:hAnsi="Open Sans" w:cs="Open Sans"/>
+                <w:lang w:val="en-US"/>
+              </w:rPr>
+              <w:t>ukuran</w:t>
+            </w:r>
+            <w:proofErr w:type="spellEnd"/>
+            <w:r>
+              <w:rPr>
+                <w:rFonts w:ascii="Open Sans" w:hAnsi="Open Sans" w:cs="Open Sans"/>
+                <w:lang w:val="en-US"/>
+              </w:rPr>
+              <w:t xml:space="preserve"> 12 </w:t>
+            </w:r>
+            <w:proofErr w:type="spellStart"/>
+            <w:r>
+              <w:rPr>
+                <w:rFonts w:ascii="Open Sans" w:hAnsi="Open Sans" w:cs="Open Sans"/>
+                <w:lang w:val="en-US"/>
+              </w:rPr>
+              <w:t>karena</w:t>
+            </w:r>
+            <w:proofErr w:type="spellEnd"/>
+            <w:r>
+              <w:rPr>
+                <w:rFonts w:ascii="Open Sans" w:hAnsi="Open Sans" w:cs="Open Sans"/>
+                <w:lang w:val="en-US"/>
+              </w:rPr>
+              <w:t xml:space="preserve"> </w:t>
+            </w:r>
+            <w:proofErr w:type="spellStart"/>
+            <w:r>
+              <w:rPr>
+                <w:rFonts w:ascii="Open Sans" w:hAnsi="Open Sans" w:cs="Open Sans"/>
+                <w:lang w:val="en-US"/>
+              </w:rPr>
+              <w:t>biasanya</w:t>
+            </w:r>
+            <w:proofErr w:type="spellEnd"/>
+            <w:r>
+              <w:rPr>
+                <w:rFonts w:ascii="Open Sans" w:hAnsi="Open Sans" w:cs="Open Sans"/>
+                <w:lang w:val="en-US"/>
+              </w:rPr>
+              <w:t xml:space="preserve"> </w:t>
+            </w:r>
+            <w:proofErr w:type="spellStart"/>
+            <w:r>
+              <w:rPr>
+                <w:rFonts w:ascii="Open Sans" w:hAnsi="Open Sans" w:cs="Open Sans"/>
+                <w:lang w:val="en-US"/>
+              </w:rPr>
+              <w:t>terdiri</w:t>
+            </w:r>
+            <w:proofErr w:type="spellEnd"/>
+            <w:r>
+              <w:rPr>
+                <w:rFonts w:ascii="Open Sans" w:hAnsi="Open Sans" w:cs="Open Sans"/>
+                <w:lang w:val="en-US"/>
+              </w:rPr>
+              <w:t xml:space="preserve"> </w:t>
+            </w:r>
+            <w:proofErr w:type="spellStart"/>
+            <w:r>
+              <w:rPr>
+                <w:rFonts w:ascii="Open Sans" w:hAnsi="Open Sans" w:cs="Open Sans"/>
+                <w:lang w:val="en-US"/>
+              </w:rPr>
+              <w:t>dari</w:t>
+            </w:r>
+            <w:proofErr w:type="spellEnd"/>
+            <w:r>
+              <w:rPr>
+                <w:rFonts w:ascii="Open Sans" w:hAnsi="Open Sans" w:cs="Open Sans"/>
+                <w:lang w:val="en-US"/>
+              </w:rPr>
+              <w:t xml:space="preserve"> </w:t>
+            </w:r>
+            <w:proofErr w:type="gramStart"/>
+            <w:r>
+              <w:rPr>
+                <w:rFonts w:ascii="Open Sans" w:hAnsi="Open Sans" w:cs="Open Sans"/>
+                <w:lang w:val="en-US"/>
+              </w:rPr>
+              <w:t>12 digit</w:t>
+            </w:r>
+            <w:proofErr w:type="gramEnd"/>
+            <w:r>
+              <w:rPr>
+                <w:rFonts w:ascii="Open Sans" w:hAnsi="Open Sans" w:cs="Open Sans"/>
+                <w:lang w:val="en-US"/>
+              </w:rPr>
+              <w:t xml:space="preserve"> </w:t>
+            </w:r>
+            <w:proofErr w:type="spellStart"/>
+            <w:r>
+              <w:rPr>
+                <w:rFonts w:ascii="Open Sans" w:hAnsi="Open Sans" w:cs="Open Sans"/>
+                <w:lang w:val="en-US"/>
+              </w:rPr>
+              <w:t>karakter</w:t>
+            </w:r>
+            <w:proofErr w:type="spellEnd"/>
+            <w:r>
+              <w:rPr>
+                <w:rFonts w:ascii="Open Sans" w:hAnsi="Open Sans" w:cs="Open Sans"/>
+                <w:lang w:val="en-US"/>
+              </w:rPr>
+              <w:t xml:space="preserve">, dan juga </w:t>
+            </w:r>
+            <w:proofErr w:type="spellStart"/>
+            <w:r>
+              <w:rPr>
+                <w:rFonts w:ascii="Open Sans" w:hAnsi="Open Sans" w:cs="Open Sans"/>
+                <w:lang w:val="en-US"/>
+              </w:rPr>
+              <w:t>mengambil</w:t>
+            </w:r>
+            <w:proofErr w:type="spellEnd"/>
+            <w:r>
+              <w:rPr>
+                <w:rFonts w:ascii="Open Sans" w:hAnsi="Open Sans" w:cs="Open Sans"/>
+                <w:lang w:val="en-US"/>
+              </w:rPr>
+              <w:t xml:space="preserve"> </w:t>
+            </w:r>
+            <w:proofErr w:type="spellStart"/>
+            <w:r>
+              <w:rPr>
+                <w:rFonts w:ascii="Open Sans" w:hAnsi="Open Sans" w:cs="Open Sans"/>
+                <w:lang w:val="en-US"/>
+              </w:rPr>
+              <w:t>referensi</w:t>
+            </w:r>
+            <w:proofErr w:type="spellEnd"/>
+            <w:r>
+              <w:rPr>
+                <w:rFonts w:ascii="Open Sans" w:hAnsi="Open Sans" w:cs="Open Sans"/>
+                <w:lang w:val="en-US"/>
+              </w:rPr>
+              <w:t xml:space="preserve"> </w:t>
+            </w:r>
+            <w:proofErr w:type="spellStart"/>
+            <w:r>
+              <w:rPr>
+                <w:rFonts w:ascii="Open Sans" w:hAnsi="Open Sans" w:cs="Open Sans"/>
+                <w:lang w:val="en-US"/>
+              </w:rPr>
+              <w:t>dari</w:t>
+            </w:r>
+            <w:proofErr w:type="spellEnd"/>
+            <w:r>
+              <w:rPr>
+                <w:rFonts w:ascii="Open Sans" w:hAnsi="Open Sans" w:cs="Open Sans"/>
+                <w:lang w:val="en-US"/>
+              </w:rPr>
+              <w:t xml:space="preserve"> </w:t>
+            </w:r>
+            <w:proofErr w:type="spellStart"/>
+            <w:r>
+              <w:rPr>
+                <w:rFonts w:ascii="Open Sans" w:hAnsi="Open Sans" w:cs="Open Sans"/>
+                <w:lang w:val="en-US"/>
+              </w:rPr>
+              <w:t>contoh</w:t>
+            </w:r>
+            <w:proofErr w:type="spellEnd"/>
+            <w:r>
+              <w:rPr>
+                <w:rFonts w:ascii="Open Sans" w:hAnsi="Open Sans" w:cs="Open Sans"/>
+                <w:lang w:val="en-US"/>
+              </w:rPr>
+              <w:t xml:space="preserve"> formular REKENING LISTRIK di </w:t>
+            </w:r>
+            <w:proofErr w:type="spellStart"/>
+            <w:r>
+              <w:rPr>
+                <w:rFonts w:ascii="Open Sans" w:hAnsi="Open Sans" w:cs="Open Sans"/>
+                <w:lang w:val="en-US"/>
+              </w:rPr>
+              <w:t>atas</w:t>
+            </w:r>
+            <w:proofErr w:type="spellEnd"/>
+          </w:p>
+        </w:tc>
+      </w:tr>
+      <w:tr>
+        <w:tc>
+          <w:tcPr>
+            <w:cnfStyle w:val="001000000000" w:firstRow="0" w:lastRow="0" w:firstColumn="1" w:lastColumn="0" w:oddVBand="0" w:evenVBand="0" w:oddHBand="0" w:evenHBand="0" w:firstRowFirstColumn="0" w:firstRowLastColumn="0" w:lastRowFirstColumn="0" w:lastRowLastColumn="0"/>
+            <w:tcW w:w="560" w:type="dxa"/>
+            <w:shd w:val="clear" w:color="auto" w:fill="auto"/>
+          </w:tcPr>
+          <w:p>
+            <w:pPr>
+              <w:pStyle w:val="ListParagraph"/>
+              <w:spacing w:line="276" w:lineRule="auto"/>
+              <w:ind w:left="0"/>
+              <w:jc w:val="center"/>
+              <w:rPr>
+                <w:rFonts w:ascii="Open Sans" w:hAnsi="Open Sans" w:cs="Open Sans"/>
+                <w:lang w:val="en-US"/>
+              </w:rPr>
+            </w:pPr>
+            <w:r>
+              <w:rPr>
+                <w:rFonts w:ascii="Open Sans" w:hAnsi="Open Sans" w:cs="Open Sans"/>
+                <w:lang w:val="en-US"/>
+              </w:rPr>
+              <w:t>2</w:t>
+            </w:r>
+          </w:p>
+        </w:tc>
+        <w:tc>
+          <w:tcPr>
+            <w:tcW w:w="2770" w:type="dxa"/>
+            <w:shd w:val="clear" w:color="auto" w:fill="auto"/>
+          </w:tcPr>
+          <w:p>
+            <w:pPr>
+              <w:pStyle w:val="ListParagraph"/>
+              <w:spacing w:line="276" w:lineRule="auto"/>
+              <w:ind w:left="0"/>
+              <w:jc w:val="center"/>
+              <w:cnfStyle w:val="000000000000" w:firstRow="0" w:lastRow="0" w:firstColumn="0" w:lastColumn="0" w:oddVBand="0" w:evenVBand="0" w:oddHBand="0" w:evenHBand="0" w:firstRowFirstColumn="0" w:firstRowLastColumn="0" w:lastRowFirstColumn="0" w:lastRowLastColumn="0"/>
+              <w:rPr>
+                <w:rFonts w:ascii="Open Sans" w:hAnsi="Open Sans" w:cs="Open Sans"/>
+                <w:lang w:val="en-US"/>
+              </w:rPr>
+            </w:pPr>
+            <w:r>
+              <w:rPr>
+                <w:rFonts w:ascii="Open Sans" w:hAnsi="Open Sans" w:cs="Open Sans"/>
+                <w:lang w:val="en-US"/>
+              </w:rPr>
+              <w:t>Nama</w:t>
+            </w:r>
+          </w:p>
+        </w:tc>
+        <w:tc>
+          <w:tcPr>
+            <w:tcW w:w="2919" w:type="dxa"/>
+            <w:shd w:val="clear" w:color="auto" w:fill="auto"/>
+          </w:tcPr>
+          <w:p>
+            <w:pPr>
+              <w:pStyle w:val="ListParagraph"/>
+              <w:spacing w:line="276" w:lineRule="auto"/>
+              <w:ind w:left="0"/>
+              <w:jc w:val="center"/>
+              <w:cnfStyle w:val="000000000000" w:firstRow="0" w:lastRow="0" w:firstColumn="0" w:lastColumn="0" w:oddVBand="0" w:evenVBand="0" w:oddHBand="0" w:evenHBand="0" w:firstRowFirstColumn="0" w:firstRowLastColumn="0" w:lastRowFirstColumn="0" w:lastRowLastColumn="0"/>
+              <w:rPr>
+                <w:rFonts w:ascii="Open Sans" w:hAnsi="Open Sans" w:cs="Open Sans"/>
+                <w:lang w:val="en-US"/>
+              </w:rPr>
+            </w:pPr>
+            <w:r>
+              <w:rPr>
+                <w:rFonts w:ascii="Open Sans" w:hAnsi="Open Sans" w:cs="Open Sans"/>
+                <w:lang w:val="en-US"/>
+              </w:rPr>
+              <w:t>VARCHAR (50)</w:t>
+            </w:r>
+          </w:p>
+        </w:tc>
+        <w:tc>
+          <w:tcPr>
+            <w:tcW w:w="4551" w:type="dxa"/>
+            <w:shd w:val="clear" w:color="auto" w:fill="auto"/>
+          </w:tcPr>
+          <w:p>
+            <w:pPr>
+              <w:pStyle w:val="ListParagraph"/>
+              <w:spacing w:line="276" w:lineRule="auto"/>
+              <w:ind w:left="0"/>
+              <w:cnfStyle w:val="000000000000" w:firstRow="0" w:lastRow="0" w:firstColumn="0" w:lastColumn="0" w:oddVBand="0" w:evenVBand="0" w:oddHBand="0" w:evenHBand="0" w:firstRowFirstColumn="0" w:firstRowLastColumn="0" w:lastRowFirstColumn="0" w:lastRowLastColumn="0"/>
+              <w:rPr>
+                <w:rFonts w:ascii="Open Sans" w:hAnsi="Open Sans" w:cs="Open Sans"/>
+                <w:lang w:val="en-US"/>
+              </w:rPr>
+            </w:pPr>
+            <w:proofErr w:type="spellStart"/>
+            <w:r>
+              <w:rPr>
+                <w:rFonts w:ascii="Open Sans" w:hAnsi="Open Sans" w:cs="Open Sans"/>
+                <w:lang w:val="en-US"/>
+              </w:rPr>
+              <w:t>Menggunakan</w:t>
+            </w:r>
+            <w:proofErr w:type="spellEnd"/>
+            <w:r>
+              <w:rPr>
+                <w:rFonts w:ascii="Open Sans" w:hAnsi="Open Sans" w:cs="Open Sans"/>
+                <w:lang w:val="en-US"/>
+              </w:rPr>
+              <w:t xml:space="preserve"> VARCHAR </w:t>
+            </w:r>
+            <w:proofErr w:type="spellStart"/>
+            <w:r>
+              <w:rPr>
+                <w:rFonts w:ascii="Open Sans" w:hAnsi="Open Sans" w:cs="Open Sans"/>
+                <w:lang w:val="en-US"/>
+              </w:rPr>
+              <w:t>karena</w:t>
+            </w:r>
+            <w:proofErr w:type="spellEnd"/>
+            <w:r>
+              <w:rPr>
+                <w:rFonts w:ascii="Open Sans" w:hAnsi="Open Sans" w:cs="Open Sans"/>
+                <w:lang w:val="en-US"/>
+              </w:rPr>
+              <w:t xml:space="preserve"> </w:t>
+            </w:r>
+            <w:proofErr w:type="spellStart"/>
+            <w:r>
+              <w:rPr>
+                <w:rFonts w:ascii="Open Sans" w:hAnsi="Open Sans" w:cs="Open Sans"/>
+                <w:lang w:val="en-US"/>
+              </w:rPr>
+              <w:t>fleksibel</w:t>
+            </w:r>
+            <w:proofErr w:type="spellEnd"/>
+            <w:r>
+              <w:rPr>
+                <w:rFonts w:ascii="Open Sans" w:hAnsi="Open Sans" w:cs="Open Sans"/>
+                <w:lang w:val="en-US"/>
+              </w:rPr>
+              <w:t xml:space="preserve"> dan </w:t>
+            </w:r>
+            <w:proofErr w:type="spellStart"/>
+            <w:r>
+              <w:rPr>
+                <w:rFonts w:ascii="Open Sans" w:hAnsi="Open Sans" w:cs="Open Sans"/>
+                <w:lang w:val="en-US"/>
+              </w:rPr>
+              <w:t>dapat</w:t>
+            </w:r>
+            <w:proofErr w:type="spellEnd"/>
+            <w:r>
+              <w:rPr>
+                <w:rFonts w:ascii="Open Sans" w:hAnsi="Open Sans" w:cs="Open Sans"/>
+                <w:lang w:val="en-US"/>
+              </w:rPr>
+              <w:t xml:space="preserve"> </w:t>
+            </w:r>
+            <w:proofErr w:type="spellStart"/>
+            <w:r>
+              <w:rPr>
+                <w:rFonts w:ascii="Open Sans" w:hAnsi="Open Sans" w:cs="Open Sans"/>
+                <w:lang w:val="en-US"/>
+              </w:rPr>
+              <w:t>menangani</w:t>
+            </w:r>
+            <w:proofErr w:type="spellEnd"/>
+            <w:r>
+              <w:rPr>
+                <w:rFonts w:ascii="Open Sans" w:hAnsi="Open Sans" w:cs="Open Sans"/>
+                <w:lang w:val="en-US"/>
+              </w:rPr>
+              <w:t xml:space="preserve"> data </w:t>
+            </w:r>
+            <w:proofErr w:type="spellStart"/>
+            <w:r>
+              <w:rPr>
+                <w:rFonts w:ascii="Open Sans" w:hAnsi="Open Sans" w:cs="Open Sans"/>
+                <w:lang w:val="en-US"/>
+              </w:rPr>
+              <w:t>dinamis</w:t>
+            </w:r>
+            <w:proofErr w:type="spellEnd"/>
+            <w:r>
+              <w:rPr>
+                <w:rFonts w:ascii="Open Sans" w:hAnsi="Open Sans" w:cs="Open Sans"/>
+                <w:lang w:val="en-US"/>
+              </w:rPr>
+              <w:t xml:space="preserve">, dan </w:t>
+            </w:r>
+            <w:proofErr w:type="spellStart"/>
+            <w:r>
+              <w:rPr>
+                <w:rFonts w:ascii="Open Sans" w:hAnsi="Open Sans" w:cs="Open Sans"/>
+                <w:lang w:val="en-US"/>
+              </w:rPr>
+              <w:t>ukuran</w:t>
+            </w:r>
+            <w:proofErr w:type="spellEnd"/>
+            <w:r>
+              <w:rPr>
+                <w:rFonts w:ascii="Open Sans" w:hAnsi="Open Sans" w:cs="Open Sans"/>
+                <w:lang w:val="en-US"/>
+              </w:rPr>
+              <w:t xml:space="preserve"> data 50 </w:t>
+            </w:r>
+            <w:proofErr w:type="spellStart"/>
+            <w:r>
+              <w:rPr>
+                <w:rFonts w:ascii="Open Sans" w:hAnsi="Open Sans" w:cs="Open Sans"/>
+                <w:lang w:val="en-US"/>
+              </w:rPr>
+              <w:t>karena</w:t>
+            </w:r>
+            <w:proofErr w:type="spellEnd"/>
+            <w:r>
+              <w:rPr>
+                <w:rFonts w:ascii="Open Sans" w:hAnsi="Open Sans" w:cs="Open Sans"/>
+                <w:lang w:val="en-US"/>
+              </w:rPr>
+              <w:t xml:space="preserve"> </w:t>
+            </w:r>
+            <w:proofErr w:type="spellStart"/>
+            <w:r>
+              <w:rPr>
+                <w:rFonts w:ascii="Open Sans" w:hAnsi="Open Sans" w:cs="Open Sans"/>
+                <w:lang w:val="en-US"/>
+              </w:rPr>
+              <w:t>jarang</w:t>
+            </w:r>
+            <w:proofErr w:type="spellEnd"/>
+            <w:r>
+              <w:rPr>
+                <w:rFonts w:ascii="Open Sans" w:hAnsi="Open Sans" w:cs="Open Sans"/>
+                <w:lang w:val="en-US"/>
+              </w:rPr>
+              <w:t xml:space="preserve"> </w:t>
+            </w:r>
+            <w:proofErr w:type="spellStart"/>
+            <w:r>
+              <w:rPr>
+                <w:rFonts w:ascii="Open Sans" w:hAnsi="Open Sans" w:cs="Open Sans"/>
+                <w:lang w:val="en-US"/>
+              </w:rPr>
+              <w:t>lebih</w:t>
+            </w:r>
+            <w:proofErr w:type="spellEnd"/>
+            <w:r>
+              <w:rPr>
+                <w:rFonts w:ascii="Open Sans" w:hAnsi="Open Sans" w:cs="Open Sans"/>
+                <w:lang w:val="en-US"/>
+              </w:rPr>
+              <w:t xml:space="preserve"> </w:t>
+            </w:r>
+            <w:proofErr w:type="spellStart"/>
+            <w:r>
+              <w:rPr>
+                <w:rFonts w:ascii="Open Sans" w:hAnsi="Open Sans" w:cs="Open Sans"/>
+                <w:lang w:val="en-US"/>
+              </w:rPr>
+              <w:t>dari</w:t>
+            </w:r>
+            <w:proofErr w:type="spellEnd"/>
+            <w:r>
+              <w:rPr>
+                <w:rFonts w:ascii="Open Sans" w:hAnsi="Open Sans" w:cs="Open Sans"/>
+                <w:lang w:val="en-US"/>
+              </w:rPr>
+              <w:t xml:space="preserve"> 50 </w:t>
+            </w:r>
+            <w:proofErr w:type="spellStart"/>
+            <w:r>
+              <w:rPr>
+                <w:rFonts w:ascii="Open Sans" w:hAnsi="Open Sans" w:cs="Open Sans"/>
+                <w:lang w:val="en-US"/>
+              </w:rPr>
+              <w:t>karakter</w:t>
+            </w:r>
+            <w:proofErr w:type="spellEnd"/>
+          </w:p>
+        </w:tc>
+      </w:tr>
+      <w:tr>
+        <w:trPr>
+          <w:cnfStyle w:val="000000100000" w:firstRow="0" w:lastRow="0" w:firstColumn="0" w:lastColumn="0" w:oddVBand="0" w:evenVBand="0" w:oddHBand="1" w:evenHBand="0" w:firstRowFirstColumn="0" w:firstRowLastColumn="0" w:lastRowFirstColumn="0" w:lastRowLastColumn="0"/>
+        </w:trPr>
+        <w:tc>
+          <w:tcPr>
+            <w:cnfStyle w:val="001000000000" w:firstRow="0" w:lastRow="0" w:firstColumn="1" w:lastColumn="0" w:oddVBand="0" w:evenVBand="0" w:oddHBand="0" w:evenHBand="0" w:firstRowFirstColumn="0" w:firstRowLastColumn="0" w:lastRowFirstColumn="0" w:lastRowLastColumn="0"/>
+            <w:tcW w:w="560" w:type="dxa"/>
+            <w:shd w:val="clear" w:color="auto" w:fill="auto"/>
+          </w:tcPr>
+          <w:p>
+            <w:pPr>
+              <w:pStyle w:val="ListParagraph"/>
+              <w:spacing w:line="276" w:lineRule="auto"/>
+              <w:ind w:left="0"/>
+              <w:jc w:val="center"/>
+              <w:rPr>
+                <w:rFonts w:ascii="Open Sans" w:hAnsi="Open Sans" w:cs="Open Sans"/>
+                <w:lang w:val="en-US"/>
+              </w:rPr>
+            </w:pPr>
+            <w:r>
+              <w:rPr>
+                <w:rFonts w:ascii="Open Sans" w:hAnsi="Open Sans" w:cs="Open Sans"/>
+                <w:lang w:val="en-US"/>
+              </w:rPr>
+              <w:t>3</w:t>
+            </w:r>
+          </w:p>
+        </w:tc>
+        <w:tc>
+          <w:tcPr>
+            <w:tcW w:w="2770" w:type="dxa"/>
+            <w:shd w:val="clear" w:color="auto" w:fill="auto"/>
+          </w:tcPr>
+          <w:p>
+            <w:pPr>
+              <w:pStyle w:val="ListParagraph"/>
+              <w:spacing w:line="276" w:lineRule="auto"/>
+              <w:ind w:left="0"/>
+              <w:jc w:val="center"/>
+              <w:cnfStyle w:val="000000100000" w:firstRow="0" w:lastRow="0" w:firstColumn="0" w:lastColumn="0" w:oddVBand="0" w:evenVBand="0" w:oddHBand="1" w:evenHBand="0" w:firstRowFirstColumn="0" w:firstRowLastColumn="0" w:lastRowFirstColumn="0" w:lastRowLastColumn="0"/>
+              <w:rPr>
+                <w:rFonts w:ascii="Open Sans" w:hAnsi="Open Sans" w:cs="Open Sans"/>
+                <w:lang w:val="en-US"/>
+              </w:rPr>
+            </w:pPr>
+            <w:r>
+              <w:rPr>
+                <w:rFonts w:ascii="Open Sans" w:hAnsi="Open Sans" w:cs="Open Sans"/>
+                <w:lang w:val="en-US"/>
+              </w:rPr>
+              <w:t>Alamat</w:t>
+            </w:r>
+          </w:p>
+        </w:tc>
+        <w:tc>
+          <w:tcPr>
+            <w:tcW w:w="2919" w:type="dxa"/>
+            <w:shd w:val="clear" w:color="auto" w:fill="auto"/>
+          </w:tcPr>
+          <w:p>
+            <w:pPr>
+              <w:pStyle w:val="ListParagraph"/>
+              <w:spacing w:line="276" w:lineRule="auto"/>
+              <w:ind w:left="0"/>
+              <w:jc w:val="center"/>
+              <w:cnfStyle w:val="000000100000" w:firstRow="0" w:lastRow="0" w:firstColumn="0" w:lastColumn="0" w:oddVBand="0" w:evenVBand="0" w:oddHBand="1" w:evenHBand="0" w:firstRowFirstColumn="0" w:firstRowLastColumn="0" w:lastRowFirstColumn="0" w:lastRowLastColumn="0"/>
+              <w:rPr>
+                <w:rFonts w:ascii="Open Sans" w:hAnsi="Open Sans" w:cs="Open Sans"/>
+                <w:lang w:val="en-US"/>
+              </w:rPr>
+            </w:pPr>
+            <w:r>
+              <w:rPr>
+                <w:rFonts w:ascii="Open Sans" w:hAnsi="Open Sans" w:cs="Open Sans"/>
+                <w:lang w:val="en-US"/>
+              </w:rPr>
+              <w:t>VARCHAR (1</w:t>
+            </w:r>
+            <w:r>
+              <w:rPr>
+                <w:rFonts w:ascii="Open Sans" w:hAnsi="Open Sans" w:cs="Open Sans"/>
+                <w:lang w:val="en-US"/>
+              </w:rPr>
+              <w:t>5</w:t>
+            </w:r>
+            <w:r>
+              <w:rPr>
+                <w:rFonts w:ascii="Open Sans" w:hAnsi="Open Sans" w:cs="Open Sans"/>
+                <w:lang w:val="en-US"/>
+              </w:rPr>
+              <w:t>0)</w:t>
+            </w:r>
+          </w:p>
+        </w:tc>
+        <w:tc>
+          <w:tcPr>
+            <w:tcW w:w="4551" w:type="dxa"/>
+            <w:shd w:val="clear" w:color="auto" w:fill="auto"/>
+          </w:tcPr>
+          <w:p>
+            <w:pPr>
+              <w:pStyle w:val="ListParagraph"/>
+              <w:spacing w:line="276" w:lineRule="auto"/>
+              <w:ind w:left="0"/>
+              <w:cnfStyle w:val="000000100000" w:firstRow="0" w:lastRow="0" w:firstColumn="0" w:lastColumn="0" w:oddVBand="0" w:evenVBand="0" w:oddHBand="1" w:evenHBand="0" w:firstRowFirstColumn="0" w:firstRowLastColumn="0" w:lastRowFirstColumn="0" w:lastRowLastColumn="0"/>
+              <w:rPr>
+                <w:rFonts w:ascii="Open Sans" w:hAnsi="Open Sans" w:cs="Open Sans"/>
+                <w:lang w:val="en-US"/>
+              </w:rPr>
+            </w:pPr>
             <w:r>
               <w:rPr>
                 <w:rFonts w:ascii="Open Sans" w:hAnsi="Open Sans" w:cs="Open Sans"/>
@@ -6512,8 +6595,17 @@
                 <w:rFonts w:ascii="Open Sans" w:hAnsi="Open Sans" w:cs="Open Sans"/>
                 <w:lang w:val="en-US"/>
               </w:rPr>
-              <w:t xml:space="preserve"> nama</w:t>
-            </w:r>
+              <w:t xml:space="preserve"> </w:t>
+            </w:r>
+            <w:proofErr w:type="spellStart"/>
+            <w:r>
+              <w:rPr>
+                <w:rFonts w:ascii="Open Sans" w:hAnsi="Open Sans" w:cs="Open Sans"/>
+                <w:lang w:val="en-US"/>
+              </w:rPr>
+              <w:t>nama</w:t>
+            </w:r>
+            <w:proofErr w:type="spellEnd"/>
           </w:p>
         </w:tc>
       </w:tr>
@@ -7515,168 +7607,18 @@
                 <w:color w:val="000000" w:themeColor="text1"/>
                 <w:lang w:val="en-US"/>
               </w:rPr>
-              <w:t>/Alasan</w:t>
-            </w:r>
-          </w:p>
-        </w:tc>
-      </w:tr>
-      <w:tr>
-        <w:tc>
-          <w:tcPr>
-            <w:tcW w:w="560" w:type="dxa"/>
-          </w:tcPr>
-          <w:p>
-            <w:pPr>
-              <w:pStyle w:val="ListParagraph"/>
-              <w:spacing w:line="276" w:lineRule="auto"/>
-              <w:ind w:left="0"/>
-              <w:jc w:val="center"/>
+              <w:t>/</w:t>
+            </w:r>
+            <w:proofErr w:type="spellStart"/>
+            <w:r>
               <w:rPr>
                 <w:rFonts w:ascii="Open Sans" w:hAnsi="Open Sans" w:cs="Open Sans"/>
                 <w:b/>
                 <w:bCs/>
-                <w:sz w:val="28"/>
-                <w:szCs w:val="28"/>
-                <w:lang w:val="en-US"/>
-              </w:rPr>
-            </w:pPr>
-            <w:r>
-              <w:rPr>
-                <w:rFonts w:ascii="Open Sans" w:hAnsi="Open Sans" w:cs="Open Sans"/>
-                <w:b/>
-                <w:bCs/>
-                <w:sz w:val="28"/>
-                <w:szCs w:val="28"/>
-                <w:lang w:val="en-US"/>
-              </w:rPr>
-              <w:t>1</w:t>
-            </w:r>
-          </w:p>
-        </w:tc>
-        <w:tc>
-          <w:tcPr>
-            <w:tcW w:w="2770" w:type="dxa"/>
-          </w:tcPr>
-          <w:p>
-            <w:pPr>
-              <w:pStyle w:val="ListParagraph"/>
-              <w:spacing w:line="276" w:lineRule="auto"/>
-              <w:ind w:left="0"/>
-              <w:jc w:val="center"/>
-              <w:rPr>
-                <w:rFonts w:ascii="Open Sans" w:hAnsi="Open Sans" w:cs="Open Sans"/>
-                <w:b/>
-                <w:bCs/>
-                <w:sz w:val="28"/>
-                <w:szCs w:val="28"/>
-                <w:u w:val="single"/>
-                <w:lang w:val="en-US"/>
-              </w:rPr>
-            </w:pPr>
-            <w:proofErr w:type="spellStart"/>
-            <w:r>
-              <w:rPr>
-                <w:rFonts w:ascii="Open Sans" w:hAnsi="Open Sans" w:cs="Open Sans"/>
-                <w:u w:val="single"/>
-                <w:lang w:val="en-US"/>
-              </w:rPr>
-              <w:t>Tahun</w:t>
-            </w:r>
-            <w:proofErr w:type="spellEnd"/>
-          </w:p>
-        </w:tc>
-        <w:tc>
-          <w:tcPr>
-            <w:tcW w:w="2970" w:type="dxa"/>
-          </w:tcPr>
-          <w:p>
-            <w:pPr>
-              <w:pStyle w:val="ListParagraph"/>
-              <w:spacing w:line="276" w:lineRule="auto"/>
-              <w:ind w:left="0"/>
-              <w:jc w:val="center"/>
-              <w:rPr>
-                <w:rFonts w:ascii="Open Sans" w:hAnsi="Open Sans" w:cs="Open Sans"/>
-                <w:lang w:val="en-US"/>
-              </w:rPr>
-            </w:pPr>
-            <w:r>
-              <w:rPr>
-                <w:rFonts w:ascii="Open Sans" w:hAnsi="Open Sans" w:cs="Open Sans"/>
-                <w:lang w:val="en-US"/>
-              </w:rPr>
-              <w:t>YEAR</w:t>
-            </w:r>
-          </w:p>
-        </w:tc>
-        <w:tc>
-          <w:tcPr>
-            <w:tcW w:w="4500" w:type="dxa"/>
-          </w:tcPr>
-          <w:p>
-            <w:pPr>
-              <w:pStyle w:val="ListParagraph"/>
-              <w:spacing w:line="276" w:lineRule="auto"/>
-              <w:ind w:left="0"/>
-              <w:rPr>
-                <w:rFonts w:ascii="Open Sans" w:hAnsi="Open Sans" w:cs="Open Sans"/>
-                <w:lang w:val="en-US"/>
-              </w:rPr>
-            </w:pPr>
-            <w:proofErr w:type="spellStart"/>
-            <w:r>
-              <w:rPr>
-                <w:rFonts w:ascii="Open Sans" w:hAnsi="Open Sans" w:cs="Open Sans"/>
-              </w:rPr>
-              <w:t>E</w:t>
-            </w:r>
-            <w:r>
-              <w:rPr>
-                <w:rFonts w:ascii="Open Sans" w:hAnsi="Open Sans" w:cs="Open Sans"/>
-              </w:rPr>
-              <w:t>fisien</w:t>
-            </w:r>
-            <w:proofErr w:type="spellEnd"/>
-            <w:r>
-              <w:rPr>
-                <w:rFonts w:ascii="Open Sans" w:hAnsi="Open Sans" w:cs="Open Sans"/>
-              </w:rPr>
-              <w:t xml:space="preserve"> </w:t>
-            </w:r>
-            <w:proofErr w:type="spellStart"/>
-            <w:r>
-              <w:rPr>
-                <w:rFonts w:ascii="Open Sans" w:hAnsi="Open Sans" w:cs="Open Sans"/>
-              </w:rPr>
-              <w:t>untuk</w:t>
-            </w:r>
-            <w:proofErr w:type="spellEnd"/>
-            <w:r>
-              <w:rPr>
-                <w:rFonts w:ascii="Open Sans" w:hAnsi="Open Sans" w:cs="Open Sans"/>
-              </w:rPr>
-              <w:t xml:space="preserve"> </w:t>
-            </w:r>
-            <w:proofErr w:type="spellStart"/>
-            <w:r>
-              <w:rPr>
-                <w:rFonts w:ascii="Open Sans" w:hAnsi="Open Sans" w:cs="Open Sans"/>
-              </w:rPr>
-              <w:t>menyimpan</w:t>
-            </w:r>
-            <w:proofErr w:type="spellEnd"/>
-            <w:r>
-              <w:rPr>
-                <w:rFonts w:ascii="Open Sans" w:hAnsi="Open Sans" w:cs="Open Sans"/>
-              </w:rPr>
-              <w:t xml:space="preserve"> </w:t>
-            </w:r>
-            <w:proofErr w:type="spellStart"/>
-            <w:r>
-              <w:rPr>
-                <w:rFonts w:ascii="Open Sans" w:hAnsi="Open Sans" w:cs="Open Sans"/>
-              </w:rPr>
-              <w:t>tahun</w:t>
+                <w:color w:val="000000" w:themeColor="text1"/>
+                <w:lang w:val="en-US"/>
+              </w:rPr>
+              <w:t>Alasan</w:t>
             </w:r>
             <w:proofErr w:type="spellEnd"/>
           </w:p>
@@ -7711,7 +7653,7 @@
                 <w:szCs w:val="28"/>
                 <w:lang w:val="en-US"/>
               </w:rPr>
-              <w:t>2</w:t>
+              <w:t>1</w:t>
             </w:r>
           </w:p>
         </w:tc>
@@ -7731,54 +7673,7 @@
                 <w:bCs/>
                 <w:sz w:val="28"/>
                 <w:szCs w:val="28"/>
-                <w:lang w:val="en-US"/>
-              </w:rPr>
-            </w:pPr>
-            <w:r>
-              <w:rPr>
-                <w:rFonts w:ascii="Open Sans" w:hAnsi="Open Sans" w:cs="Open Sans"/>
                 <w:u w:val="single"/>
-                <w:lang w:val="en-US"/>
-              </w:rPr>
-              <w:t>Bulan</w:t>
-            </w:r>
-          </w:p>
-        </w:tc>
-        <w:tc>
-          <w:tcPr>
-            <w:tcW w:w="2970" w:type="dxa"/>
-          </w:tcPr>
-          <w:p>
-            <w:pPr>
-              <w:pStyle w:val="ListParagraph"/>
-              <w:spacing w:line="276" w:lineRule="auto"/>
-              <w:ind w:left="0"/>
-              <w:jc w:val="center"/>
-              <w:rPr>
-                <w:rFonts w:ascii="Open Sans" w:hAnsi="Open Sans" w:cs="Open Sans"/>
-                <w:lang w:val="en-US"/>
-              </w:rPr>
-            </w:pPr>
-            <w:r>
-              <w:rPr>
-                <w:rFonts w:ascii="Open Sans" w:hAnsi="Open Sans" w:cs="Open Sans"/>
-                <w:lang w:val="en-US"/>
-              </w:rPr>
-              <w:t>TINYINT</w:t>
-            </w:r>
-          </w:p>
-        </w:tc>
-        <w:tc>
-          <w:tcPr>
-            <w:tcW w:w="4500" w:type="dxa"/>
-          </w:tcPr>
-          <w:p>
-            <w:pPr>
-              <w:pStyle w:val="ListParagraph"/>
-              <w:spacing w:line="276" w:lineRule="auto"/>
-              <w:ind w:left="0"/>
-              <w:rPr>
-                <w:rFonts w:ascii="Open Sans" w:hAnsi="Open Sans" w:cs="Open Sans"/>
                 <w:lang w:val="en-US"/>
               </w:rPr>
             </w:pPr>
@@ -7786,121 +7681,10 @@
             <w:r>
               <w:rPr>
                 <w:rFonts w:ascii="Open Sans" w:hAnsi="Open Sans" w:cs="Open Sans"/>
-              </w:rPr>
-              <w:t>Menyimpan</w:t>
-            </w:r>
-            <w:proofErr w:type="spellEnd"/>
-            <w:r>
-              <w:rPr>
-                <w:rFonts w:ascii="Open Sans" w:hAnsi="Open Sans" w:cs="Open Sans"/>
-              </w:rPr>
-              <w:t xml:space="preserve"> </w:t>
-            </w:r>
-            <w:proofErr w:type="spellStart"/>
-            <w:r>
-              <w:rPr>
-                <w:rFonts w:ascii="Open Sans" w:hAnsi="Open Sans" w:cs="Open Sans"/>
-              </w:rPr>
-              <w:t>bulan</w:t>
-            </w:r>
-            <w:proofErr w:type="spellEnd"/>
-            <w:r>
-              <w:rPr>
-                <w:rFonts w:ascii="Open Sans" w:hAnsi="Open Sans" w:cs="Open Sans"/>
-              </w:rPr>
-              <w:t xml:space="preserve"> (1–12), </w:t>
-            </w:r>
-            <w:proofErr w:type="spellStart"/>
-            <w:r>
-              <w:rPr>
-                <w:rFonts w:ascii="Open Sans" w:hAnsi="Open Sans" w:cs="Open Sans"/>
-              </w:rPr>
-              <w:t>cukup</w:t>
-            </w:r>
-            <w:proofErr w:type="spellEnd"/>
-            <w:r>
-              <w:rPr>
-                <w:rFonts w:ascii="Open Sans" w:hAnsi="Open Sans" w:cs="Open Sans"/>
-              </w:rPr>
-              <w:t xml:space="preserve"> </w:t>
-            </w:r>
-            <w:proofErr w:type="spellStart"/>
-            <w:r>
-              <w:rPr>
-                <w:rFonts w:ascii="Open Sans" w:hAnsi="Open Sans" w:cs="Open Sans"/>
-              </w:rPr>
-              <w:t>pakai</w:t>
-            </w:r>
-            <w:proofErr w:type="spellEnd"/>
-            <w:r>
-              <w:rPr>
-                <w:rFonts w:ascii="Open Sans" w:hAnsi="Open Sans" w:cs="Open Sans"/>
-              </w:rPr>
-              <w:t xml:space="preserve"> TINYINT</w:t>
-            </w:r>
-          </w:p>
-        </w:tc>
-      </w:tr>
-      <w:tr>
-        <w:tc>
-          <w:tcPr>
-            <w:tcW w:w="560" w:type="dxa"/>
-          </w:tcPr>
-          <w:p>
-            <w:pPr>
-              <w:pStyle w:val="ListParagraph"/>
-              <w:spacing w:line="276" w:lineRule="auto"/>
-              <w:ind w:left="0"/>
-              <w:jc w:val="center"/>
-              <w:rPr>
-                <w:rFonts w:ascii="Open Sans" w:hAnsi="Open Sans" w:cs="Open Sans"/>
-                <w:b/>
-                <w:bCs/>
-                <w:sz w:val="28"/>
-                <w:szCs w:val="28"/>
-                <w:lang w:val="en-US"/>
-              </w:rPr>
-            </w:pPr>
-            <w:r>
-              <w:rPr>
-                <w:rFonts w:ascii="Open Sans" w:hAnsi="Open Sans" w:cs="Open Sans"/>
-                <w:b/>
-                <w:bCs/>
-                <w:sz w:val="28"/>
-                <w:szCs w:val="28"/>
-                <w:lang w:val="en-US"/>
-              </w:rPr>
-              <w:t>3</w:t>
-            </w:r>
-          </w:p>
-        </w:tc>
-        <w:tc>
-          <w:tcPr>
-            <w:tcW w:w="2770" w:type="dxa"/>
-          </w:tcPr>
-          <w:p>
-            <w:pPr>
-              <w:pStyle w:val="ListParagraph"/>
-              <w:spacing w:line="276" w:lineRule="auto"/>
-              <w:ind w:left="0"/>
-              <w:jc w:val="center"/>
-              <w:rPr>
-                <w:rFonts w:ascii="Open Sans" w:hAnsi="Open Sans" w:cs="Open Sans"/>
-                <w:b/>
-                <w:bCs/>
-                <w:sz w:val="28"/>
-                <w:szCs w:val="28"/>
-                <w:lang w:val="en-US"/>
-              </w:rPr>
-            </w:pPr>
-            <w:proofErr w:type="spellStart"/>
-            <w:r>
-              <w:rPr>
-                <w:rFonts w:ascii="Open Sans" w:hAnsi="Open Sans" w:cs="Open Sans"/>
                 <w:u w:val="single"/>
                 <w:lang w:val="en-US"/>
               </w:rPr>
-              <w:t>NoKontrol</w:t>
+              <w:t>Tahun</w:t>
             </w:r>
             <w:proofErr w:type="spellEnd"/>
           </w:p>
@@ -7925,7 +7709,7 @@
                 <w:rFonts w:ascii="Open Sans" w:hAnsi="Open Sans" w:cs="Open Sans"/>
                 <w:lang w:val="en-US"/>
               </w:rPr>
-              <w:t>CHAR (12)</w:t>
+              <w:t>YEAR</w:t>
             </w:r>
           </w:p>
         </w:tc>
@@ -7943,26 +7727,23 @@
                 <w:lang w:val="en-US"/>
               </w:rPr>
             </w:pPr>
-            <w:r>
-              <w:rPr>
-                <w:rFonts w:ascii="Open Sans" w:hAnsi="Open Sans" w:cs="Open Sans"/>
-                <w:lang w:val="en-US"/>
-              </w:rPr>
-              <w:t xml:space="preserve">Foreign key </w:t>
-            </w:r>
             <w:proofErr w:type="spellStart"/>
             <w:r>
               <w:rPr>
                 <w:rFonts w:ascii="Open Sans" w:hAnsi="Open Sans" w:cs="Open Sans"/>
-                <w:lang w:val="en-US"/>
-              </w:rPr>
-              <w:t>dari</w:t>
+              </w:rPr>
+              <w:t>E</w:t>
+            </w:r>
+            <w:r>
+              <w:rPr>
+                <w:rFonts w:ascii="Open Sans" w:hAnsi="Open Sans" w:cs="Open Sans"/>
+              </w:rPr>
+              <w:t>fisien</w:t>
             </w:r>
             <w:proofErr w:type="spellEnd"/>
             <w:r>
               <w:rPr>
                 <w:rFonts w:ascii="Open Sans" w:hAnsi="Open Sans" w:cs="Open Sans"/>
-                <w:lang w:val="en-US"/>
               </w:rPr>
               <w:t xml:space="preserve"> </w:t>
             </w:r>
@@ -7970,9 +7751,36 @@
             <w:r>
               <w:rPr>
                 <w:rFonts w:ascii="Open Sans" w:hAnsi="Open Sans" w:cs="Open Sans"/>
-                <w:lang w:val="en-US"/>
-              </w:rPr>
-              <w:t>PELANGGAN.NoKontrol</w:t>
+              </w:rPr>
+              <w:t>untuk</w:t>
+            </w:r>
+            <w:proofErr w:type="spellEnd"/>
+            <w:r>
+              <w:rPr>
+                <w:rFonts w:ascii="Open Sans" w:hAnsi="Open Sans" w:cs="Open Sans"/>
+              </w:rPr>
+              <w:t xml:space="preserve"> </w:t>
+            </w:r>
+            <w:proofErr w:type="spellStart"/>
+            <w:r>
+              <w:rPr>
+                <w:rFonts w:ascii="Open Sans" w:hAnsi="Open Sans" w:cs="Open Sans"/>
+              </w:rPr>
+              <w:t>menyimpan</w:t>
+            </w:r>
+            <w:proofErr w:type="spellEnd"/>
+            <w:r>
+              <w:rPr>
+                <w:rFonts w:ascii="Open Sans" w:hAnsi="Open Sans" w:cs="Open Sans"/>
+              </w:rPr>
+              <w:t xml:space="preserve"> </w:t>
+            </w:r>
+            <w:proofErr w:type="spellStart"/>
+            <w:r>
+              <w:rPr>
+                <w:rFonts w:ascii="Open Sans" w:hAnsi="Open Sans" w:cs="Open Sans"/>
+              </w:rPr>
+              <w:t>tahun</w:t>
             </w:r>
             <w:proofErr w:type="spellEnd"/>
           </w:p>
@@ -8007,7 +7815,7 @@
                 <w:szCs w:val="28"/>
                 <w:lang w:val="en-US"/>
               </w:rPr>
-              <w:t>4</w:t>
+              <w:t>2</w:t>
             </w:r>
           </w:p>
         </w:tc>
@@ -8030,13 +7838,173 @@
                 <w:lang w:val="en-US"/>
               </w:rPr>
             </w:pPr>
+            <w:r>
+              <w:rPr>
+                <w:rFonts w:ascii="Open Sans" w:hAnsi="Open Sans" w:cs="Open Sans"/>
+                <w:u w:val="single"/>
+                <w:lang w:val="en-US"/>
+              </w:rPr>
+              <w:t>Bulan</w:t>
+            </w:r>
+          </w:p>
+        </w:tc>
+        <w:tc>
+          <w:tcPr>
+            <w:tcW w:w="2970" w:type="dxa"/>
+          </w:tcPr>
+          <w:p>
+            <w:pPr>
+              <w:pStyle w:val="ListParagraph"/>
+              <w:spacing w:line="276" w:lineRule="auto"/>
+              <w:ind w:left="0"/>
+              <w:jc w:val="center"/>
+              <w:rPr>
+                <w:rFonts w:ascii="Open Sans" w:hAnsi="Open Sans" w:cs="Open Sans"/>
+                <w:lang w:val="en-US"/>
+              </w:rPr>
+            </w:pPr>
+            <w:r>
+              <w:rPr>
+                <w:rFonts w:ascii="Open Sans" w:hAnsi="Open Sans" w:cs="Open Sans"/>
+                <w:lang w:val="en-US"/>
+              </w:rPr>
+              <w:t>TINYINT</w:t>
+            </w:r>
+          </w:p>
+        </w:tc>
+        <w:tc>
+          <w:tcPr>
+            <w:tcW w:w="4500" w:type="dxa"/>
+          </w:tcPr>
+          <w:p>
+            <w:pPr>
+              <w:pStyle w:val="ListParagraph"/>
+              <w:spacing w:line="276" w:lineRule="auto"/>
+              <w:ind w:left="0"/>
+              <w:rPr>
+                <w:rFonts w:ascii="Open Sans" w:hAnsi="Open Sans" w:cs="Open Sans"/>
+                <w:lang w:val="en-US"/>
+              </w:rPr>
+            </w:pPr>
             <w:proofErr w:type="spellStart"/>
             <w:r>
               <w:rPr>
                 <w:rFonts w:ascii="Open Sans" w:hAnsi="Open Sans" w:cs="Open Sans"/>
-                <w:lang w:val="en-US"/>
-              </w:rPr>
-              <w:t>MeterAwal</w:t>
+              </w:rPr>
+              <w:t>Menyimpan</w:t>
+            </w:r>
+            <w:proofErr w:type="spellEnd"/>
+            <w:r>
+              <w:rPr>
+                <w:rFonts w:ascii="Open Sans" w:hAnsi="Open Sans" w:cs="Open Sans"/>
+              </w:rPr>
+              <w:t xml:space="preserve"> </w:t>
+            </w:r>
+            <w:proofErr w:type="spellStart"/>
+            <w:r>
+              <w:rPr>
+                <w:rFonts w:ascii="Open Sans" w:hAnsi="Open Sans" w:cs="Open Sans"/>
+              </w:rPr>
+              <w:t>bulan</w:t>
+            </w:r>
+            <w:proofErr w:type="spellEnd"/>
+            <w:r>
+              <w:rPr>
+                <w:rFonts w:ascii="Open Sans" w:hAnsi="Open Sans" w:cs="Open Sans"/>
+              </w:rPr>
+              <w:t xml:space="preserve"> (1–12), </w:t>
+            </w:r>
+            <w:proofErr w:type="spellStart"/>
+            <w:r>
+              <w:rPr>
+                <w:rFonts w:ascii="Open Sans" w:hAnsi="Open Sans" w:cs="Open Sans"/>
+              </w:rPr>
+              <w:t>cukup</w:t>
+            </w:r>
+            <w:proofErr w:type="spellEnd"/>
+            <w:r>
+              <w:rPr>
+                <w:rFonts w:ascii="Open Sans" w:hAnsi="Open Sans" w:cs="Open Sans"/>
+              </w:rPr>
+              <w:t xml:space="preserve"> </w:t>
+            </w:r>
+            <w:proofErr w:type="spellStart"/>
+            <w:r>
+              <w:rPr>
+                <w:rFonts w:ascii="Open Sans" w:hAnsi="Open Sans" w:cs="Open Sans"/>
+              </w:rPr>
+              <w:t>pakai</w:t>
+            </w:r>
+            <w:proofErr w:type="spellEnd"/>
+            <w:r>
+              <w:rPr>
+                <w:rFonts w:ascii="Open Sans" w:hAnsi="Open Sans" w:cs="Open Sans"/>
+              </w:rPr>
+              <w:t xml:space="preserve"> TINYINT</w:t>
+            </w:r>
+          </w:p>
+        </w:tc>
+      </w:tr>
+      <w:tr>
+        <w:tc>
+          <w:tcPr>
+            <w:tcW w:w="560" w:type="dxa"/>
+          </w:tcPr>
+          <w:p>
+            <w:pPr>
+              <w:pStyle w:val="ListParagraph"/>
+              <w:spacing w:line="276" w:lineRule="auto"/>
+              <w:ind w:left="0"/>
+              <w:jc w:val="center"/>
+              <w:rPr>
+                <w:rFonts w:ascii="Open Sans" w:hAnsi="Open Sans" w:cs="Open Sans"/>
+                <w:b/>
+                <w:bCs/>
+                <w:sz w:val="28"/>
+                <w:szCs w:val="28"/>
+                <w:lang w:val="en-US"/>
+              </w:rPr>
+            </w:pPr>
+            <w:r>
+              <w:rPr>
+                <w:rFonts w:ascii="Open Sans" w:hAnsi="Open Sans" w:cs="Open Sans"/>
+                <w:b/>
+                <w:bCs/>
+                <w:sz w:val="28"/>
+                <w:szCs w:val="28"/>
+                <w:lang w:val="en-US"/>
+              </w:rPr>
+              <w:t>3</w:t>
+            </w:r>
+          </w:p>
+        </w:tc>
+        <w:tc>
+          <w:tcPr>
+            <w:tcW w:w="2770" w:type="dxa"/>
+          </w:tcPr>
+          <w:p>
+            <w:pPr>
+              <w:pStyle w:val="ListParagraph"/>
+              <w:spacing w:line="276" w:lineRule="auto"/>
+              <w:ind w:left="0"/>
+              <w:jc w:val="center"/>
+              <w:rPr>
+                <w:rFonts w:ascii="Open Sans" w:hAnsi="Open Sans" w:cs="Open Sans"/>
+                <w:b/>
+                <w:bCs/>
+                <w:sz w:val="28"/>
+                <w:szCs w:val="28"/>
+                <w:lang w:val="en-US"/>
+              </w:rPr>
+            </w:pPr>
+            <w:proofErr w:type="spellStart"/>
+            <w:r>
+              <w:rPr>
+                <w:rFonts w:ascii="Open Sans" w:hAnsi="Open Sans" w:cs="Open Sans"/>
+                <w:u w:val="single"/>
+                <w:lang w:val="en-US"/>
+              </w:rPr>
+              <w:t>NoKontrol</w:t>
             </w:r>
             <w:proofErr w:type="spellEnd"/>
           </w:p>
@@ -8061,14 +8029,7 @@
                 <w:rFonts w:ascii="Open Sans" w:hAnsi="Open Sans" w:cs="Open Sans"/>
                 <w:lang w:val="en-US"/>
               </w:rPr>
-              <w:t>INT</w:t>
-            </w:r>
-            <w:r>
-              <w:rPr>
-                <w:rFonts w:ascii="Open Sans" w:hAnsi="Open Sans" w:cs="Open Sans"/>
-                <w:lang w:val="en-US"/>
-              </w:rPr>
-              <w:t xml:space="preserve"> UNSIGNED</w:t>
+              <w:t>CHAR (12)</w:t>
             </w:r>
           </w:p>
         </w:tc>
@@ -8086,13 +8047,20 @@
                 <w:lang w:val="en-US"/>
               </w:rPr>
             </w:pPr>
+            <w:r>
+              <w:rPr>
+                <w:rFonts w:ascii="Open Sans" w:hAnsi="Open Sans" w:cs="Open Sans"/>
+                <w:lang w:val="en-US"/>
+              </w:rPr>
+              <w:t xml:space="preserve">Foreign key </w:t>
+            </w:r>
             <w:proofErr w:type="spellStart"/>
             <w:r>
               <w:rPr>
                 <w:rFonts w:ascii="Open Sans" w:hAnsi="Open Sans" w:cs="Open Sans"/>
                 <w:lang w:val="en-US"/>
               </w:rPr>
-              <w:t>Menggunakan</w:t>
+              <w:t>dari</w:t>
             </w:r>
             <w:proofErr w:type="spellEnd"/>
             <w:r>
@@ -8100,7 +8068,7 @@
                 <w:rFonts w:ascii="Open Sans" w:hAnsi="Open Sans" w:cs="Open Sans"/>
                 <w:lang w:val="en-US"/>
               </w:rPr>
-              <w:t xml:space="preserve"> INT UNSIGNED agar </w:t>
+              <w:t xml:space="preserve"> </w:t>
             </w:r>
             <w:proofErr w:type="spellStart"/>
             <w:r>
@@ -8108,23 +8076,7 @@
                 <w:rFonts w:ascii="Open Sans" w:hAnsi="Open Sans" w:cs="Open Sans"/>
                 <w:lang w:val="en-US"/>
               </w:rPr>
-              <w:t>nilainya</w:t>
-            </w:r>
-            <w:proofErr w:type="spellEnd"/>
-            <w:r>
-              <w:rPr>
-                <w:rFonts w:ascii="Open Sans" w:hAnsi="Open Sans" w:cs="Open Sans"/>
-                <w:lang w:val="en-US"/>
-              </w:rPr>
-              <w:t xml:space="preserve"> </w:t>
-            </w:r>
-            <w:proofErr w:type="spellStart"/>
-            <w:r>
-              <w:rPr>
-                <w:rFonts w:ascii="Open Sans" w:hAnsi="Open Sans" w:cs="Open Sans"/>
-                <w:lang w:val="en-US"/>
-              </w:rPr>
-              <w:t>positif</w:t>
+              <w:t>PELANGGAN.NoKontrol</w:t>
             </w:r>
             <w:proofErr w:type="spellEnd"/>
           </w:p>
@@ -8159,7 +8111,7 @@
                 <w:szCs w:val="28"/>
                 <w:lang w:val="en-US"/>
               </w:rPr>
-              <w:t>5</w:t>
+              <w:t>4</w:t>
             </w:r>
           </w:p>
         </w:tc>
@@ -8188,7 +8140,7 @@
                 <w:rFonts w:ascii="Open Sans" w:hAnsi="Open Sans" w:cs="Open Sans"/>
                 <w:lang w:val="en-US"/>
               </w:rPr>
-              <w:t>MeterAkhir</w:t>
+              <w:t>MeterAwal</w:t>
             </w:r>
             <w:proofErr w:type="spellEnd"/>
           </w:p>
@@ -8220,14 +8172,7 @@
                 <w:rFonts w:ascii="Open Sans" w:hAnsi="Open Sans" w:cs="Open Sans"/>
                 <w:lang w:val="en-US"/>
               </w:rPr>
-              <w:t xml:space="preserve"> </w:t>
-            </w:r>
-            <w:r>
-              <w:rPr>
-                <w:rFonts w:ascii="Open Sans" w:hAnsi="Open Sans" w:cs="Open Sans"/>
-                <w:lang w:val="en-US"/>
-              </w:rPr>
-              <w:t>UNSIGNED</w:t>
+              <w:t xml:space="preserve"> UNSIGNED</w:t>
             </w:r>
           </w:p>
         </w:tc>
@@ -8240,19 +8185,52 @@
               <w:pStyle w:val="ListParagraph"/>
               <w:spacing w:line="276" w:lineRule="auto"/>
               <w:ind w:left="0"/>
-              <w:jc w:val="center"/>
               <w:rPr>
                 <w:rFonts w:ascii="Open Sans" w:hAnsi="Open Sans" w:cs="Open Sans"/>
                 <w:lang w:val="en-US"/>
               </w:rPr>
             </w:pPr>
-            <w:r>
-              <w:rPr>
-                <w:rFonts w:ascii="Open Sans" w:hAnsi="Open Sans" w:cs="Open Sans"/>
-                <w:lang w:val="en-US"/>
-              </w:rPr>
-              <w:t>-||-</w:t>
-            </w:r>
+            <w:proofErr w:type="spellStart"/>
+            <w:r>
+              <w:rPr>
+                <w:rFonts w:ascii="Open Sans" w:hAnsi="Open Sans" w:cs="Open Sans"/>
+                <w:lang w:val="en-US"/>
+              </w:rPr>
+              <w:t>Menggunakan</w:t>
+            </w:r>
+            <w:proofErr w:type="spellEnd"/>
+            <w:r>
+              <w:rPr>
+                <w:rFonts w:ascii="Open Sans" w:hAnsi="Open Sans" w:cs="Open Sans"/>
+                <w:lang w:val="en-US"/>
+              </w:rPr>
+              <w:t xml:space="preserve"> INT UNSIGNED agar </w:t>
+            </w:r>
+            <w:proofErr w:type="spellStart"/>
+            <w:r>
+              <w:rPr>
+                <w:rFonts w:ascii="Open Sans" w:hAnsi="Open Sans" w:cs="Open Sans"/>
+                <w:lang w:val="en-US"/>
+              </w:rPr>
+              <w:t>nilainya</w:t>
+            </w:r>
+            <w:proofErr w:type="spellEnd"/>
+            <w:r>
+              <w:rPr>
+                <w:rFonts w:ascii="Open Sans" w:hAnsi="Open Sans" w:cs="Open Sans"/>
+                <w:lang w:val="en-US"/>
+              </w:rPr>
+              <w:t xml:space="preserve"> </w:t>
+            </w:r>
+            <w:proofErr w:type="spellStart"/>
+            <w:r>
+              <w:rPr>
+                <w:rFonts w:ascii="Open Sans" w:hAnsi="Open Sans" w:cs="Open Sans"/>
+                <w:lang w:val="en-US"/>
+              </w:rPr>
+              <w:t>positif</w:t>
+            </w:r>
+            <w:proofErr w:type="spellEnd"/>
           </w:p>
         </w:tc>
       </w:tr>
@@ -8285,7 +8263,7 @@
                 <w:szCs w:val="28"/>
                 <w:lang w:val="en-US"/>
               </w:rPr>
-              <w:t>6</w:t>
+              <w:t>5</w:t>
             </w:r>
           </w:p>
         </w:tc>
@@ -8301,6 +8279,10 @@
               <w:jc w:val="center"/>
               <w:rPr>
                 <w:rFonts w:ascii="Open Sans" w:hAnsi="Open Sans" w:cs="Open Sans"/>
+                <w:b/>
+                <w:bCs/>
+                <w:sz w:val="28"/>
+                <w:szCs w:val="28"/>
                 <w:lang w:val="en-US"/>
               </w:rPr>
             </w:pPr>
@@ -8310,7 +8292,7 @@
                 <w:rFonts w:ascii="Open Sans" w:hAnsi="Open Sans" w:cs="Open Sans"/>
                 <w:lang w:val="en-US"/>
               </w:rPr>
-              <w:t>JumlahPakai</w:t>
+              <w:t>MeterAkhir</w:t>
             </w:r>
             <w:proofErr w:type="spellEnd"/>
           </w:p>
@@ -8342,14 +8324,122 @@
                 <w:rFonts w:ascii="Open Sans" w:hAnsi="Open Sans" w:cs="Open Sans"/>
                 <w:lang w:val="en-US"/>
               </w:rPr>
-              <w:t xml:space="preserve"> </w:t>
-            </w:r>
-            <w:r>
-              <w:rPr>
-                <w:rFonts w:ascii="Open Sans" w:hAnsi="Open Sans" w:cs="Open Sans"/>
-                <w:lang w:val="en-US"/>
-              </w:rPr>
-              <w:t>UNSIGNED</w:t>
+              <w:t xml:space="preserve"> UNSIGNED</w:t>
+            </w:r>
+          </w:p>
+        </w:tc>
+        <w:tc>
+          <w:tcPr>
+            <w:tcW w:w="4500" w:type="dxa"/>
+          </w:tcPr>
+          <w:p>
+            <w:pPr>
+              <w:pStyle w:val="ListParagraph"/>
+              <w:spacing w:line="276" w:lineRule="auto"/>
+              <w:ind w:left="0"/>
+              <w:jc w:val="center"/>
+              <w:rPr>
+                <w:rFonts w:ascii="Open Sans" w:hAnsi="Open Sans" w:cs="Open Sans"/>
+                <w:lang w:val="en-US"/>
+              </w:rPr>
+            </w:pPr>
+            <w:r>
+              <w:rPr>
+                <w:rFonts w:ascii="Open Sans" w:hAnsi="Open Sans" w:cs="Open Sans"/>
+                <w:lang w:val="en-US"/>
+              </w:rPr>
+              <w:t>-||-</w:t>
+            </w:r>
+          </w:p>
+        </w:tc>
+      </w:tr>
+      <w:tr>
+        <w:tc>
+          <w:tcPr>
+            <w:tcW w:w="560" w:type="dxa"/>
+          </w:tcPr>
+          <w:p>
+            <w:pPr>
+              <w:pStyle w:val="ListParagraph"/>
+              <w:spacing w:line="276" w:lineRule="auto"/>
+              <w:ind w:left="0"/>
+              <w:jc w:val="center"/>
+              <w:rPr>
+                <w:rFonts w:ascii="Open Sans" w:hAnsi="Open Sans" w:cs="Open Sans"/>
+                <w:b/>
+                <w:bCs/>
+                <w:sz w:val="28"/>
+                <w:szCs w:val="28"/>
+                <w:lang w:val="en-US"/>
+              </w:rPr>
+            </w:pPr>
+            <w:r>
+              <w:rPr>
+                <w:rFonts w:ascii="Open Sans" w:hAnsi="Open Sans" w:cs="Open Sans"/>
+                <w:b/>
+                <w:bCs/>
+                <w:sz w:val="28"/>
+                <w:szCs w:val="28"/>
+                <w:lang w:val="en-US"/>
+              </w:rPr>
+              <w:t>6</w:t>
+            </w:r>
+          </w:p>
+        </w:tc>
+        <w:tc>
+          <w:tcPr>
+            <w:tcW w:w="2770" w:type="dxa"/>
+          </w:tcPr>
+          <w:p>
+            <w:pPr>
+              <w:pStyle w:val="ListParagraph"/>
+              <w:spacing w:line="276" w:lineRule="auto"/>
+              <w:ind w:left="0"/>
+              <w:jc w:val="center"/>
+              <w:rPr>
+                <w:rFonts w:ascii="Open Sans" w:hAnsi="Open Sans" w:cs="Open Sans"/>
+                <w:lang w:val="en-US"/>
+              </w:rPr>
+            </w:pPr>
+            <w:proofErr w:type="spellStart"/>
+            <w:r>
+              <w:rPr>
+                <w:rFonts w:ascii="Open Sans" w:hAnsi="Open Sans" w:cs="Open Sans"/>
+                <w:lang w:val="en-US"/>
+              </w:rPr>
+              <w:t>JumlahPakai</w:t>
+            </w:r>
+            <w:proofErr w:type="spellEnd"/>
+          </w:p>
+        </w:tc>
+        <w:tc>
+          <w:tcPr>
+            <w:tcW w:w="2970" w:type="dxa"/>
+          </w:tcPr>
+          <w:p>
+            <w:pPr>
+              <w:pStyle w:val="ListParagraph"/>
+              <w:spacing w:line="276" w:lineRule="auto"/>
+              <w:ind w:left="0"/>
+              <w:jc w:val="center"/>
+              <w:rPr>
+                <w:rFonts w:ascii="Open Sans" w:hAnsi="Open Sans" w:cs="Open Sans"/>
+                <w:lang w:val="en-US"/>
+              </w:rPr>
+            </w:pPr>
+            <w:r>
+              <w:rPr>
+                <w:rFonts w:ascii="Open Sans" w:hAnsi="Open Sans" w:cs="Open Sans"/>
+                <w:lang w:val="en-US"/>
+              </w:rPr>
+              <w:t>INT</w:t>
+            </w:r>
+            <w:r>
+              <w:rPr>
+                <w:rFonts w:ascii="Open Sans" w:hAnsi="Open Sans" w:cs="Open Sans"/>
+                <w:lang w:val="en-US"/>
+              </w:rPr>
+              <w:t xml:space="preserve"> UNSIGNED</w:t>
             </w:r>
           </w:p>
         </w:tc>
@@ -8559,14 +8649,7 @@
                 <w:rFonts w:ascii="Open Sans" w:hAnsi="Open Sans" w:cs="Open Sans"/>
                 <w:lang w:val="en-US"/>
               </w:rPr>
-              <w:t>DECIMAL</w:t>
-            </w:r>
-            <w:r>
-              <w:rPr>
-                <w:rFonts w:ascii="Open Sans" w:hAnsi="Open Sans" w:cs="Open Sans"/>
-                <w:lang w:val="en-US"/>
-              </w:rPr>
-              <w:t xml:space="preserve"> (12,2)</w:t>
+              <w:t>DECIMAL (12,2)</w:t>
             </w:r>
           </w:p>
         </w:tc>
@@ -8833,144 +8916,18 @@
                 <w:color w:val="000000" w:themeColor="text1"/>
                 <w:lang w:val="en-US"/>
               </w:rPr>
-              <w:t>/Alasan</w:t>
-            </w:r>
-          </w:p>
-        </w:tc>
-      </w:tr>
-      <w:tr>
-        <w:tc>
-          <w:tcPr>
-            <w:tcW w:w="560" w:type="dxa"/>
-          </w:tcPr>
-          <w:p>
-            <w:pPr>
-              <w:pStyle w:val="ListParagraph"/>
-              <w:spacing w:line="276" w:lineRule="auto"/>
-              <w:ind w:left="0"/>
-              <w:jc w:val="center"/>
+              <w:t>/</w:t>
+            </w:r>
+            <w:proofErr w:type="spellStart"/>
+            <w:r>
               <w:rPr>
                 <w:rFonts w:ascii="Open Sans" w:hAnsi="Open Sans" w:cs="Open Sans"/>
                 <w:b/>
                 <w:bCs/>
-                <w:sz w:val="28"/>
-                <w:szCs w:val="28"/>
-                <w:lang w:val="en-US"/>
-              </w:rPr>
-            </w:pPr>
-          </w:p>
-        </w:tc>
-        <w:tc>
-          <w:tcPr>
-            <w:tcW w:w="2772" w:type="dxa"/>
-          </w:tcPr>
-          <w:p>
-            <w:pPr>
-              <w:pStyle w:val="ListParagraph"/>
-              <w:spacing w:line="276" w:lineRule="auto"/>
-              <w:ind w:left="0"/>
-              <w:jc w:val="center"/>
-              <w:rPr>
-                <w:rFonts w:ascii="Open Sans" w:hAnsi="Open Sans" w:cs="Open Sans"/>
-                <w:b/>
-                <w:bCs/>
-                <w:sz w:val="28"/>
-                <w:szCs w:val="28"/>
-                <w:lang w:val="en-US"/>
-              </w:rPr>
-            </w:pPr>
-            <w:proofErr w:type="spellStart"/>
-            <w:r>
-              <w:rPr>
-                <w:rFonts w:ascii="Open Sans" w:hAnsi="Open Sans" w:cs="Open Sans"/>
-                <w:u w:val="single"/>
-                <w:lang w:val="en-US"/>
-              </w:rPr>
-              <w:t>Jenis_Plg</w:t>
-            </w:r>
-            <w:proofErr w:type="spellEnd"/>
-          </w:p>
-        </w:tc>
-        <w:tc>
-          <w:tcPr>
-            <w:tcW w:w="2969" w:type="dxa"/>
-          </w:tcPr>
-          <w:p>
-            <w:pPr>
-              <w:pStyle w:val="ListParagraph"/>
-              <w:spacing w:line="276" w:lineRule="auto"/>
-              <w:ind w:left="0"/>
-              <w:jc w:val="center"/>
-              <w:rPr>
-                <w:rFonts w:ascii="Open Sans" w:hAnsi="Open Sans" w:cs="Open Sans"/>
-                <w:b/>
-                <w:bCs/>
-                <w:sz w:val="28"/>
-                <w:szCs w:val="28"/>
-                <w:lang w:val="en-US"/>
-              </w:rPr>
-            </w:pPr>
-            <w:r>
-              <w:rPr>
-                <w:rFonts w:ascii="Open Sans" w:hAnsi="Open Sans" w:cs="Open Sans"/>
-                <w:lang w:val="en-US"/>
-              </w:rPr>
-              <w:t>ENUM (‘R1’, ‘R2’, ‘R3’, ‘B1’, ‘B2’, ‘B3’, ‘I1’, ‘I2’, ‘I3’, ‘I4’, ‘P1’, ‘P2’, ‘P3’, ‘S1’, ‘S2’, ‘S3’)</w:t>
-            </w:r>
-          </w:p>
-        </w:tc>
-        <w:tc>
-          <w:tcPr>
-            <w:tcW w:w="4499" w:type="dxa"/>
-          </w:tcPr>
-          <w:p>
-            <w:pPr>
-              <w:pStyle w:val="ListParagraph"/>
-              <w:spacing w:line="276" w:lineRule="auto"/>
-              <w:ind w:left="0"/>
-              <w:rPr>
-                <w:rFonts w:ascii="Open Sans" w:hAnsi="Open Sans" w:cs="Open Sans"/>
-                <w:lang w:val="en-US"/>
-              </w:rPr>
-            </w:pPr>
-            <w:r>
-              <w:rPr>
-                <w:rFonts w:ascii="Open Sans" w:hAnsi="Open Sans" w:cs="Open Sans"/>
-                <w:lang w:val="en-US"/>
-              </w:rPr>
-              <w:t xml:space="preserve">Foreign key </w:t>
-            </w:r>
-            <w:proofErr w:type="spellStart"/>
-            <w:r>
-              <w:rPr>
-                <w:rFonts w:ascii="Open Sans" w:hAnsi="Open Sans" w:cs="Open Sans"/>
-                <w:lang w:val="en-US"/>
-              </w:rPr>
-              <w:t>dari</w:t>
-            </w:r>
-            <w:proofErr w:type="spellEnd"/>
-            <w:r>
-              <w:rPr>
-                <w:rFonts w:ascii="Open Sans" w:hAnsi="Open Sans" w:cs="Open Sans"/>
-                <w:lang w:val="en-US"/>
-              </w:rPr>
-              <w:t xml:space="preserve"> PELANGGAN.</w:t>
-            </w:r>
-            <w:r>
-              <w:rPr>
-                <w:rFonts w:ascii="Open Sans" w:hAnsi="Open Sans" w:cs="Open Sans"/>
-                <w:lang w:val="en-US"/>
-              </w:rPr>
-              <w:t xml:space="preserve"> </w:t>
-            </w:r>
-            <w:proofErr w:type="spellStart"/>
-            <w:r>
-              <w:rPr>
-                <w:rFonts w:ascii="Open Sans" w:hAnsi="Open Sans" w:cs="Open Sans"/>
-                <w:u w:val="single"/>
-                <w:lang w:val="en-US"/>
-              </w:rPr>
-              <w:t>Jenis_Plg</w:t>
+                <w:color w:val="000000" w:themeColor="text1"/>
+                <w:lang w:val="en-US"/>
+              </w:rPr>
+              <w:t>Alasan</w:t>
             </w:r>
             <w:proofErr w:type="spellEnd"/>
           </w:p>
@@ -9021,9 +8978,10 @@
             <w:r>
               <w:rPr>
                 <w:rFonts w:ascii="Open Sans" w:hAnsi="Open Sans" w:cs="Open Sans"/>
-                <w:lang w:val="en-US"/>
-              </w:rPr>
-              <w:t>BiayaBeban</w:t>
+                <w:u w:val="single"/>
+                <w:lang w:val="en-US"/>
+              </w:rPr>
+              <w:t>Jenis_Plg</w:t>
             </w:r>
             <w:proofErr w:type="spellEnd"/>
           </w:p>
@@ -9052,14 +9010,144 @@
                 <w:rFonts w:ascii="Open Sans" w:hAnsi="Open Sans" w:cs="Open Sans"/>
                 <w:lang w:val="en-US"/>
               </w:rPr>
-              <w:t>DECIMAL</w:t>
-            </w:r>
-            <w:r>
-              <w:rPr>
-                <w:rFonts w:ascii="Open Sans" w:hAnsi="Open Sans" w:cs="Open Sans"/>
-                <w:lang w:val="en-US"/>
-              </w:rPr>
-              <w:t xml:space="preserve"> (10,2)</w:t>
+              <w:t>ENUM (‘R1’, ‘R2’, ‘R3’, ‘B1’, ‘B2’, ‘B3’, ‘I1’, ‘I2’, ‘I3’, ‘I4’, ‘P1’, ‘P2’, ‘P3’, ‘S1’, ‘S2’, ‘S3’)</w:t>
+            </w:r>
+          </w:p>
+        </w:tc>
+        <w:tc>
+          <w:tcPr>
+            <w:tcW w:w="4499" w:type="dxa"/>
+          </w:tcPr>
+          <w:p>
+            <w:pPr>
+              <w:pStyle w:val="ListParagraph"/>
+              <w:spacing w:line="276" w:lineRule="auto"/>
+              <w:ind w:left="0"/>
+              <w:rPr>
+                <w:rFonts w:ascii="Open Sans" w:hAnsi="Open Sans" w:cs="Open Sans"/>
+                <w:lang w:val="en-US"/>
+              </w:rPr>
+            </w:pPr>
+            <w:r>
+              <w:rPr>
+                <w:rFonts w:ascii="Open Sans" w:hAnsi="Open Sans" w:cs="Open Sans"/>
+                <w:lang w:val="en-US"/>
+              </w:rPr>
+              <w:t xml:space="preserve">Foreign key </w:t>
+            </w:r>
+            <w:proofErr w:type="spellStart"/>
+            <w:r>
+              <w:rPr>
+                <w:rFonts w:ascii="Open Sans" w:hAnsi="Open Sans" w:cs="Open Sans"/>
+                <w:lang w:val="en-US"/>
+              </w:rPr>
+              <w:t>dari</w:t>
+            </w:r>
+            <w:proofErr w:type="spellEnd"/>
+            <w:r>
+              <w:rPr>
+                <w:rFonts w:ascii="Open Sans" w:hAnsi="Open Sans" w:cs="Open Sans"/>
+                <w:lang w:val="en-US"/>
+              </w:rPr>
+              <w:t xml:space="preserve"> PELANGGAN.</w:t>
+            </w:r>
+            <w:r>
+              <w:rPr>
+                <w:rFonts w:ascii="Open Sans" w:hAnsi="Open Sans" w:cs="Open Sans"/>
+                <w:lang w:val="en-US"/>
+              </w:rPr>
+              <w:t xml:space="preserve"> </w:t>
+            </w:r>
+            <w:proofErr w:type="spellStart"/>
+            <w:r>
+              <w:rPr>
+                <w:rFonts w:ascii="Open Sans" w:hAnsi="Open Sans" w:cs="Open Sans"/>
+                <w:u w:val="single"/>
+                <w:lang w:val="en-US"/>
+              </w:rPr>
+              <w:t>Jenis_Plg</w:t>
+            </w:r>
+            <w:proofErr w:type="spellEnd"/>
+          </w:p>
+        </w:tc>
+      </w:tr>
+      <w:tr>
+        <w:tc>
+          <w:tcPr>
+            <w:tcW w:w="560" w:type="dxa"/>
+          </w:tcPr>
+          <w:p>
+            <w:pPr>
+              <w:pStyle w:val="ListParagraph"/>
+              <w:spacing w:line="276" w:lineRule="auto"/>
+              <w:ind w:left="0"/>
+              <w:jc w:val="center"/>
+              <w:rPr>
+                <w:rFonts w:ascii="Open Sans" w:hAnsi="Open Sans" w:cs="Open Sans"/>
+                <w:b/>
+                <w:bCs/>
+                <w:sz w:val="28"/>
+                <w:szCs w:val="28"/>
+                <w:lang w:val="en-US"/>
+              </w:rPr>
+            </w:pPr>
+          </w:p>
+        </w:tc>
+        <w:tc>
+          <w:tcPr>
+            <w:tcW w:w="2772" w:type="dxa"/>
+          </w:tcPr>
+          <w:p>
+            <w:pPr>
+              <w:pStyle w:val="ListParagraph"/>
+              <w:spacing w:line="276" w:lineRule="auto"/>
+              <w:ind w:left="0"/>
+              <w:jc w:val="center"/>
+              <w:rPr>
+                <w:rFonts w:ascii="Open Sans" w:hAnsi="Open Sans" w:cs="Open Sans"/>
+                <w:b/>
+                <w:bCs/>
+                <w:sz w:val="28"/>
+                <w:szCs w:val="28"/>
+                <w:lang w:val="en-US"/>
+              </w:rPr>
+            </w:pPr>
+            <w:proofErr w:type="spellStart"/>
+            <w:r>
+              <w:rPr>
+                <w:rFonts w:ascii="Open Sans" w:hAnsi="Open Sans" w:cs="Open Sans"/>
+                <w:lang w:val="en-US"/>
+              </w:rPr>
+              <w:t>BiayaBeban</w:t>
+            </w:r>
+            <w:proofErr w:type="spellEnd"/>
+          </w:p>
+        </w:tc>
+        <w:tc>
+          <w:tcPr>
+            <w:tcW w:w="2969" w:type="dxa"/>
+          </w:tcPr>
+          <w:p>
+            <w:pPr>
+              <w:pStyle w:val="ListParagraph"/>
+              <w:spacing w:line="276" w:lineRule="auto"/>
+              <w:ind w:left="0"/>
+              <w:jc w:val="center"/>
+              <w:rPr>
+                <w:rFonts w:ascii="Open Sans" w:hAnsi="Open Sans" w:cs="Open Sans"/>
+                <w:b/>
+                <w:bCs/>
+                <w:sz w:val="28"/>
+                <w:szCs w:val="28"/>
+                <w:lang w:val="en-US"/>
+              </w:rPr>
+            </w:pPr>
+            <w:r>
+              <w:rPr>
+                <w:rFonts w:ascii="Open Sans" w:hAnsi="Open Sans" w:cs="Open Sans"/>
+                <w:lang w:val="en-US"/>
+              </w:rPr>
+              <w:t>DECIMAL (10,2)</w:t>
             </w:r>
           </w:p>
         </w:tc>
@@ -9156,14 +9244,7 @@
                 <w:rFonts w:ascii="Open Sans" w:hAnsi="Open Sans" w:cs="Open Sans"/>
                 <w:lang w:val="en-US"/>
               </w:rPr>
-              <w:t>DECIMAL</w:t>
-            </w:r>
-            <w:r>
-              <w:rPr>
-                <w:rFonts w:ascii="Open Sans" w:hAnsi="Open Sans" w:cs="Open Sans"/>
-                <w:lang w:val="en-US"/>
-              </w:rPr>
-              <w:t xml:space="preserve"> (10,4)</w:t>
+              <w:t>DECIMAL (10,4)</w:t>
             </w:r>
           </w:p>
         </w:tc>
@@ -9421,6 +9502,1711 @@
           <w:lang w:val="en-US"/>
         </w:rPr>
       </w:pPr>
+    </w:p>
+    <w:p>
+      <w:pPr>
+        <w:pStyle w:val="ListParagraph"/>
+        <w:spacing w:line="276" w:lineRule="auto"/>
+        <w:jc w:val="both"/>
+        <w:rPr>
+          <w:rFonts w:ascii="Open Sans" w:hAnsi="Open Sans" w:cs="Open Sans"/>
+          <w:b/>
+          <w:bCs/>
+          <w:sz w:val="28"/>
+          <w:szCs w:val="28"/>
+        </w:rPr>
+      </w:pPr>
+      <w:proofErr w:type="spellStart"/>
+      <w:r>
+        <w:rPr>
+          <w:rFonts w:ascii="Open Sans" w:hAnsi="Open Sans" w:cs="Open Sans"/>
+          <w:b/>
+          <w:bCs/>
+          <w:sz w:val="28"/>
+          <w:szCs w:val="28"/>
+        </w:rPr>
+        <w:t>tolong</w:t>
+      </w:r>
+      <w:proofErr w:type="spellEnd"/>
+      <w:r>
+        <w:rPr>
+          <w:rFonts w:ascii="Open Sans" w:hAnsi="Open Sans" w:cs="Open Sans"/>
+          <w:b/>
+          <w:bCs/>
+          <w:sz w:val="28"/>
+          <w:szCs w:val="28"/>
+        </w:rPr>
+        <w:t xml:space="preserve"> </w:t>
+      </w:r>
+      <w:proofErr w:type="spellStart"/>
+      <w:r>
+        <w:rPr>
+          <w:rFonts w:ascii="Open Sans" w:hAnsi="Open Sans" w:cs="Open Sans"/>
+          <w:b/>
+          <w:bCs/>
+          <w:sz w:val="28"/>
+          <w:szCs w:val="28"/>
+        </w:rPr>
+        <w:t>periksa</w:t>
+      </w:r>
+      <w:proofErr w:type="spellEnd"/>
+      <w:r>
+        <w:rPr>
+          <w:rFonts w:ascii="Open Sans" w:hAnsi="Open Sans" w:cs="Open Sans"/>
+          <w:b/>
+          <w:bCs/>
+          <w:sz w:val="28"/>
+          <w:szCs w:val="28"/>
+        </w:rPr>
+        <w:t xml:space="preserve"> </w:t>
+      </w:r>
+      <w:proofErr w:type="spellStart"/>
+      <w:r>
+        <w:rPr>
+          <w:rFonts w:ascii="Open Sans" w:hAnsi="Open Sans" w:cs="Open Sans"/>
+          <w:b/>
+          <w:bCs/>
+          <w:sz w:val="28"/>
+          <w:szCs w:val="28"/>
+        </w:rPr>
+        <w:t>kode</w:t>
+      </w:r>
+      <w:proofErr w:type="spellEnd"/>
+      <w:r>
+        <w:rPr>
+          <w:rFonts w:ascii="Open Sans" w:hAnsi="Open Sans" w:cs="Open Sans"/>
+          <w:b/>
+          <w:bCs/>
+          <w:sz w:val="28"/>
+          <w:szCs w:val="28"/>
+        </w:rPr>
+        <w:t xml:space="preserve"> </w:t>
+      </w:r>
+      <w:proofErr w:type="spellStart"/>
+      <w:r>
+        <w:rPr>
+          <w:rFonts w:ascii="Open Sans" w:hAnsi="Open Sans" w:cs="Open Sans"/>
+          <w:b/>
+          <w:bCs/>
+          <w:sz w:val="28"/>
+          <w:szCs w:val="28"/>
+        </w:rPr>
+        <w:t>saya</w:t>
+      </w:r>
+      <w:proofErr w:type="spellEnd"/>
+      <w:r>
+        <w:rPr>
+          <w:rFonts w:ascii="Open Sans" w:hAnsi="Open Sans" w:cs="Open Sans"/>
+          <w:b/>
+          <w:bCs/>
+          <w:sz w:val="28"/>
+          <w:szCs w:val="28"/>
+        </w:rPr>
+        <w:t>,</w:t>
+      </w:r>
+    </w:p>
+    <w:p>
+      <w:pPr>
+        <w:pStyle w:val="ListParagraph"/>
+        <w:spacing w:line="276" w:lineRule="auto"/>
+        <w:jc w:val="both"/>
+        <w:rPr>
+          <w:rFonts w:ascii="Open Sans" w:hAnsi="Open Sans" w:cs="Open Sans"/>
+          <w:b/>
+          <w:bCs/>
+          <w:sz w:val="28"/>
+          <w:szCs w:val="28"/>
+        </w:rPr>
+      </w:pPr>
+      <w:proofErr w:type="spellStart"/>
+      <w:r>
+        <w:rPr>
+          <w:rFonts w:ascii="Open Sans" w:hAnsi="Open Sans" w:cs="Open Sans"/>
+          <w:b/>
+          <w:bCs/>
+          <w:sz w:val="28"/>
+          <w:szCs w:val="28"/>
+        </w:rPr>
+        <w:t>jadi</w:t>
+      </w:r>
+      <w:proofErr w:type="spellEnd"/>
+      <w:r>
+        <w:rPr>
+          <w:rFonts w:ascii="Open Sans" w:hAnsi="Open Sans" w:cs="Open Sans"/>
+          <w:b/>
+          <w:bCs/>
+          <w:sz w:val="28"/>
+          <w:szCs w:val="28"/>
+        </w:rPr>
+        <w:t xml:space="preserve"> pada </w:t>
+      </w:r>
+      <w:proofErr w:type="spellStart"/>
+      <w:r>
+        <w:rPr>
+          <w:rFonts w:ascii="Open Sans" w:hAnsi="Open Sans" w:cs="Open Sans"/>
+          <w:b/>
+          <w:bCs/>
+          <w:sz w:val="28"/>
+          <w:szCs w:val="28"/>
+        </w:rPr>
+        <w:t>kode</w:t>
+      </w:r>
+      <w:proofErr w:type="spellEnd"/>
+      <w:r>
+        <w:rPr>
+          <w:rFonts w:ascii="Open Sans" w:hAnsi="Open Sans" w:cs="Open Sans"/>
+          <w:b/>
+          <w:bCs/>
+          <w:sz w:val="28"/>
+          <w:szCs w:val="28"/>
+        </w:rPr>
+        <w:t xml:space="preserve"> form CRUD </w:t>
+      </w:r>
+      <w:proofErr w:type="spellStart"/>
+      <w:r>
+        <w:rPr>
+          <w:rFonts w:ascii="Open Sans" w:hAnsi="Open Sans" w:cs="Open Sans"/>
+          <w:b/>
+          <w:bCs/>
+          <w:sz w:val="28"/>
+          <w:szCs w:val="28"/>
+        </w:rPr>
+        <w:t>pemakaian</w:t>
+      </w:r>
+      <w:proofErr w:type="spellEnd"/>
+      <w:r>
+        <w:rPr>
+          <w:rFonts w:ascii="Open Sans" w:hAnsi="Open Sans" w:cs="Open Sans"/>
+          <w:b/>
+          <w:bCs/>
+          <w:sz w:val="28"/>
+          <w:szCs w:val="28"/>
+        </w:rPr>
+        <w:t xml:space="preserve"> </w:t>
+      </w:r>
+      <w:proofErr w:type="spellStart"/>
+      <w:r>
+        <w:rPr>
+          <w:rFonts w:ascii="Open Sans" w:hAnsi="Open Sans" w:cs="Open Sans"/>
+          <w:b/>
+          <w:bCs/>
+          <w:sz w:val="28"/>
+          <w:szCs w:val="28"/>
+        </w:rPr>
+        <w:t>saya</w:t>
+      </w:r>
+      <w:proofErr w:type="spellEnd"/>
+      <w:r>
+        <w:rPr>
+          <w:rFonts w:ascii="Open Sans" w:hAnsi="Open Sans" w:cs="Open Sans"/>
+          <w:b/>
+          <w:bCs/>
+          <w:sz w:val="28"/>
+          <w:szCs w:val="28"/>
+        </w:rPr>
+        <w:t xml:space="preserve"> </w:t>
+      </w:r>
+      <w:proofErr w:type="spellStart"/>
+      <w:r>
+        <w:rPr>
+          <w:rFonts w:ascii="Open Sans" w:hAnsi="Open Sans" w:cs="Open Sans"/>
+          <w:b/>
+          <w:bCs/>
+          <w:sz w:val="28"/>
+          <w:szCs w:val="28"/>
+        </w:rPr>
+        <w:t>memiliki</w:t>
+      </w:r>
+      <w:proofErr w:type="spellEnd"/>
+      <w:r>
+        <w:rPr>
+          <w:rFonts w:ascii="Open Sans" w:hAnsi="Open Sans" w:cs="Open Sans"/>
+          <w:b/>
+          <w:bCs/>
+          <w:sz w:val="28"/>
+          <w:szCs w:val="28"/>
+        </w:rPr>
+        <w:t xml:space="preserve"> input </w:t>
+      </w:r>
+      <w:proofErr w:type="spellStart"/>
+      <w:r>
+        <w:rPr>
+          <w:rFonts w:ascii="Open Sans" w:hAnsi="Open Sans" w:cs="Open Sans"/>
+          <w:b/>
+          <w:bCs/>
+          <w:sz w:val="28"/>
+          <w:szCs w:val="28"/>
+        </w:rPr>
+        <w:t>NoKontrol</w:t>
+      </w:r>
+      <w:proofErr w:type="spellEnd"/>
+      <w:r>
+        <w:rPr>
+          <w:rFonts w:ascii="Open Sans" w:hAnsi="Open Sans" w:cs="Open Sans"/>
+          <w:b/>
+          <w:bCs/>
+          <w:sz w:val="28"/>
+          <w:szCs w:val="28"/>
+        </w:rPr>
+        <w:t xml:space="preserve"> yang mana </w:t>
+      </w:r>
+      <w:proofErr w:type="spellStart"/>
+      <w:r>
+        <w:rPr>
+          <w:rFonts w:ascii="Open Sans" w:hAnsi="Open Sans" w:cs="Open Sans"/>
+          <w:b/>
+          <w:bCs/>
+          <w:sz w:val="28"/>
+          <w:szCs w:val="28"/>
+        </w:rPr>
+        <w:t>saya</w:t>
+      </w:r>
+      <w:proofErr w:type="spellEnd"/>
+      <w:r>
+        <w:rPr>
+          <w:rFonts w:ascii="Open Sans" w:hAnsi="Open Sans" w:cs="Open Sans"/>
+          <w:b/>
+          <w:bCs/>
+          <w:sz w:val="28"/>
+          <w:szCs w:val="28"/>
+        </w:rPr>
+        <w:t xml:space="preserve"> </w:t>
+      </w:r>
+      <w:proofErr w:type="spellStart"/>
+      <w:r>
+        <w:rPr>
+          <w:rFonts w:ascii="Open Sans" w:hAnsi="Open Sans" w:cs="Open Sans"/>
+          <w:b/>
+          <w:bCs/>
+          <w:sz w:val="28"/>
+          <w:szCs w:val="28"/>
+        </w:rPr>
+        <w:t>gunakan</w:t>
+      </w:r>
+      <w:proofErr w:type="spellEnd"/>
+      <w:r>
+        <w:rPr>
+          <w:rFonts w:ascii="Open Sans" w:hAnsi="Open Sans" w:cs="Open Sans"/>
+          <w:b/>
+          <w:bCs/>
+          <w:sz w:val="28"/>
+          <w:szCs w:val="28"/>
+        </w:rPr>
+        <w:t xml:space="preserve"> </w:t>
+      </w:r>
+      <w:proofErr w:type="spellStart"/>
+      <w:r>
+        <w:rPr>
+          <w:rFonts w:ascii="Open Sans" w:hAnsi="Open Sans" w:cs="Open Sans"/>
+          <w:b/>
+          <w:bCs/>
+          <w:sz w:val="28"/>
+          <w:szCs w:val="28"/>
+        </w:rPr>
+        <w:t>untuk</w:t>
+      </w:r>
+      <w:proofErr w:type="spellEnd"/>
+      <w:r>
+        <w:rPr>
+          <w:rFonts w:ascii="Open Sans" w:hAnsi="Open Sans" w:cs="Open Sans"/>
+          <w:b/>
+          <w:bCs/>
+          <w:sz w:val="28"/>
+          <w:szCs w:val="28"/>
+        </w:rPr>
+        <w:t xml:space="preserve"> </w:t>
+      </w:r>
+      <w:proofErr w:type="spellStart"/>
+      <w:r>
+        <w:rPr>
+          <w:rFonts w:ascii="Open Sans" w:hAnsi="Open Sans" w:cs="Open Sans"/>
+          <w:b/>
+          <w:bCs/>
+          <w:sz w:val="28"/>
+          <w:szCs w:val="28"/>
+        </w:rPr>
+        <w:t>pemilihan</w:t>
+      </w:r>
+      <w:proofErr w:type="spellEnd"/>
+      <w:r>
+        <w:rPr>
+          <w:rFonts w:ascii="Open Sans" w:hAnsi="Open Sans" w:cs="Open Sans"/>
+          <w:b/>
+          <w:bCs/>
+          <w:sz w:val="28"/>
+          <w:szCs w:val="28"/>
+        </w:rPr>
+        <w:t xml:space="preserve"> data </w:t>
+      </w:r>
+      <w:proofErr w:type="spellStart"/>
+      <w:r>
+        <w:rPr>
+          <w:rFonts w:ascii="Open Sans" w:hAnsi="Open Sans" w:cs="Open Sans"/>
+          <w:b/>
+          <w:bCs/>
+          <w:sz w:val="28"/>
+          <w:szCs w:val="28"/>
+        </w:rPr>
+        <w:t>pelanggan</w:t>
+      </w:r>
+      <w:proofErr w:type="spellEnd"/>
+      <w:r>
+        <w:rPr>
+          <w:rFonts w:ascii="Open Sans" w:hAnsi="Open Sans" w:cs="Open Sans"/>
+          <w:b/>
+          <w:bCs/>
+          <w:sz w:val="28"/>
+          <w:szCs w:val="28"/>
+        </w:rPr>
+        <w:t xml:space="preserve">. pada form </w:t>
+      </w:r>
+      <w:proofErr w:type="spellStart"/>
+      <w:r>
+        <w:rPr>
+          <w:rFonts w:ascii="Open Sans" w:hAnsi="Open Sans" w:cs="Open Sans"/>
+          <w:b/>
+          <w:bCs/>
+          <w:sz w:val="28"/>
+          <w:szCs w:val="28"/>
+        </w:rPr>
+        <w:t>pemakaiana</w:t>
+      </w:r>
+      <w:proofErr w:type="spellEnd"/>
+      <w:r>
+        <w:rPr>
+          <w:rFonts w:ascii="Open Sans" w:hAnsi="Open Sans" w:cs="Open Sans"/>
+          <w:b/>
+          <w:bCs/>
+          <w:sz w:val="28"/>
+          <w:szCs w:val="28"/>
+        </w:rPr>
+        <w:t xml:space="preserve"> </w:t>
+      </w:r>
+      <w:proofErr w:type="spellStart"/>
+      <w:r>
+        <w:rPr>
+          <w:rFonts w:ascii="Open Sans" w:hAnsi="Open Sans" w:cs="Open Sans"/>
+          <w:b/>
+          <w:bCs/>
+          <w:sz w:val="28"/>
+          <w:szCs w:val="28"/>
+        </w:rPr>
+        <w:t>ini</w:t>
+      </w:r>
+      <w:proofErr w:type="spellEnd"/>
+      <w:r>
+        <w:rPr>
+          <w:rFonts w:ascii="Open Sans" w:hAnsi="Open Sans" w:cs="Open Sans"/>
+          <w:b/>
+          <w:bCs/>
+          <w:sz w:val="28"/>
+          <w:szCs w:val="28"/>
+        </w:rPr>
+        <w:t xml:space="preserve"> </w:t>
+      </w:r>
+      <w:proofErr w:type="spellStart"/>
+      <w:r>
+        <w:rPr>
+          <w:rFonts w:ascii="Open Sans" w:hAnsi="Open Sans" w:cs="Open Sans"/>
+          <w:b/>
+          <w:bCs/>
+          <w:sz w:val="28"/>
+          <w:szCs w:val="28"/>
+        </w:rPr>
+        <w:t>ada</w:t>
+      </w:r>
+      <w:proofErr w:type="spellEnd"/>
+      <w:r>
+        <w:rPr>
+          <w:rFonts w:ascii="Open Sans" w:hAnsi="Open Sans" w:cs="Open Sans"/>
+          <w:b/>
+          <w:bCs/>
+          <w:sz w:val="28"/>
+          <w:szCs w:val="28"/>
+        </w:rPr>
+        <w:t xml:space="preserve"> No </w:t>
+      </w:r>
+      <w:proofErr w:type="spellStart"/>
+      <w:r>
+        <w:rPr>
+          <w:rFonts w:ascii="Open Sans" w:hAnsi="Open Sans" w:cs="Open Sans"/>
+          <w:b/>
+          <w:bCs/>
+          <w:sz w:val="28"/>
+          <w:szCs w:val="28"/>
+        </w:rPr>
+        <w:t>Kontrol</w:t>
+      </w:r>
+      <w:proofErr w:type="spellEnd"/>
+      <w:r>
+        <w:rPr>
+          <w:rFonts w:ascii="Open Sans" w:hAnsi="Open Sans" w:cs="Open Sans"/>
+          <w:b/>
+          <w:bCs/>
+          <w:sz w:val="28"/>
+          <w:szCs w:val="28"/>
+        </w:rPr>
+        <w:t xml:space="preserve">, </w:t>
+      </w:r>
+      <w:proofErr w:type="spellStart"/>
+      <w:r>
+        <w:rPr>
+          <w:rFonts w:ascii="Open Sans" w:hAnsi="Open Sans" w:cs="Open Sans"/>
+          <w:b/>
+          <w:bCs/>
+          <w:sz w:val="28"/>
+          <w:szCs w:val="28"/>
+        </w:rPr>
+        <w:t>tahun</w:t>
+      </w:r>
+      <w:proofErr w:type="spellEnd"/>
+      <w:r>
+        <w:rPr>
+          <w:rFonts w:ascii="Open Sans" w:hAnsi="Open Sans" w:cs="Open Sans"/>
+          <w:b/>
+          <w:bCs/>
+          <w:sz w:val="28"/>
+          <w:szCs w:val="28"/>
+        </w:rPr>
+        <w:t xml:space="preserve">, </w:t>
+      </w:r>
+      <w:proofErr w:type="spellStart"/>
+      <w:r>
+        <w:rPr>
+          <w:rFonts w:ascii="Open Sans" w:hAnsi="Open Sans" w:cs="Open Sans"/>
+          <w:b/>
+          <w:bCs/>
+          <w:sz w:val="28"/>
+          <w:szCs w:val="28"/>
+        </w:rPr>
+        <w:lastRenderedPageBreak/>
+        <w:t>bulan</w:t>
+      </w:r>
+      <w:proofErr w:type="spellEnd"/>
+      <w:r>
+        <w:rPr>
+          <w:rFonts w:ascii="Open Sans" w:hAnsi="Open Sans" w:cs="Open Sans"/>
+          <w:b/>
+          <w:bCs/>
+          <w:sz w:val="28"/>
+          <w:szCs w:val="28"/>
+        </w:rPr>
+        <w:t xml:space="preserve">, Meter </w:t>
+      </w:r>
+      <w:proofErr w:type="spellStart"/>
+      <w:r>
+        <w:rPr>
+          <w:rFonts w:ascii="Open Sans" w:hAnsi="Open Sans" w:cs="Open Sans"/>
+          <w:b/>
+          <w:bCs/>
+          <w:sz w:val="28"/>
+          <w:szCs w:val="28"/>
+        </w:rPr>
+        <w:t>awal</w:t>
+      </w:r>
+      <w:proofErr w:type="spellEnd"/>
+      <w:r>
+        <w:rPr>
+          <w:rFonts w:ascii="Open Sans" w:hAnsi="Open Sans" w:cs="Open Sans"/>
+          <w:b/>
+          <w:bCs/>
+          <w:sz w:val="28"/>
+          <w:szCs w:val="28"/>
+        </w:rPr>
+        <w:t xml:space="preserve">, meter </w:t>
+      </w:r>
+      <w:proofErr w:type="spellStart"/>
+      <w:r>
+        <w:rPr>
+          <w:rFonts w:ascii="Open Sans" w:hAnsi="Open Sans" w:cs="Open Sans"/>
+          <w:b/>
+          <w:bCs/>
+          <w:sz w:val="28"/>
+          <w:szCs w:val="28"/>
+        </w:rPr>
+        <w:t>akhir</w:t>
+      </w:r>
+      <w:proofErr w:type="spellEnd"/>
+      <w:r>
+        <w:rPr>
+          <w:rFonts w:ascii="Open Sans" w:hAnsi="Open Sans" w:cs="Open Sans"/>
+          <w:b/>
+          <w:bCs/>
+          <w:sz w:val="28"/>
+          <w:szCs w:val="28"/>
+        </w:rPr>
+        <w:t xml:space="preserve">, </w:t>
+      </w:r>
+      <w:proofErr w:type="spellStart"/>
+      <w:r>
+        <w:rPr>
+          <w:rFonts w:ascii="Open Sans" w:hAnsi="Open Sans" w:cs="Open Sans"/>
+          <w:b/>
+          <w:bCs/>
+          <w:sz w:val="28"/>
+          <w:szCs w:val="28"/>
+        </w:rPr>
+        <w:t>nama</w:t>
+      </w:r>
+      <w:proofErr w:type="spellEnd"/>
+      <w:r>
+        <w:rPr>
+          <w:rFonts w:ascii="Open Sans" w:hAnsi="Open Sans" w:cs="Open Sans"/>
+          <w:b/>
+          <w:bCs/>
+          <w:sz w:val="28"/>
+          <w:szCs w:val="28"/>
+        </w:rPr>
+        <w:t xml:space="preserve">, </w:t>
+      </w:r>
+      <w:proofErr w:type="spellStart"/>
+      <w:r>
+        <w:rPr>
+          <w:rFonts w:ascii="Open Sans" w:hAnsi="Open Sans" w:cs="Open Sans"/>
+          <w:b/>
+          <w:bCs/>
+          <w:sz w:val="28"/>
+          <w:szCs w:val="28"/>
+        </w:rPr>
+        <w:t>biaya</w:t>
+      </w:r>
+      <w:proofErr w:type="spellEnd"/>
+      <w:r>
+        <w:rPr>
+          <w:rFonts w:ascii="Open Sans" w:hAnsi="Open Sans" w:cs="Open Sans"/>
+          <w:b/>
+          <w:bCs/>
+          <w:sz w:val="28"/>
+          <w:szCs w:val="28"/>
+        </w:rPr>
+        <w:t xml:space="preserve"> </w:t>
+      </w:r>
+      <w:proofErr w:type="spellStart"/>
+      <w:r>
+        <w:rPr>
+          <w:rFonts w:ascii="Open Sans" w:hAnsi="Open Sans" w:cs="Open Sans"/>
+          <w:b/>
+          <w:bCs/>
+          <w:sz w:val="28"/>
+          <w:szCs w:val="28"/>
+        </w:rPr>
+        <w:t>beban</w:t>
+      </w:r>
+      <w:proofErr w:type="spellEnd"/>
+      <w:r>
+        <w:rPr>
+          <w:rFonts w:ascii="Open Sans" w:hAnsi="Open Sans" w:cs="Open Sans"/>
+          <w:b/>
+          <w:bCs/>
+          <w:sz w:val="28"/>
+          <w:szCs w:val="28"/>
+        </w:rPr>
+        <w:t xml:space="preserve"> </w:t>
+      </w:r>
+      <w:proofErr w:type="spellStart"/>
+      <w:r>
+        <w:rPr>
+          <w:rFonts w:ascii="Open Sans" w:hAnsi="Open Sans" w:cs="Open Sans"/>
+          <w:b/>
+          <w:bCs/>
+          <w:sz w:val="28"/>
+          <w:szCs w:val="28"/>
+        </w:rPr>
+        <w:t>pemakai</w:t>
+      </w:r>
+      <w:proofErr w:type="spellEnd"/>
+      <w:r>
+        <w:rPr>
+          <w:rFonts w:ascii="Open Sans" w:hAnsi="Open Sans" w:cs="Open Sans"/>
+          <w:b/>
+          <w:bCs/>
+          <w:sz w:val="28"/>
+          <w:szCs w:val="28"/>
+        </w:rPr>
+        <w:t xml:space="preserve"> dan </w:t>
+      </w:r>
+      <w:proofErr w:type="spellStart"/>
+      <w:r>
+        <w:rPr>
+          <w:rFonts w:ascii="Open Sans" w:hAnsi="Open Sans" w:cs="Open Sans"/>
+          <w:b/>
+          <w:bCs/>
+          <w:sz w:val="28"/>
+          <w:szCs w:val="28"/>
+        </w:rPr>
+        <w:t>biaya</w:t>
+      </w:r>
+      <w:proofErr w:type="spellEnd"/>
+      <w:r>
+        <w:rPr>
+          <w:rFonts w:ascii="Open Sans" w:hAnsi="Open Sans" w:cs="Open Sans"/>
+          <w:b/>
+          <w:bCs/>
+          <w:sz w:val="28"/>
+          <w:szCs w:val="28"/>
+        </w:rPr>
+        <w:t xml:space="preserve"> </w:t>
+      </w:r>
+      <w:proofErr w:type="spellStart"/>
+      <w:r>
+        <w:rPr>
+          <w:rFonts w:ascii="Open Sans" w:hAnsi="Open Sans" w:cs="Open Sans"/>
+          <w:b/>
+          <w:bCs/>
+          <w:sz w:val="28"/>
+          <w:szCs w:val="28"/>
+        </w:rPr>
+        <w:t>pemakaian</w:t>
+      </w:r>
+      <w:proofErr w:type="spellEnd"/>
+      <w:r>
+        <w:rPr>
+          <w:rFonts w:ascii="Open Sans" w:hAnsi="Open Sans" w:cs="Open Sans"/>
+          <w:b/>
+          <w:bCs/>
+          <w:sz w:val="28"/>
+          <w:szCs w:val="28"/>
+        </w:rPr>
+        <w:t xml:space="preserve">. </w:t>
+      </w:r>
+    </w:p>
+    <w:p>
+      <w:pPr>
+        <w:pStyle w:val="ListParagraph"/>
+        <w:spacing w:line="276" w:lineRule="auto"/>
+        <w:jc w:val="both"/>
+        <w:rPr>
+          <w:rFonts w:ascii="Open Sans" w:hAnsi="Open Sans" w:cs="Open Sans"/>
+          <w:b/>
+          <w:bCs/>
+          <w:sz w:val="28"/>
+          <w:szCs w:val="28"/>
+        </w:rPr>
+      </w:pPr>
+      <w:proofErr w:type="spellStart"/>
+      <w:r>
+        <w:rPr>
+          <w:rFonts w:ascii="Open Sans" w:hAnsi="Open Sans" w:cs="Open Sans"/>
+          <w:b/>
+          <w:bCs/>
+          <w:sz w:val="28"/>
+          <w:szCs w:val="28"/>
+        </w:rPr>
+        <w:t>seperti</w:t>
+      </w:r>
+      <w:proofErr w:type="spellEnd"/>
+      <w:r>
+        <w:rPr>
+          <w:rFonts w:ascii="Open Sans" w:hAnsi="Open Sans" w:cs="Open Sans"/>
+          <w:b/>
+          <w:bCs/>
+          <w:sz w:val="28"/>
+          <w:szCs w:val="28"/>
+        </w:rPr>
+        <w:t xml:space="preserve"> yang </w:t>
+      </w:r>
+      <w:proofErr w:type="spellStart"/>
+      <w:r>
+        <w:rPr>
+          <w:rFonts w:ascii="Open Sans" w:hAnsi="Open Sans" w:cs="Open Sans"/>
+          <w:b/>
+          <w:bCs/>
+          <w:sz w:val="28"/>
+          <w:szCs w:val="28"/>
+        </w:rPr>
+        <w:t>saya</w:t>
+      </w:r>
+      <w:proofErr w:type="spellEnd"/>
+      <w:r>
+        <w:rPr>
+          <w:rFonts w:ascii="Open Sans" w:hAnsi="Open Sans" w:cs="Open Sans"/>
+          <w:b/>
+          <w:bCs/>
+          <w:sz w:val="28"/>
+          <w:szCs w:val="28"/>
+        </w:rPr>
+        <w:t xml:space="preserve"> </w:t>
+      </w:r>
+      <w:proofErr w:type="spellStart"/>
+      <w:r>
+        <w:rPr>
+          <w:rFonts w:ascii="Open Sans" w:hAnsi="Open Sans" w:cs="Open Sans"/>
+          <w:b/>
+          <w:bCs/>
+          <w:sz w:val="28"/>
+          <w:szCs w:val="28"/>
+        </w:rPr>
+        <w:t>katakan</w:t>
+      </w:r>
+      <w:proofErr w:type="spellEnd"/>
+      <w:r>
+        <w:rPr>
+          <w:rFonts w:ascii="Open Sans" w:hAnsi="Open Sans" w:cs="Open Sans"/>
+          <w:b/>
+          <w:bCs/>
+          <w:sz w:val="28"/>
+          <w:szCs w:val="28"/>
+        </w:rPr>
+        <w:t xml:space="preserve"> </w:t>
+      </w:r>
+      <w:proofErr w:type="spellStart"/>
+      <w:r>
+        <w:rPr>
+          <w:rFonts w:ascii="Open Sans" w:hAnsi="Open Sans" w:cs="Open Sans"/>
+          <w:b/>
+          <w:bCs/>
+          <w:sz w:val="28"/>
+          <w:szCs w:val="28"/>
+        </w:rPr>
+        <w:t>tadi</w:t>
+      </w:r>
+      <w:proofErr w:type="spellEnd"/>
+      <w:r>
+        <w:rPr>
+          <w:rFonts w:ascii="Open Sans" w:hAnsi="Open Sans" w:cs="Open Sans"/>
+          <w:b/>
+          <w:bCs/>
+          <w:sz w:val="28"/>
+          <w:szCs w:val="28"/>
+        </w:rPr>
+        <w:t xml:space="preserve"> </w:t>
+      </w:r>
+      <w:proofErr w:type="spellStart"/>
+      <w:r>
+        <w:rPr>
+          <w:rFonts w:ascii="Open Sans" w:hAnsi="Open Sans" w:cs="Open Sans"/>
+          <w:b/>
+          <w:bCs/>
+          <w:sz w:val="28"/>
+          <w:szCs w:val="28"/>
+        </w:rPr>
+        <w:t>untuk</w:t>
+      </w:r>
+      <w:proofErr w:type="spellEnd"/>
+      <w:r>
+        <w:rPr>
+          <w:rFonts w:ascii="Open Sans" w:hAnsi="Open Sans" w:cs="Open Sans"/>
+          <w:b/>
+          <w:bCs/>
+          <w:sz w:val="28"/>
+          <w:szCs w:val="28"/>
+        </w:rPr>
+        <w:t xml:space="preserve"> No </w:t>
+      </w:r>
+      <w:proofErr w:type="spellStart"/>
+      <w:r>
+        <w:rPr>
+          <w:rFonts w:ascii="Open Sans" w:hAnsi="Open Sans" w:cs="Open Sans"/>
+          <w:b/>
+          <w:bCs/>
+          <w:sz w:val="28"/>
+          <w:szCs w:val="28"/>
+        </w:rPr>
+        <w:t>Kontrol</w:t>
+      </w:r>
+      <w:proofErr w:type="spellEnd"/>
+      <w:r>
+        <w:rPr>
+          <w:rFonts w:ascii="Open Sans" w:hAnsi="Open Sans" w:cs="Open Sans"/>
+          <w:b/>
+          <w:bCs/>
+          <w:sz w:val="28"/>
+          <w:szCs w:val="28"/>
+        </w:rPr>
+        <w:t xml:space="preserve"> </w:t>
+      </w:r>
+      <w:proofErr w:type="spellStart"/>
+      <w:r>
+        <w:rPr>
+          <w:rFonts w:ascii="Open Sans" w:hAnsi="Open Sans" w:cs="Open Sans"/>
+          <w:b/>
+          <w:bCs/>
+          <w:sz w:val="28"/>
+          <w:szCs w:val="28"/>
+        </w:rPr>
+        <w:t>akan</w:t>
+      </w:r>
+      <w:proofErr w:type="spellEnd"/>
+      <w:r>
+        <w:rPr>
+          <w:rFonts w:ascii="Open Sans" w:hAnsi="Open Sans" w:cs="Open Sans"/>
+          <w:b/>
+          <w:bCs/>
+          <w:sz w:val="28"/>
+          <w:szCs w:val="28"/>
+        </w:rPr>
+        <w:t xml:space="preserve"> </w:t>
+      </w:r>
+      <w:proofErr w:type="spellStart"/>
+      <w:r>
+        <w:rPr>
+          <w:rFonts w:ascii="Open Sans" w:hAnsi="Open Sans" w:cs="Open Sans"/>
+          <w:b/>
+          <w:bCs/>
+          <w:sz w:val="28"/>
+          <w:szCs w:val="28"/>
+        </w:rPr>
+        <w:t>dijadikan</w:t>
+      </w:r>
+      <w:proofErr w:type="spellEnd"/>
+      <w:r>
+        <w:rPr>
+          <w:rFonts w:ascii="Open Sans" w:hAnsi="Open Sans" w:cs="Open Sans"/>
+          <w:b/>
+          <w:bCs/>
+          <w:sz w:val="28"/>
+          <w:szCs w:val="28"/>
+        </w:rPr>
+        <w:t xml:space="preserve"> </w:t>
+      </w:r>
+      <w:proofErr w:type="spellStart"/>
+      <w:r>
+        <w:rPr>
+          <w:rFonts w:ascii="Open Sans" w:hAnsi="Open Sans" w:cs="Open Sans"/>
+          <w:b/>
+          <w:bCs/>
+          <w:sz w:val="28"/>
+          <w:szCs w:val="28"/>
+        </w:rPr>
+        <w:t>pemilihan</w:t>
+      </w:r>
+      <w:proofErr w:type="spellEnd"/>
+      <w:r>
+        <w:rPr>
+          <w:rFonts w:ascii="Open Sans" w:hAnsi="Open Sans" w:cs="Open Sans"/>
+          <w:b/>
+          <w:bCs/>
+          <w:sz w:val="28"/>
+          <w:szCs w:val="28"/>
+        </w:rPr>
+        <w:t xml:space="preserve"> data </w:t>
+      </w:r>
+      <w:proofErr w:type="spellStart"/>
+      <w:r>
+        <w:rPr>
+          <w:rFonts w:ascii="Open Sans" w:hAnsi="Open Sans" w:cs="Open Sans"/>
+          <w:b/>
+          <w:bCs/>
+          <w:sz w:val="28"/>
+          <w:szCs w:val="28"/>
+        </w:rPr>
+        <w:t>pelanggan</w:t>
+      </w:r>
+      <w:proofErr w:type="spellEnd"/>
+      <w:r>
+        <w:rPr>
+          <w:rFonts w:ascii="Open Sans" w:hAnsi="Open Sans" w:cs="Open Sans"/>
+          <w:b/>
+          <w:bCs/>
+          <w:sz w:val="28"/>
+          <w:szCs w:val="28"/>
+        </w:rPr>
+        <w:t xml:space="preserve"> </w:t>
+      </w:r>
+      <w:proofErr w:type="spellStart"/>
+      <w:r>
+        <w:rPr>
+          <w:rFonts w:ascii="Open Sans" w:hAnsi="Open Sans" w:cs="Open Sans"/>
+          <w:b/>
+          <w:bCs/>
+          <w:sz w:val="28"/>
+          <w:szCs w:val="28"/>
+        </w:rPr>
+        <w:t>jadi</w:t>
+      </w:r>
+      <w:proofErr w:type="spellEnd"/>
+      <w:r>
+        <w:rPr>
+          <w:rFonts w:ascii="Open Sans" w:hAnsi="Open Sans" w:cs="Open Sans"/>
+          <w:b/>
+          <w:bCs/>
+          <w:sz w:val="28"/>
+          <w:szCs w:val="28"/>
+        </w:rPr>
+        <w:t xml:space="preserve"> </w:t>
+      </w:r>
+      <w:proofErr w:type="spellStart"/>
+      <w:r>
+        <w:rPr>
+          <w:rFonts w:ascii="Open Sans" w:hAnsi="Open Sans" w:cs="Open Sans"/>
+          <w:b/>
+          <w:bCs/>
+          <w:sz w:val="28"/>
+          <w:szCs w:val="28"/>
+        </w:rPr>
+        <w:t>ketika</w:t>
+      </w:r>
+      <w:proofErr w:type="spellEnd"/>
+      <w:r>
+        <w:rPr>
+          <w:rFonts w:ascii="Open Sans" w:hAnsi="Open Sans" w:cs="Open Sans"/>
+          <w:b/>
+          <w:bCs/>
+          <w:sz w:val="28"/>
+          <w:szCs w:val="28"/>
+        </w:rPr>
+        <w:t xml:space="preserve"> </w:t>
+      </w:r>
+      <w:proofErr w:type="spellStart"/>
+      <w:r>
+        <w:rPr>
+          <w:rFonts w:ascii="Open Sans" w:hAnsi="Open Sans" w:cs="Open Sans"/>
+          <w:b/>
+          <w:bCs/>
+          <w:sz w:val="28"/>
+          <w:szCs w:val="28"/>
+        </w:rPr>
+        <w:t>selesai</w:t>
+      </w:r>
+      <w:proofErr w:type="spellEnd"/>
+      <w:r>
+        <w:rPr>
+          <w:rFonts w:ascii="Open Sans" w:hAnsi="Open Sans" w:cs="Open Sans"/>
+          <w:b/>
+          <w:bCs/>
+          <w:sz w:val="28"/>
+          <w:szCs w:val="28"/>
+        </w:rPr>
+        <w:t xml:space="preserve"> </w:t>
+      </w:r>
+      <w:proofErr w:type="spellStart"/>
+      <w:r>
+        <w:rPr>
+          <w:rFonts w:ascii="Open Sans" w:hAnsi="Open Sans" w:cs="Open Sans"/>
+          <w:b/>
+          <w:bCs/>
+          <w:sz w:val="28"/>
+          <w:szCs w:val="28"/>
+        </w:rPr>
+        <w:t>menginputkan</w:t>
+      </w:r>
+      <w:proofErr w:type="spellEnd"/>
+      <w:r>
+        <w:rPr>
+          <w:rFonts w:ascii="Open Sans" w:hAnsi="Open Sans" w:cs="Open Sans"/>
+          <w:b/>
+          <w:bCs/>
+          <w:sz w:val="28"/>
+          <w:szCs w:val="28"/>
+        </w:rPr>
+        <w:t xml:space="preserve"> no </w:t>
+      </w:r>
+      <w:proofErr w:type="spellStart"/>
+      <w:r>
+        <w:rPr>
+          <w:rFonts w:ascii="Open Sans" w:hAnsi="Open Sans" w:cs="Open Sans"/>
+          <w:b/>
+          <w:bCs/>
+          <w:sz w:val="28"/>
+          <w:szCs w:val="28"/>
+        </w:rPr>
+        <w:t>kontrol</w:t>
+      </w:r>
+      <w:proofErr w:type="spellEnd"/>
+      <w:r>
+        <w:rPr>
+          <w:rFonts w:ascii="Open Sans" w:hAnsi="Open Sans" w:cs="Open Sans"/>
+          <w:b/>
+          <w:bCs/>
+          <w:sz w:val="28"/>
+          <w:szCs w:val="28"/>
+        </w:rPr>
+        <w:t xml:space="preserve"> </w:t>
+      </w:r>
+      <w:proofErr w:type="spellStart"/>
+      <w:r>
+        <w:rPr>
+          <w:rFonts w:ascii="Open Sans" w:hAnsi="Open Sans" w:cs="Open Sans"/>
+          <w:b/>
+          <w:bCs/>
+          <w:sz w:val="28"/>
+          <w:szCs w:val="28"/>
+        </w:rPr>
+        <w:t>maka</w:t>
+      </w:r>
+      <w:proofErr w:type="spellEnd"/>
+      <w:r>
+        <w:rPr>
+          <w:rFonts w:ascii="Open Sans" w:hAnsi="Open Sans" w:cs="Open Sans"/>
+          <w:b/>
+          <w:bCs/>
+          <w:sz w:val="28"/>
+          <w:szCs w:val="28"/>
+        </w:rPr>
+        <w:t xml:space="preserve"> </w:t>
+      </w:r>
+      <w:proofErr w:type="spellStart"/>
+      <w:r>
+        <w:rPr>
+          <w:rFonts w:ascii="Open Sans" w:hAnsi="Open Sans" w:cs="Open Sans"/>
+          <w:b/>
+          <w:bCs/>
+          <w:sz w:val="28"/>
+          <w:szCs w:val="28"/>
+        </w:rPr>
+        <w:t>nama</w:t>
+      </w:r>
+      <w:proofErr w:type="spellEnd"/>
+      <w:r>
+        <w:rPr>
+          <w:rFonts w:ascii="Open Sans" w:hAnsi="Open Sans" w:cs="Open Sans"/>
+          <w:b/>
+          <w:bCs/>
+          <w:sz w:val="28"/>
+          <w:szCs w:val="28"/>
+        </w:rPr>
+        <w:t xml:space="preserve"> dan </w:t>
+      </w:r>
+      <w:proofErr w:type="spellStart"/>
+      <w:r>
+        <w:rPr>
+          <w:rFonts w:ascii="Open Sans" w:hAnsi="Open Sans" w:cs="Open Sans"/>
+          <w:b/>
+          <w:bCs/>
+          <w:sz w:val="28"/>
+          <w:szCs w:val="28"/>
+        </w:rPr>
+        <w:t>biaya</w:t>
+      </w:r>
+      <w:proofErr w:type="spellEnd"/>
+      <w:r>
+        <w:rPr>
+          <w:rFonts w:ascii="Open Sans" w:hAnsi="Open Sans" w:cs="Open Sans"/>
+          <w:b/>
+          <w:bCs/>
+          <w:sz w:val="28"/>
+          <w:szCs w:val="28"/>
+        </w:rPr>
+        <w:t xml:space="preserve"> </w:t>
+      </w:r>
+      <w:proofErr w:type="spellStart"/>
+      <w:r>
+        <w:rPr>
+          <w:rFonts w:ascii="Open Sans" w:hAnsi="Open Sans" w:cs="Open Sans"/>
+          <w:b/>
+          <w:bCs/>
+          <w:sz w:val="28"/>
+          <w:szCs w:val="28"/>
+        </w:rPr>
+        <w:t>beban</w:t>
+      </w:r>
+      <w:proofErr w:type="spellEnd"/>
+      <w:r>
+        <w:rPr>
+          <w:rFonts w:ascii="Open Sans" w:hAnsi="Open Sans" w:cs="Open Sans"/>
+          <w:b/>
+          <w:bCs/>
+          <w:sz w:val="28"/>
+          <w:szCs w:val="28"/>
+        </w:rPr>
+        <w:t xml:space="preserve"> </w:t>
+      </w:r>
+      <w:proofErr w:type="spellStart"/>
+      <w:r>
+        <w:rPr>
+          <w:rFonts w:ascii="Open Sans" w:hAnsi="Open Sans" w:cs="Open Sans"/>
+          <w:b/>
+          <w:bCs/>
+          <w:sz w:val="28"/>
+          <w:szCs w:val="28"/>
+        </w:rPr>
+        <w:t>pemakai</w:t>
+      </w:r>
+      <w:proofErr w:type="spellEnd"/>
+      <w:r>
+        <w:rPr>
+          <w:rFonts w:ascii="Open Sans" w:hAnsi="Open Sans" w:cs="Open Sans"/>
+          <w:b/>
+          <w:bCs/>
+          <w:sz w:val="28"/>
+          <w:szCs w:val="28"/>
+        </w:rPr>
+        <w:t xml:space="preserve"> </w:t>
+      </w:r>
+      <w:proofErr w:type="spellStart"/>
+      <w:r>
+        <w:rPr>
+          <w:rFonts w:ascii="Open Sans" w:hAnsi="Open Sans" w:cs="Open Sans"/>
+          <w:b/>
+          <w:bCs/>
+          <w:sz w:val="28"/>
+          <w:szCs w:val="28"/>
+        </w:rPr>
+        <w:t>akan</w:t>
+      </w:r>
+      <w:proofErr w:type="spellEnd"/>
+      <w:r>
+        <w:rPr>
+          <w:rFonts w:ascii="Open Sans" w:hAnsi="Open Sans" w:cs="Open Sans"/>
+          <w:b/>
+          <w:bCs/>
+          <w:sz w:val="28"/>
+          <w:szCs w:val="28"/>
+        </w:rPr>
+        <w:t xml:space="preserve"> </w:t>
+      </w:r>
+      <w:proofErr w:type="spellStart"/>
+      <w:r>
+        <w:rPr>
+          <w:rFonts w:ascii="Open Sans" w:hAnsi="Open Sans" w:cs="Open Sans"/>
+          <w:b/>
+          <w:bCs/>
+          <w:sz w:val="28"/>
+          <w:szCs w:val="28"/>
+        </w:rPr>
+        <w:t>otomatis</w:t>
+      </w:r>
+      <w:proofErr w:type="spellEnd"/>
+      <w:r>
+        <w:rPr>
+          <w:rFonts w:ascii="Open Sans" w:hAnsi="Open Sans" w:cs="Open Sans"/>
+          <w:b/>
+          <w:bCs/>
+          <w:sz w:val="28"/>
+          <w:szCs w:val="28"/>
+        </w:rPr>
+        <w:t xml:space="preserve"> </w:t>
+      </w:r>
+      <w:proofErr w:type="spellStart"/>
+      <w:r>
+        <w:rPr>
+          <w:rFonts w:ascii="Open Sans" w:hAnsi="Open Sans" w:cs="Open Sans"/>
+          <w:b/>
+          <w:bCs/>
+          <w:sz w:val="28"/>
+          <w:szCs w:val="28"/>
+        </w:rPr>
+        <w:t>terisi</w:t>
+      </w:r>
+      <w:proofErr w:type="spellEnd"/>
+      <w:r>
+        <w:rPr>
+          <w:rFonts w:ascii="Open Sans" w:hAnsi="Open Sans" w:cs="Open Sans"/>
+          <w:b/>
+          <w:bCs/>
+          <w:sz w:val="28"/>
+          <w:szCs w:val="28"/>
+        </w:rPr>
+        <w:t xml:space="preserve"> </w:t>
+      </w:r>
+      <w:proofErr w:type="spellStart"/>
+      <w:r>
+        <w:rPr>
+          <w:rFonts w:ascii="Open Sans" w:hAnsi="Open Sans" w:cs="Open Sans"/>
+          <w:b/>
+          <w:bCs/>
+          <w:sz w:val="28"/>
+          <w:szCs w:val="28"/>
+        </w:rPr>
+        <w:t>karena</w:t>
+      </w:r>
+      <w:proofErr w:type="spellEnd"/>
+      <w:r>
+        <w:rPr>
+          <w:rFonts w:ascii="Open Sans" w:hAnsi="Open Sans" w:cs="Open Sans"/>
+          <w:b/>
+          <w:bCs/>
+          <w:sz w:val="28"/>
+          <w:szCs w:val="28"/>
+        </w:rPr>
+        <w:t xml:space="preserve"> </w:t>
+      </w:r>
+      <w:proofErr w:type="spellStart"/>
+      <w:r>
+        <w:rPr>
+          <w:rFonts w:ascii="Open Sans" w:hAnsi="Open Sans" w:cs="Open Sans"/>
+          <w:b/>
+          <w:bCs/>
+          <w:sz w:val="28"/>
+          <w:szCs w:val="28"/>
+        </w:rPr>
+        <w:t>mengambil</w:t>
+      </w:r>
+      <w:proofErr w:type="spellEnd"/>
+      <w:r>
+        <w:rPr>
+          <w:rFonts w:ascii="Open Sans" w:hAnsi="Open Sans" w:cs="Open Sans"/>
+          <w:b/>
+          <w:bCs/>
+          <w:sz w:val="28"/>
+          <w:szCs w:val="28"/>
+        </w:rPr>
+        <w:t xml:space="preserve"> data </w:t>
+      </w:r>
+      <w:proofErr w:type="spellStart"/>
+      <w:r>
+        <w:rPr>
+          <w:rFonts w:ascii="Open Sans" w:hAnsi="Open Sans" w:cs="Open Sans"/>
+          <w:b/>
+          <w:bCs/>
+          <w:sz w:val="28"/>
+          <w:szCs w:val="28"/>
+        </w:rPr>
+        <w:t>pelanggan</w:t>
+      </w:r>
+      <w:proofErr w:type="spellEnd"/>
+      <w:r>
+        <w:rPr>
+          <w:rFonts w:ascii="Open Sans" w:hAnsi="Open Sans" w:cs="Open Sans"/>
+          <w:b/>
+          <w:bCs/>
+          <w:sz w:val="28"/>
+          <w:szCs w:val="28"/>
+        </w:rPr>
+        <w:t xml:space="preserve"> </w:t>
+      </w:r>
+      <w:proofErr w:type="spellStart"/>
+      <w:r>
+        <w:rPr>
+          <w:rFonts w:ascii="Open Sans" w:hAnsi="Open Sans" w:cs="Open Sans"/>
+          <w:b/>
+          <w:bCs/>
+          <w:sz w:val="28"/>
+          <w:szCs w:val="28"/>
+        </w:rPr>
+        <w:t>untuk</w:t>
+      </w:r>
+      <w:proofErr w:type="spellEnd"/>
+      <w:r>
+        <w:rPr>
+          <w:rFonts w:ascii="Open Sans" w:hAnsi="Open Sans" w:cs="Open Sans"/>
+          <w:b/>
+          <w:bCs/>
+          <w:sz w:val="28"/>
+          <w:szCs w:val="28"/>
+        </w:rPr>
+        <w:t xml:space="preserve"> </w:t>
+      </w:r>
+      <w:proofErr w:type="spellStart"/>
+      <w:r>
+        <w:rPr>
+          <w:rFonts w:ascii="Open Sans" w:hAnsi="Open Sans" w:cs="Open Sans"/>
+          <w:b/>
+          <w:bCs/>
+          <w:sz w:val="28"/>
+          <w:szCs w:val="28"/>
+        </w:rPr>
+        <w:t>biaya</w:t>
+      </w:r>
+      <w:proofErr w:type="spellEnd"/>
+      <w:r>
+        <w:rPr>
+          <w:rFonts w:ascii="Open Sans" w:hAnsi="Open Sans" w:cs="Open Sans"/>
+          <w:b/>
+          <w:bCs/>
+          <w:sz w:val="28"/>
+          <w:szCs w:val="28"/>
+        </w:rPr>
+        <w:t xml:space="preserve"> </w:t>
+      </w:r>
+      <w:proofErr w:type="spellStart"/>
+      <w:r>
+        <w:rPr>
+          <w:rFonts w:ascii="Open Sans" w:hAnsi="Open Sans" w:cs="Open Sans"/>
+          <w:b/>
+          <w:bCs/>
+          <w:sz w:val="28"/>
+          <w:szCs w:val="28"/>
+        </w:rPr>
+        <w:t>beban</w:t>
+      </w:r>
+      <w:proofErr w:type="spellEnd"/>
+      <w:r>
+        <w:rPr>
+          <w:rFonts w:ascii="Open Sans" w:hAnsi="Open Sans" w:cs="Open Sans"/>
+          <w:b/>
+          <w:bCs/>
+          <w:sz w:val="28"/>
+          <w:szCs w:val="28"/>
+        </w:rPr>
+        <w:t xml:space="preserve"> </w:t>
+      </w:r>
+      <w:proofErr w:type="spellStart"/>
+      <w:r>
+        <w:rPr>
+          <w:rFonts w:ascii="Open Sans" w:hAnsi="Open Sans" w:cs="Open Sans"/>
+          <w:b/>
+          <w:bCs/>
+          <w:sz w:val="28"/>
+          <w:szCs w:val="28"/>
+        </w:rPr>
+        <w:t>pemakai</w:t>
+      </w:r>
+      <w:proofErr w:type="spellEnd"/>
+      <w:r>
+        <w:rPr>
+          <w:rFonts w:ascii="Open Sans" w:hAnsi="Open Sans" w:cs="Open Sans"/>
+          <w:b/>
+          <w:bCs/>
+          <w:sz w:val="28"/>
+          <w:szCs w:val="28"/>
+        </w:rPr>
+        <w:t xml:space="preserve"> </w:t>
+      </w:r>
+      <w:proofErr w:type="spellStart"/>
+      <w:r>
+        <w:rPr>
+          <w:rFonts w:ascii="Open Sans" w:hAnsi="Open Sans" w:cs="Open Sans"/>
+          <w:b/>
+          <w:bCs/>
+          <w:sz w:val="28"/>
+          <w:szCs w:val="28"/>
+        </w:rPr>
+        <w:t>diambil</w:t>
+      </w:r>
+      <w:proofErr w:type="spellEnd"/>
+      <w:r>
+        <w:rPr>
+          <w:rFonts w:ascii="Open Sans" w:hAnsi="Open Sans" w:cs="Open Sans"/>
+          <w:b/>
+          <w:bCs/>
+          <w:sz w:val="28"/>
+          <w:szCs w:val="28"/>
+        </w:rPr>
+        <w:t xml:space="preserve"> </w:t>
+      </w:r>
+      <w:proofErr w:type="spellStart"/>
+      <w:r>
+        <w:rPr>
+          <w:rFonts w:ascii="Open Sans" w:hAnsi="Open Sans" w:cs="Open Sans"/>
+          <w:b/>
+          <w:bCs/>
+          <w:sz w:val="28"/>
+          <w:szCs w:val="28"/>
+        </w:rPr>
+        <w:t>dari</w:t>
+      </w:r>
+      <w:proofErr w:type="spellEnd"/>
+      <w:r>
+        <w:rPr>
+          <w:rFonts w:ascii="Open Sans" w:hAnsi="Open Sans" w:cs="Open Sans"/>
+          <w:b/>
+          <w:bCs/>
+          <w:sz w:val="28"/>
+          <w:szCs w:val="28"/>
+        </w:rPr>
+        <w:t xml:space="preserve"> data </w:t>
+      </w:r>
+      <w:proofErr w:type="spellStart"/>
+      <w:r>
+        <w:rPr>
+          <w:rFonts w:ascii="Open Sans" w:hAnsi="Open Sans" w:cs="Open Sans"/>
+          <w:b/>
+          <w:bCs/>
+          <w:sz w:val="28"/>
+          <w:szCs w:val="28"/>
+        </w:rPr>
+        <w:t>pelanggan</w:t>
+      </w:r>
+      <w:proofErr w:type="spellEnd"/>
+      <w:r>
+        <w:rPr>
+          <w:rFonts w:ascii="Open Sans" w:hAnsi="Open Sans" w:cs="Open Sans"/>
+          <w:b/>
+          <w:bCs/>
+          <w:sz w:val="28"/>
+          <w:szCs w:val="28"/>
+        </w:rPr>
+        <w:t xml:space="preserve"> </w:t>
+      </w:r>
+      <w:proofErr w:type="spellStart"/>
+      <w:r>
+        <w:rPr>
+          <w:rFonts w:ascii="Open Sans" w:hAnsi="Open Sans" w:cs="Open Sans"/>
+          <w:b/>
+          <w:bCs/>
+          <w:sz w:val="28"/>
+          <w:szCs w:val="28"/>
+        </w:rPr>
+        <w:t>yaitu</w:t>
+      </w:r>
+      <w:proofErr w:type="spellEnd"/>
+      <w:r>
+        <w:rPr>
+          <w:rFonts w:ascii="Open Sans" w:hAnsi="Open Sans" w:cs="Open Sans"/>
+          <w:b/>
+          <w:bCs/>
+          <w:sz w:val="28"/>
+          <w:szCs w:val="28"/>
+        </w:rPr>
+        <w:t xml:space="preserve"> </w:t>
+      </w:r>
+      <w:proofErr w:type="spellStart"/>
+      <w:r>
+        <w:rPr>
+          <w:rFonts w:ascii="Open Sans" w:hAnsi="Open Sans" w:cs="Open Sans"/>
+          <w:b/>
+          <w:bCs/>
+          <w:sz w:val="28"/>
+          <w:szCs w:val="28"/>
+        </w:rPr>
+        <w:t>JenisPelanggan</w:t>
+      </w:r>
+      <w:proofErr w:type="spellEnd"/>
+      <w:r>
+        <w:rPr>
+          <w:rFonts w:ascii="Open Sans" w:hAnsi="Open Sans" w:cs="Open Sans"/>
+          <w:b/>
+          <w:bCs/>
+          <w:sz w:val="28"/>
+          <w:szCs w:val="28"/>
+        </w:rPr>
+        <w:t xml:space="preserve"> yang </w:t>
+      </w:r>
+      <w:proofErr w:type="spellStart"/>
+      <w:r>
+        <w:rPr>
+          <w:rFonts w:ascii="Open Sans" w:hAnsi="Open Sans" w:cs="Open Sans"/>
+          <w:b/>
+          <w:bCs/>
+          <w:sz w:val="28"/>
+          <w:szCs w:val="28"/>
+        </w:rPr>
+        <w:t>dalam</w:t>
+      </w:r>
+      <w:proofErr w:type="spellEnd"/>
+      <w:r>
+        <w:rPr>
+          <w:rFonts w:ascii="Open Sans" w:hAnsi="Open Sans" w:cs="Open Sans"/>
+          <w:b/>
+          <w:bCs/>
+          <w:sz w:val="28"/>
+          <w:szCs w:val="28"/>
+        </w:rPr>
+        <w:t xml:space="preserve"> data </w:t>
+      </w:r>
+      <w:proofErr w:type="spellStart"/>
+      <w:r>
+        <w:rPr>
+          <w:rFonts w:ascii="Open Sans" w:hAnsi="Open Sans" w:cs="Open Sans"/>
+          <w:b/>
+          <w:bCs/>
+          <w:sz w:val="28"/>
+          <w:szCs w:val="28"/>
+        </w:rPr>
+        <w:t>jenis</w:t>
+      </w:r>
+      <w:proofErr w:type="spellEnd"/>
+      <w:r>
+        <w:rPr>
+          <w:rFonts w:ascii="Open Sans" w:hAnsi="Open Sans" w:cs="Open Sans"/>
+          <w:b/>
+          <w:bCs/>
+          <w:sz w:val="28"/>
+          <w:szCs w:val="28"/>
+        </w:rPr>
+        <w:t xml:space="preserve"> </w:t>
+      </w:r>
+      <w:proofErr w:type="spellStart"/>
+      <w:r>
+        <w:rPr>
+          <w:rFonts w:ascii="Open Sans" w:hAnsi="Open Sans" w:cs="Open Sans"/>
+          <w:b/>
+          <w:bCs/>
+          <w:sz w:val="28"/>
+          <w:szCs w:val="28"/>
+        </w:rPr>
+        <w:t>pelanggan</w:t>
+      </w:r>
+      <w:proofErr w:type="spellEnd"/>
+      <w:r>
+        <w:rPr>
+          <w:rFonts w:ascii="Open Sans" w:hAnsi="Open Sans" w:cs="Open Sans"/>
+          <w:b/>
+          <w:bCs/>
+          <w:sz w:val="28"/>
+          <w:szCs w:val="28"/>
+        </w:rPr>
+        <w:t xml:space="preserve"> </w:t>
+      </w:r>
+      <w:proofErr w:type="spellStart"/>
+      <w:r>
+        <w:rPr>
+          <w:rFonts w:ascii="Open Sans" w:hAnsi="Open Sans" w:cs="Open Sans"/>
+          <w:b/>
+          <w:bCs/>
+          <w:sz w:val="28"/>
+          <w:szCs w:val="28"/>
+        </w:rPr>
+        <w:t>ada</w:t>
+      </w:r>
+      <w:proofErr w:type="spellEnd"/>
+      <w:r>
+        <w:rPr>
+          <w:rFonts w:ascii="Open Sans" w:hAnsi="Open Sans" w:cs="Open Sans"/>
+          <w:b/>
+          <w:bCs/>
+          <w:sz w:val="28"/>
+          <w:szCs w:val="28"/>
+        </w:rPr>
+        <w:t xml:space="preserve"> data </w:t>
+      </w:r>
+      <w:proofErr w:type="spellStart"/>
+      <w:r>
+        <w:rPr>
+          <w:rFonts w:ascii="Open Sans" w:hAnsi="Open Sans" w:cs="Open Sans"/>
+          <w:b/>
+          <w:bCs/>
+          <w:sz w:val="28"/>
+          <w:szCs w:val="28"/>
+        </w:rPr>
+        <w:t>biaya</w:t>
+      </w:r>
+      <w:proofErr w:type="spellEnd"/>
+      <w:r>
+        <w:rPr>
+          <w:rFonts w:ascii="Open Sans" w:hAnsi="Open Sans" w:cs="Open Sans"/>
+          <w:b/>
+          <w:bCs/>
+          <w:sz w:val="28"/>
+          <w:szCs w:val="28"/>
+        </w:rPr>
+        <w:t xml:space="preserve"> </w:t>
+      </w:r>
+      <w:proofErr w:type="spellStart"/>
+      <w:r>
+        <w:rPr>
+          <w:rFonts w:ascii="Open Sans" w:hAnsi="Open Sans" w:cs="Open Sans"/>
+          <w:b/>
+          <w:bCs/>
+          <w:sz w:val="28"/>
+          <w:szCs w:val="28"/>
+        </w:rPr>
+        <w:t>beban</w:t>
+      </w:r>
+      <w:proofErr w:type="spellEnd"/>
+      <w:r>
+        <w:rPr>
+          <w:rFonts w:ascii="Open Sans" w:hAnsi="Open Sans" w:cs="Open Sans"/>
+          <w:b/>
+          <w:bCs/>
+          <w:sz w:val="28"/>
+          <w:szCs w:val="28"/>
+        </w:rPr>
+        <w:t xml:space="preserve"> </w:t>
+      </w:r>
+      <w:proofErr w:type="spellStart"/>
+      <w:r>
+        <w:rPr>
+          <w:rFonts w:ascii="Open Sans" w:hAnsi="Open Sans" w:cs="Open Sans"/>
+          <w:b/>
+          <w:bCs/>
+          <w:sz w:val="28"/>
+          <w:szCs w:val="28"/>
+        </w:rPr>
+        <w:t>pemakai</w:t>
+      </w:r>
+      <w:proofErr w:type="spellEnd"/>
+      <w:r>
+        <w:rPr>
+          <w:rFonts w:ascii="Open Sans" w:hAnsi="Open Sans" w:cs="Open Sans"/>
+          <w:b/>
+          <w:bCs/>
+          <w:sz w:val="28"/>
+          <w:szCs w:val="28"/>
+        </w:rPr>
+        <w:t xml:space="preserve">, </w:t>
+      </w:r>
+      <w:proofErr w:type="spellStart"/>
+      <w:r>
+        <w:rPr>
+          <w:rFonts w:ascii="Open Sans" w:hAnsi="Open Sans" w:cs="Open Sans"/>
+          <w:b/>
+          <w:bCs/>
+          <w:sz w:val="28"/>
+          <w:szCs w:val="28"/>
+        </w:rPr>
+        <w:t>jadi</w:t>
+      </w:r>
+      <w:proofErr w:type="spellEnd"/>
+      <w:r>
+        <w:rPr>
+          <w:rFonts w:ascii="Open Sans" w:hAnsi="Open Sans" w:cs="Open Sans"/>
+          <w:b/>
+          <w:bCs/>
+          <w:sz w:val="28"/>
+          <w:szCs w:val="28"/>
+        </w:rPr>
+        <w:t xml:space="preserve"> </w:t>
+      </w:r>
+      <w:proofErr w:type="spellStart"/>
+      <w:r>
+        <w:rPr>
+          <w:rFonts w:ascii="Open Sans" w:hAnsi="Open Sans" w:cs="Open Sans"/>
+          <w:b/>
+          <w:bCs/>
+          <w:sz w:val="28"/>
+          <w:szCs w:val="28"/>
+        </w:rPr>
+        <w:t>kurang</w:t>
+      </w:r>
+      <w:proofErr w:type="spellEnd"/>
+      <w:r>
+        <w:rPr>
+          <w:rFonts w:ascii="Open Sans" w:hAnsi="Open Sans" w:cs="Open Sans"/>
+          <w:b/>
+          <w:bCs/>
+          <w:sz w:val="28"/>
+          <w:szCs w:val="28"/>
+        </w:rPr>
+        <w:t xml:space="preserve"> </w:t>
+      </w:r>
+      <w:proofErr w:type="spellStart"/>
+      <w:r>
+        <w:rPr>
+          <w:rFonts w:ascii="Open Sans" w:hAnsi="Open Sans" w:cs="Open Sans"/>
+          <w:b/>
+          <w:bCs/>
+          <w:sz w:val="28"/>
+          <w:szCs w:val="28"/>
+        </w:rPr>
+        <w:t>lebih</w:t>
+      </w:r>
+      <w:proofErr w:type="spellEnd"/>
+      <w:r>
+        <w:rPr>
+          <w:rFonts w:ascii="Open Sans" w:hAnsi="Open Sans" w:cs="Open Sans"/>
+          <w:b/>
+          <w:bCs/>
+          <w:sz w:val="28"/>
+          <w:szCs w:val="28"/>
+        </w:rPr>
+        <w:t xml:space="preserve"> </w:t>
+      </w:r>
+      <w:proofErr w:type="spellStart"/>
+      <w:r>
+        <w:rPr>
+          <w:rFonts w:ascii="Open Sans" w:hAnsi="Open Sans" w:cs="Open Sans"/>
+          <w:b/>
+          <w:bCs/>
+          <w:sz w:val="28"/>
+          <w:szCs w:val="28"/>
+        </w:rPr>
+        <w:t>seperti</w:t>
+      </w:r>
+      <w:proofErr w:type="spellEnd"/>
+      <w:r>
+        <w:rPr>
+          <w:rFonts w:ascii="Open Sans" w:hAnsi="Open Sans" w:cs="Open Sans"/>
+          <w:b/>
+          <w:bCs/>
+          <w:sz w:val="28"/>
+          <w:szCs w:val="28"/>
+        </w:rPr>
+        <w:t xml:space="preserve"> </w:t>
+      </w:r>
+      <w:proofErr w:type="spellStart"/>
+      <w:r>
+        <w:rPr>
+          <w:rFonts w:ascii="Open Sans" w:hAnsi="Open Sans" w:cs="Open Sans"/>
+          <w:b/>
+          <w:bCs/>
+          <w:sz w:val="28"/>
+          <w:szCs w:val="28"/>
+        </w:rPr>
+        <w:t>ini</w:t>
+      </w:r>
+      <w:proofErr w:type="spellEnd"/>
     </w:p>
     <w:p>
       <w:pPr>
@@ -9449,7 +11235,7 @@
 </file>
 
 <file path=word/numbering.xml><?xml version="1.0" encoding="utf-8"?>
-<w:numbering xmlns:wpc="http://schemas.microsoft.com/office/word/2010/wordprocessingCanvas" xmlns:cx="http://schemas.microsoft.com/office/drawing/2014/chartex" xmlns:cx1="http://schemas.microsoft.com/office/drawing/2015/9/8/chartex" xmlns:cx2="http://schemas.microsoft.com/office/drawing/2015/10/21/chartex" xmlns:cx3="http://schemas.microsoft.com/office/drawing/2016/5/9/chartex" xmlns:cx4="http://schemas.microsoft.com/office/drawing/2016/5/10/chartex" xmlns:cx5="http://schemas.microsoft.com/office/drawing/2016/5/11/chartex" xmlns:cx6="http://schemas.microsoft.com/office/drawing/2016/5/12/chartex" xmlns:cx7="http://schemas.microsoft.com/office/drawing/2016/5/13/chartex" xmlns:cx8="http://schemas.microsoft.com/office/drawing/2016/5/14/chartex" xmlns:mc="http://schemas.openxmlformats.org/markup-compatibility/2006" xmlns:aink="http://schemas.microsoft.com/office/drawing/2016/ink" xmlns:am3d="http://schemas.microsoft.com/office/drawing/2017/model3d" xmlns:o="urn:schemas-microsoft-com:office:office" xmlns:oel="http://schemas.microsoft.com/office/2019/extlst" xmlns:r="http://schemas.openxmlformats.org/officeDocument/2006/relationships" xmlns:m="http://schemas.openxmlformats.org/officeDocument/2006/math" xmlns:v="urn:schemas-microsoft-com:vml" xmlns:wp14="http://schemas.microsoft.com/office/word/2010/wordprocessingDrawing" xmlns:wp="http://schemas.openxmlformats.org/drawingml/2006/wordprocessingDrawing" xmlns:w10="urn:schemas-microsoft-com:office:word" xmlns:w="http://schemas.openxmlformats.org/wordprocessingml/2006/main" xmlns:w14="http://schemas.microsoft.com/office/word/2010/wordml" xmlns:w15="http://schemas.microsoft.com/office/word/2012/wordml" xmlns:w16cex="http://schemas.microsoft.com/office/word/2018/wordml/cex" xmlns:w16cid="http://schemas.microsoft.com/office/word/2016/wordml/cid" xmlns:w16="http://schemas.microsoft.com/office/word/2018/wordml" xmlns:w16du="http://schemas.microsoft.com/office/word/2023/wordml/word16du" xmlns:w16sdtdh="http://schemas.microsoft.com/office/word/2020/wordml/sdtdatahash" xmlns:w16sdtfl="http://schemas.microsoft.com/office/word/2024/wordml/sdtformatlock" xmlns:w16se="http://schemas.microsoft.com/office/word/2015/wordml/symex" xmlns:wpg="http://schemas.microsoft.com/office/word/2010/wordprocessingGroup" xmlns:wpi="http://schemas.microsoft.com/office/word/2010/wordprocessingInk" xmlns:wne="http://schemas.microsoft.com/office/word/2006/wordml" xmlns:wps="http://schemas.microsoft.com/office/word/2010/wordprocessingShape" mc:Ignorable="w14 w15 w16se w16cid w16 w16cex w16sdtdh w16sdtfl w16du wp14">
+<w:numbering xmlns:wpc="http://schemas.microsoft.com/office/word/2010/wordprocessingCanvas" xmlns:cx="http://schemas.microsoft.com/office/drawing/2014/chartex" xmlns:cx1="http://schemas.microsoft.com/office/drawing/2015/9/8/chartex" xmlns:cx2="http://schemas.microsoft.com/office/drawing/2015/10/21/chartex" xmlns:cx3="http://schemas.microsoft.com/office/drawing/2016/5/9/chartex" xmlns:cx4="http://schemas.microsoft.com/office/drawing/2016/5/10/chartex" xmlns:cx5="http://schemas.microsoft.com/office/drawing/2016/5/11/chartex" xmlns:cx6="http://schemas.microsoft.com/office/drawing/2016/5/12/chartex" xmlns:cx7="http://schemas.microsoft.com/office/drawing/2016/5/13/chartex" xmlns:cx8="http://schemas.microsoft.com/office/drawing/2016/5/14/chartex" xmlns:mc="http://schemas.openxmlformats.org/markup-compatibility/2006" xmlns:aink="http://schemas.microsoft.com/office/drawing/2016/ink" xmlns:am3d="http://schemas.microsoft.com/office/drawing/2017/model3d" xmlns:o="urn:schemas-microsoft-com:office:office" xmlns:oel="http://schemas.microsoft.com/office/2019/extlst" xmlns:r="http://schemas.openxmlformats.org/officeDocument/2006/relationships" xmlns:m="http://schemas.openxmlformats.org/officeDocument/2006/math" xmlns:v="urn:schemas-microsoft-com:vml" xmlns:wp14="http://schemas.microsoft.com/office/word/2010/wordprocessingDrawing" xmlns:wp="http://schemas.openxmlformats.org/drawingml/2006/wordprocessingDrawing" xmlns:w10="urn:schemas-microsoft-com:office:word" xmlns:w="http://schemas.openxmlformats.org/wordprocessingml/2006/main" xmlns:w14="http://schemas.microsoft.com/office/word/2010/wordml" xmlns:w15="http://schemas.microsoft.com/office/word/2012/wordml" xmlns:w16cex="http://schemas.microsoft.com/office/word/2018/wordml/cex" xmlns:w16cid="http://schemas.microsoft.com/office/word/2016/wordml/cid" xmlns:w16="http://schemas.microsoft.com/office/word/2018/wordml" xmlns:w16du="http://schemas.microsoft.com/office/word/2023/wordml/word16du" xmlns:w16sdtdh="http://schemas.microsoft.com/office/word/2020/wordml/sdtdatahash" xmlns:w16se="http://schemas.microsoft.com/office/word/2015/wordml/symex" xmlns:wpg="http://schemas.microsoft.com/office/word/2010/wordprocessingGroup" xmlns:wpi="http://schemas.microsoft.com/office/word/2010/wordprocessingInk" xmlns:wne="http://schemas.microsoft.com/office/word/2006/wordml" xmlns:wps="http://schemas.microsoft.com/office/word/2010/wordprocessingShape" mc:Ignorable="w14 w15 w16se w16cid w16 w16cex w16sdtdh w16du wp14">
   <w:abstractNum w:abstractNumId="0" w15:restartNumberingAfterBreak="0">
     <w:nsid w:val="08F310B0"/>
     <w:multiLevelType w:val="hybridMultilevel"/>
@@ -10170,7 +11956,7 @@
 </file>
 
 <file path=word/styles.xml><?xml version="1.0" encoding="utf-8"?>
-<w:styles xmlns:mc="http://schemas.openxmlformats.org/markup-compatibility/2006" xmlns:r="http://schemas.openxmlformats.org/officeDocument/2006/relationships" xmlns:w="http://schemas.openxmlformats.org/wordprocessingml/2006/main" xmlns:w14="http://schemas.microsoft.com/office/word/2010/wordml" xmlns:w15="http://schemas.microsoft.com/office/word/2012/wordml" xmlns:w16cex="http://schemas.microsoft.com/office/word/2018/wordml/cex" xmlns:w16cid="http://schemas.microsoft.com/office/word/2016/wordml/cid" xmlns:w16="http://schemas.microsoft.com/office/word/2018/wordml" xmlns:w16du="http://schemas.microsoft.com/office/word/2023/wordml/word16du" xmlns:w16sdtdh="http://schemas.microsoft.com/office/word/2020/wordml/sdtdatahash" xmlns:w16sdtfl="http://schemas.microsoft.com/office/word/2024/wordml/sdtformatlock" xmlns:w16se="http://schemas.microsoft.com/office/word/2015/wordml/symex" mc:Ignorable="w14 w15 w16se w16cid w16 w16cex w16sdtdh w16sdtfl w16du">
+<w:styles xmlns:mc="http://schemas.openxmlformats.org/markup-compatibility/2006" xmlns:r="http://schemas.openxmlformats.org/officeDocument/2006/relationships" xmlns:w="http://schemas.openxmlformats.org/wordprocessingml/2006/main" xmlns:w14="http://schemas.microsoft.com/office/word/2010/wordml" xmlns:w15="http://schemas.microsoft.com/office/word/2012/wordml" xmlns:w16cex="http://schemas.microsoft.com/office/word/2018/wordml/cex" xmlns:w16cid="http://schemas.microsoft.com/office/word/2016/wordml/cid" xmlns:w16="http://schemas.microsoft.com/office/word/2018/wordml" xmlns:w16du="http://schemas.microsoft.com/office/word/2023/wordml/word16du" xmlns:w16sdtdh="http://schemas.microsoft.com/office/word/2020/wordml/sdtdatahash" xmlns:w16se="http://schemas.microsoft.com/office/word/2015/wordml/symex" mc:Ignorable="w14 w15 w16se w16cid w16 w16cex w16sdtdh w16du">
   <w:docDefaults>
     <w:rPrDefault>
       <w:rPr>

</xml_diff>